<commit_message>
Zavrsena univarijantna analiza ciljne promenljive Satisfaction
</commit_message>
<xml_diff>
--- a/reports/airline_satisfaction.docx
+++ b/reports/airline_satisfaction.docx
@@ -210,7 +210,7 @@
     </w:p>
     <w:bookmarkEnd w:id="22"/>
     <w:bookmarkEnd w:id="23"/>
-    <w:bookmarkStart w:id="31" w:name="pregled-podataka"/>
+    <w:bookmarkStart w:id="34" w:name="pregled-podataka"/>
     <w:p>
       <w:pPr>
         <w:pStyle w:val="Heading1"/>
@@ -4619,8 +4619,1037 @@
         <w:t xml:space="preserve">, gde ćemo detaljnije ispitati distribucije i odnose među promenljivama.</w:t>
       </w:r>
     </w:p>
+    <w:p>
+      <w:pPr>
+        <w:pStyle w:val="BodyText"/>
+      </w:pPr>
+      <w:r>
+        <w:t xml:space="preserve">#Eksplorativna analiza podataka(EDA)</w:t>
+      </w:r>
+    </w:p>
+    <w:p>
+      <w:pPr>
+        <w:pStyle w:val="BodyText"/>
+      </w:pPr>
+      <w:r>
+        <w:t xml:space="preserve">Eksplorativna analiza podataka (Exploratory Data Analysis - EDA) predstavlja ključni korak u analizi u okviru koga istražujemo i vizualizujemo podatke, kako bismo saznali njihovu strukturu, uočili šablone, anomalije i proverili međusobne veze između promenljivih pre nego što pređemo na kreiranje modela mašinskog učenja.</w:t>
+      </w:r>
+    </w:p>
     <w:bookmarkEnd w:id="30"/>
-    <w:bookmarkEnd w:id="31"/>
+    <w:bookmarkStart w:id="33" w:name="univarijantna-analiza"/>
+    <w:p>
+      <w:pPr>
+        <w:pStyle w:val="Heading2"/>
+      </w:pPr>
+      <w:r>
+        <w:t xml:space="preserve">Univarijantna analiza</w:t>
+      </w:r>
+    </w:p>
+    <w:p>
+      <w:pPr>
+        <w:pStyle w:val="FirstParagraph"/>
+      </w:pPr>
+      <w:r>
+        <w:t xml:space="preserve">U okviru univarijantne analize posmatraćemo svaku promenljivu pojedinačno. Prva i najvažnija promenljiva koju analiziramo jeste naša ciljna promenljiva —</w:t>
+      </w:r>
+      <w:r>
+        <w:t xml:space="preserve"> </w:t>
+      </w:r>
+      <w:r>
+        <w:rPr>
+          <w:bCs/>
+          <w:b/>
+        </w:rPr>
+        <w:t xml:space="preserve">Satisfaction</w:t>
+      </w:r>
+      <w:r>
+        <w:t xml:space="preserve"> </w:t>
+      </w:r>
+      <w:r>
+        <w:t xml:space="preserve">(zadovoljstvo putnika), jer nam njena raspodela govori o ravnoteži klasa koje ćemo kasnije predviđati.</w:t>
+      </w:r>
+    </w:p>
+    <w:bookmarkStart w:id="32" w:name="analiza-ciljne-promenljive-satisfaction"/>
+    <w:p>
+      <w:pPr>
+        <w:pStyle w:val="Heading3"/>
+      </w:pPr>
+      <w:r>
+        <w:t xml:space="preserve">Analiza ciljne promenljive (Satisfaction)</w:t>
+      </w:r>
+    </w:p>
+    <w:p>
+      <w:pPr>
+        <w:pStyle w:val="FirstParagraph"/>
+      </w:pPr>
+      <w:r>
+        <w:t xml:space="preserve">Prvo ćemo preko frekvencija i procenata numerički proveriti odnos između zadovoljnih i nezadovoljnih putnika u našem skupu podataka.</w:t>
+      </w:r>
+    </w:p>
+    <w:p>
+      <w:pPr>
+        <w:pStyle w:val="SourceCode"/>
+      </w:pPr>
+      <w:r>
+        <w:rPr>
+          <w:rStyle w:val="NormalTok"/>
+        </w:rPr>
+        <w:t xml:space="preserve">satisfaction_summary </w:t>
+      </w:r>
+      <w:r>
+        <w:rPr>
+          <w:rStyle w:val="OtherTok"/>
+        </w:rPr>
+        <w:t xml:space="preserve">&lt;-</w:t>
+      </w:r>
+      <w:r>
+        <w:rPr>
+          <w:rStyle w:val="NormalTok"/>
+        </w:rPr>
+        <w:t xml:space="preserve"> data </w:t>
+      </w:r>
+      <w:r>
+        <w:rPr>
+          <w:rStyle w:val="SpecialCharTok"/>
+        </w:rPr>
+        <w:t xml:space="preserve">%&gt;%</w:t>
+      </w:r>
+      <w:r>
+        <w:br/>
+      </w:r>
+      <w:r>
+        <w:rPr>
+          <w:rStyle w:val="NormalTok"/>
+        </w:rPr>
+        <w:t xml:space="preserve">  </w:t>
+      </w:r>
+      <w:r>
+        <w:rPr>
+          <w:rStyle w:val="FunctionTok"/>
+        </w:rPr>
+        <w:t xml:space="preserve">count</w:t>
+      </w:r>
+      <w:r>
+        <w:rPr>
+          <w:rStyle w:val="NormalTok"/>
+        </w:rPr>
+        <w:t xml:space="preserve">(Satisfaction) </w:t>
+      </w:r>
+      <w:r>
+        <w:rPr>
+          <w:rStyle w:val="SpecialCharTok"/>
+        </w:rPr>
+        <w:t xml:space="preserve">%&gt;%</w:t>
+      </w:r>
+      <w:r>
+        <w:br/>
+      </w:r>
+      <w:r>
+        <w:rPr>
+          <w:rStyle w:val="NormalTok"/>
+        </w:rPr>
+        <w:t xml:space="preserve">  </w:t>
+      </w:r>
+      <w:r>
+        <w:rPr>
+          <w:rStyle w:val="FunctionTok"/>
+        </w:rPr>
+        <w:t xml:space="preserve">mutate</w:t>
+      </w:r>
+      <w:r>
+        <w:rPr>
+          <w:rStyle w:val="NormalTok"/>
+        </w:rPr>
+        <w:t xml:space="preserve">(</w:t>
+      </w:r>
+      <w:r>
+        <w:rPr>
+          <w:rStyle w:val="AttributeTok"/>
+        </w:rPr>
+        <w:t xml:space="preserve">Procenat =</w:t>
+      </w:r>
+      <w:r>
+        <w:rPr>
+          <w:rStyle w:val="NormalTok"/>
+        </w:rPr>
+        <w:t xml:space="preserve"> </w:t>
+      </w:r>
+      <w:r>
+        <w:rPr>
+          <w:rStyle w:val="FunctionTok"/>
+        </w:rPr>
+        <w:t xml:space="preserve">round</w:t>
+      </w:r>
+      <w:r>
+        <w:rPr>
+          <w:rStyle w:val="NormalTok"/>
+        </w:rPr>
+        <w:t xml:space="preserve">(n </w:t>
+      </w:r>
+      <w:r>
+        <w:rPr>
+          <w:rStyle w:val="SpecialCharTok"/>
+        </w:rPr>
+        <w:t xml:space="preserve">/</w:t>
+      </w:r>
+      <w:r>
+        <w:rPr>
+          <w:rStyle w:val="NormalTok"/>
+        </w:rPr>
+        <w:t xml:space="preserve"> </w:t>
+      </w:r>
+      <w:r>
+        <w:rPr>
+          <w:rStyle w:val="FunctionTok"/>
+        </w:rPr>
+        <w:t xml:space="preserve">sum</w:t>
+      </w:r>
+      <w:r>
+        <w:rPr>
+          <w:rStyle w:val="NormalTok"/>
+        </w:rPr>
+        <w:t xml:space="preserve">(n) </w:t>
+      </w:r>
+      <w:r>
+        <w:rPr>
+          <w:rStyle w:val="SpecialCharTok"/>
+        </w:rPr>
+        <w:t xml:space="preserve">*</w:t>
+      </w:r>
+      <w:r>
+        <w:rPr>
+          <w:rStyle w:val="NormalTok"/>
+        </w:rPr>
+        <w:t xml:space="preserve"> </w:t>
+      </w:r>
+      <w:r>
+        <w:rPr>
+          <w:rStyle w:val="DecValTok"/>
+        </w:rPr>
+        <w:t xml:space="preserve">100</w:t>
+      </w:r>
+      <w:r>
+        <w:rPr>
+          <w:rStyle w:val="NormalTok"/>
+        </w:rPr>
+        <w:t xml:space="preserve">, </w:t>
+      </w:r>
+      <w:r>
+        <w:rPr>
+          <w:rStyle w:val="DecValTok"/>
+        </w:rPr>
+        <w:t xml:space="preserve">2</w:t>
+      </w:r>
+      <w:r>
+        <w:rPr>
+          <w:rStyle w:val="NormalTok"/>
+        </w:rPr>
+        <w:t xml:space="preserve">))</w:t>
+      </w:r>
+      <w:r>
+        <w:br/>
+      </w:r>
+      <w:r>
+        <w:br/>
+      </w:r>
+      <w:r>
+        <w:rPr>
+          <w:rStyle w:val="NormalTok"/>
+        </w:rPr>
+        <w:t xml:space="preserve">satisfaction_summary</w:t>
+      </w:r>
+    </w:p>
+    <w:p>
+      <w:pPr>
+        <w:pStyle w:val="SourceCode"/>
+      </w:pPr>
+      <w:r>
+        <w:rPr>
+          <w:rStyle w:val="VerbatimChar"/>
+        </w:rPr>
+        <w:t xml:space="preserve">##    Satisfaction     n Procenat</w:t>
+      </w:r>
+      <w:r>
+        <w:br/>
+      </w:r>
+      <w:r>
+        <w:rPr>
+          <w:rStyle w:val="VerbatimChar"/>
+        </w:rPr>
+        <w:t xml:space="preserve">## 1     Satisfied 56428    43.45</w:t>
+      </w:r>
+      <w:r>
+        <w:br/>
+      </w:r>
+      <w:r>
+        <w:rPr>
+          <w:rStyle w:val="VerbatimChar"/>
+        </w:rPr>
+        <w:t xml:space="preserve">## 2 Not Satisfied 73452    56.55</w:t>
+      </w:r>
+    </w:p>
+    <w:p>
+      <w:pPr>
+        <w:pStyle w:val="FirstParagraph"/>
+      </w:pPr>
+      <w:r>
+        <w:t xml:space="preserve">Da bismo ovaj odnos jasnije sagledali i vizuelno, prikazaćemo ga stubicastim dijagramom sa procentualnim oznakama iznad svakog stubića.</w:t>
+      </w:r>
+    </w:p>
+    <w:p>
+      <w:pPr>
+        <w:pStyle w:val="SourceCode"/>
+      </w:pPr>
+      <w:r>
+        <w:rPr>
+          <w:rStyle w:val="FunctionTok"/>
+        </w:rPr>
+        <w:t xml:space="preserve">ggplot</w:t>
+      </w:r>
+      <w:r>
+        <w:rPr>
+          <w:rStyle w:val="NormalTok"/>
+        </w:rPr>
+        <w:t xml:space="preserve">(data, </w:t>
+      </w:r>
+      <w:r>
+        <w:rPr>
+          <w:rStyle w:val="FunctionTok"/>
+        </w:rPr>
+        <w:t xml:space="preserve">aes</w:t>
+      </w:r>
+      <w:r>
+        <w:rPr>
+          <w:rStyle w:val="NormalTok"/>
+        </w:rPr>
+        <w:t xml:space="preserve">(</w:t>
+      </w:r>
+      <w:r>
+        <w:rPr>
+          <w:rStyle w:val="AttributeTok"/>
+        </w:rPr>
+        <w:t xml:space="preserve">x =</w:t>
+      </w:r>
+      <w:r>
+        <w:rPr>
+          <w:rStyle w:val="NormalTok"/>
+        </w:rPr>
+        <w:t xml:space="preserve"> Satisfaction, </w:t>
+      </w:r>
+      <w:r>
+        <w:rPr>
+          <w:rStyle w:val="AttributeTok"/>
+        </w:rPr>
+        <w:t xml:space="preserve">fill =</w:t>
+      </w:r>
+      <w:r>
+        <w:rPr>
+          <w:rStyle w:val="NormalTok"/>
+        </w:rPr>
+        <w:t xml:space="preserve"> Satisfaction)) </w:t>
+      </w:r>
+      <w:r>
+        <w:rPr>
+          <w:rStyle w:val="SpecialCharTok"/>
+        </w:rPr>
+        <w:t xml:space="preserve">+</w:t>
+      </w:r>
+      <w:r>
+        <w:br/>
+      </w:r>
+      <w:r>
+        <w:rPr>
+          <w:rStyle w:val="NormalTok"/>
+        </w:rPr>
+        <w:t xml:space="preserve">  </w:t>
+      </w:r>
+      <w:r>
+        <w:rPr>
+          <w:rStyle w:val="FunctionTok"/>
+        </w:rPr>
+        <w:t xml:space="preserve">geom_bar</w:t>
+      </w:r>
+      <w:r>
+        <w:rPr>
+          <w:rStyle w:val="NormalTok"/>
+        </w:rPr>
+        <w:t xml:space="preserve">(</w:t>
+      </w:r>
+      <w:r>
+        <w:rPr>
+          <w:rStyle w:val="AttributeTok"/>
+        </w:rPr>
+        <w:t xml:space="preserve">width =</w:t>
+      </w:r>
+      <w:r>
+        <w:rPr>
+          <w:rStyle w:val="NormalTok"/>
+        </w:rPr>
+        <w:t xml:space="preserve"> </w:t>
+      </w:r>
+      <w:r>
+        <w:rPr>
+          <w:rStyle w:val="FloatTok"/>
+        </w:rPr>
+        <w:t xml:space="preserve">0.6</w:t>
+      </w:r>
+      <w:r>
+        <w:rPr>
+          <w:rStyle w:val="NormalTok"/>
+        </w:rPr>
+        <w:t xml:space="preserve">) </w:t>
+      </w:r>
+      <w:r>
+        <w:rPr>
+          <w:rStyle w:val="SpecialCharTok"/>
+        </w:rPr>
+        <w:t xml:space="preserve">+</w:t>
+      </w:r>
+      <w:r>
+        <w:br/>
+      </w:r>
+      <w:r>
+        <w:rPr>
+          <w:rStyle w:val="NormalTok"/>
+        </w:rPr>
+        <w:t xml:space="preserve">  </w:t>
+      </w:r>
+      <w:r>
+        <w:rPr>
+          <w:rStyle w:val="FunctionTok"/>
+        </w:rPr>
+        <w:t xml:space="preserve">geom_text</w:t>
+      </w:r>
+      <w:r>
+        <w:rPr>
+          <w:rStyle w:val="NormalTok"/>
+        </w:rPr>
+        <w:t xml:space="preserve">(</w:t>
+      </w:r>
+      <w:r>
+        <w:rPr>
+          <w:rStyle w:val="AttributeTok"/>
+        </w:rPr>
+        <w:t xml:space="preserve">stat =</w:t>
+      </w:r>
+      <w:r>
+        <w:rPr>
+          <w:rStyle w:val="NormalTok"/>
+        </w:rPr>
+        <w:t xml:space="preserve"> </w:t>
+      </w:r>
+      <w:r>
+        <w:rPr>
+          <w:rStyle w:val="StringTok"/>
+        </w:rPr>
+        <w:t xml:space="preserve">'count'</w:t>
+      </w:r>
+      <w:r>
+        <w:rPr>
+          <w:rStyle w:val="NormalTok"/>
+        </w:rPr>
+        <w:t xml:space="preserve">, </w:t>
+      </w:r>
+      <w:r>
+        <w:rPr>
+          <w:rStyle w:val="FunctionTok"/>
+        </w:rPr>
+        <w:t xml:space="preserve">aes</w:t>
+      </w:r>
+      <w:r>
+        <w:rPr>
+          <w:rStyle w:val="NormalTok"/>
+        </w:rPr>
+        <w:t xml:space="preserve">(</w:t>
+      </w:r>
+      <w:r>
+        <w:rPr>
+          <w:rStyle w:val="AttributeTok"/>
+        </w:rPr>
+        <w:t xml:space="preserve">label =</w:t>
+      </w:r>
+      <w:r>
+        <w:rPr>
+          <w:rStyle w:val="NormalTok"/>
+        </w:rPr>
+        <w:t xml:space="preserve"> </w:t>
+      </w:r>
+      <w:r>
+        <w:rPr>
+          <w:rStyle w:val="FunctionTok"/>
+        </w:rPr>
+        <w:t xml:space="preserve">paste0</w:t>
+      </w:r>
+      <w:r>
+        <w:rPr>
+          <w:rStyle w:val="NormalTok"/>
+        </w:rPr>
+        <w:t xml:space="preserve">(</w:t>
+      </w:r>
+      <w:r>
+        <w:rPr>
+          <w:rStyle w:val="FunctionTok"/>
+        </w:rPr>
+        <w:t xml:space="preserve">round</w:t>
+      </w:r>
+      <w:r>
+        <w:rPr>
+          <w:rStyle w:val="NormalTok"/>
+        </w:rPr>
+        <w:t xml:space="preserve">(..count..</w:t>
+      </w:r>
+      <w:r>
+        <w:rPr>
+          <w:rStyle w:val="SpecialCharTok"/>
+        </w:rPr>
+        <w:t xml:space="preserve">/</w:t>
+      </w:r>
+      <w:r>
+        <w:rPr>
+          <w:rStyle w:val="FunctionTok"/>
+        </w:rPr>
+        <w:t xml:space="preserve">sum</w:t>
+      </w:r>
+      <w:r>
+        <w:rPr>
+          <w:rStyle w:val="NormalTok"/>
+        </w:rPr>
+        <w:t xml:space="preserve">(..count..)</w:t>
+      </w:r>
+      <w:r>
+        <w:rPr>
+          <w:rStyle w:val="SpecialCharTok"/>
+        </w:rPr>
+        <w:t xml:space="preserve">*</w:t>
+      </w:r>
+      <w:r>
+        <w:rPr>
+          <w:rStyle w:val="DecValTok"/>
+        </w:rPr>
+        <w:t xml:space="preserve">100</w:t>
+      </w:r>
+      <w:r>
+        <w:rPr>
+          <w:rStyle w:val="NormalTok"/>
+        </w:rPr>
+        <w:t xml:space="preserve">, </w:t>
+      </w:r>
+      <w:r>
+        <w:rPr>
+          <w:rStyle w:val="DecValTok"/>
+        </w:rPr>
+        <w:t xml:space="preserve">1</w:t>
+      </w:r>
+      <w:r>
+        <w:rPr>
+          <w:rStyle w:val="NormalTok"/>
+        </w:rPr>
+        <w:t xml:space="preserve">), </w:t>
+      </w:r>
+      <w:r>
+        <w:rPr>
+          <w:rStyle w:val="StringTok"/>
+        </w:rPr>
+        <w:t xml:space="preserve">"%"</w:t>
+      </w:r>
+      <w:r>
+        <w:rPr>
+          <w:rStyle w:val="NormalTok"/>
+        </w:rPr>
+        <w:t xml:space="preserve">)), </w:t>
+      </w:r>
+      <w:r>
+        <w:rPr>
+          <w:rStyle w:val="AttributeTok"/>
+        </w:rPr>
+        <w:t xml:space="preserve">vjust =</w:t>
+      </w:r>
+      <w:r>
+        <w:rPr>
+          <w:rStyle w:val="NormalTok"/>
+        </w:rPr>
+        <w:t xml:space="preserve"> </w:t>
+      </w:r>
+      <w:r>
+        <w:rPr>
+          <w:rStyle w:val="SpecialCharTok"/>
+        </w:rPr>
+        <w:t xml:space="preserve">-</w:t>
+      </w:r>
+      <w:r>
+        <w:rPr>
+          <w:rStyle w:val="FloatTok"/>
+        </w:rPr>
+        <w:t xml:space="preserve">0.5</w:t>
+      </w:r>
+      <w:r>
+        <w:rPr>
+          <w:rStyle w:val="NormalTok"/>
+        </w:rPr>
+        <w:t xml:space="preserve">, </w:t>
+      </w:r>
+      <w:r>
+        <w:rPr>
+          <w:rStyle w:val="AttributeTok"/>
+        </w:rPr>
+        <w:t xml:space="preserve">size =</w:t>
+      </w:r>
+      <w:r>
+        <w:rPr>
+          <w:rStyle w:val="NormalTok"/>
+        </w:rPr>
+        <w:t xml:space="preserve"> </w:t>
+      </w:r>
+      <w:r>
+        <w:rPr>
+          <w:rStyle w:val="DecValTok"/>
+        </w:rPr>
+        <w:t xml:space="preserve">4</w:t>
+      </w:r>
+      <w:r>
+        <w:rPr>
+          <w:rStyle w:val="NormalTok"/>
+        </w:rPr>
+        <w:t xml:space="preserve">) </w:t>
+      </w:r>
+      <w:r>
+        <w:rPr>
+          <w:rStyle w:val="SpecialCharTok"/>
+        </w:rPr>
+        <w:t xml:space="preserve">+</w:t>
+      </w:r>
+      <w:r>
+        <w:br/>
+      </w:r>
+      <w:r>
+        <w:rPr>
+          <w:rStyle w:val="NormalTok"/>
+        </w:rPr>
+        <w:t xml:space="preserve">  </w:t>
+      </w:r>
+      <w:r>
+        <w:rPr>
+          <w:rStyle w:val="FunctionTok"/>
+        </w:rPr>
+        <w:t xml:space="preserve">scale_fill_manual</w:t>
+      </w:r>
+      <w:r>
+        <w:rPr>
+          <w:rStyle w:val="NormalTok"/>
+        </w:rPr>
+        <w:t xml:space="preserve">(</w:t>
+      </w:r>
+      <w:r>
+        <w:rPr>
+          <w:rStyle w:val="AttributeTok"/>
+        </w:rPr>
+        <w:t xml:space="preserve">values =</w:t>
+      </w:r>
+      <w:r>
+        <w:rPr>
+          <w:rStyle w:val="NormalTok"/>
+        </w:rPr>
+        <w:t xml:space="preserve"> </w:t>
+      </w:r>
+      <w:r>
+        <w:rPr>
+          <w:rStyle w:val="FunctionTok"/>
+        </w:rPr>
+        <w:t xml:space="preserve">c</w:t>
+      </w:r>
+      <w:r>
+        <w:rPr>
+          <w:rStyle w:val="NormalTok"/>
+        </w:rPr>
+        <w:t xml:space="preserve">(</w:t>
+      </w:r>
+      <w:r>
+        <w:rPr>
+          <w:rStyle w:val="StringTok"/>
+        </w:rPr>
+        <w:t xml:space="preserve">"Satisfied"</w:t>
+      </w:r>
+      <w:r>
+        <w:rPr>
+          <w:rStyle w:val="NormalTok"/>
+        </w:rPr>
+        <w:t xml:space="preserve"> </w:t>
+      </w:r>
+      <w:r>
+        <w:rPr>
+          <w:rStyle w:val="OtherTok"/>
+        </w:rPr>
+        <w:t xml:space="preserve">=</w:t>
+      </w:r>
+      <w:r>
+        <w:rPr>
+          <w:rStyle w:val="NormalTok"/>
+        </w:rPr>
+        <w:t xml:space="preserve"> </w:t>
+      </w:r>
+      <w:r>
+        <w:rPr>
+          <w:rStyle w:val="StringTok"/>
+        </w:rPr>
+        <w:t xml:space="preserve">"#2ecc71"</w:t>
+      </w:r>
+      <w:r>
+        <w:rPr>
+          <w:rStyle w:val="NormalTok"/>
+        </w:rPr>
+        <w:t xml:space="preserve">, </w:t>
+      </w:r>
+      <w:r>
+        <w:rPr>
+          <w:rStyle w:val="StringTok"/>
+        </w:rPr>
+        <w:t xml:space="preserve">"Not Satisfied"</w:t>
+      </w:r>
+      <w:r>
+        <w:rPr>
+          <w:rStyle w:val="NormalTok"/>
+        </w:rPr>
+        <w:t xml:space="preserve"> </w:t>
+      </w:r>
+      <w:r>
+        <w:rPr>
+          <w:rStyle w:val="OtherTok"/>
+        </w:rPr>
+        <w:t xml:space="preserve">=</w:t>
+      </w:r>
+      <w:r>
+        <w:rPr>
+          <w:rStyle w:val="NormalTok"/>
+        </w:rPr>
+        <w:t xml:space="preserve"> </w:t>
+      </w:r>
+      <w:r>
+        <w:rPr>
+          <w:rStyle w:val="StringTok"/>
+        </w:rPr>
+        <w:t xml:space="preserve">"#e74c3c"</w:t>
+      </w:r>
+      <w:r>
+        <w:rPr>
+          <w:rStyle w:val="NormalTok"/>
+        </w:rPr>
+        <w:t xml:space="preserve">)) </w:t>
+      </w:r>
+      <w:r>
+        <w:rPr>
+          <w:rStyle w:val="SpecialCharTok"/>
+        </w:rPr>
+        <w:t xml:space="preserve">+</w:t>
+      </w:r>
+      <w:r>
+        <w:br/>
+      </w:r>
+      <w:r>
+        <w:rPr>
+          <w:rStyle w:val="NormalTok"/>
+        </w:rPr>
+        <w:t xml:space="preserve">  </w:t>
+      </w:r>
+      <w:r>
+        <w:rPr>
+          <w:rStyle w:val="FunctionTok"/>
+        </w:rPr>
+        <w:t xml:space="preserve">theme_minimal</w:t>
+      </w:r>
+      <w:r>
+        <w:rPr>
+          <w:rStyle w:val="NormalTok"/>
+        </w:rPr>
+        <w:t xml:space="preserve">(</w:t>
+      </w:r>
+      <w:r>
+        <w:rPr>
+          <w:rStyle w:val="AttributeTok"/>
+        </w:rPr>
+        <w:t xml:space="preserve">base_size =</w:t>
+      </w:r>
+      <w:r>
+        <w:rPr>
+          <w:rStyle w:val="NormalTok"/>
+        </w:rPr>
+        <w:t xml:space="preserve"> </w:t>
+      </w:r>
+      <w:r>
+        <w:rPr>
+          <w:rStyle w:val="DecValTok"/>
+        </w:rPr>
+        <w:t xml:space="preserve">12</w:t>
+      </w:r>
+      <w:r>
+        <w:rPr>
+          <w:rStyle w:val="NormalTok"/>
+        </w:rPr>
+        <w:t xml:space="preserve">) </w:t>
+      </w:r>
+      <w:r>
+        <w:rPr>
+          <w:rStyle w:val="SpecialCharTok"/>
+        </w:rPr>
+        <w:t xml:space="preserve">+</w:t>
+      </w:r>
+      <w:r>
+        <w:br/>
+      </w:r>
+      <w:r>
+        <w:rPr>
+          <w:rStyle w:val="NormalTok"/>
+        </w:rPr>
+        <w:t xml:space="preserve">  </w:t>
+      </w:r>
+      <w:r>
+        <w:rPr>
+          <w:rStyle w:val="FunctionTok"/>
+        </w:rPr>
+        <w:t xml:space="preserve">labs</w:t>
+      </w:r>
+      <w:r>
+        <w:rPr>
+          <w:rStyle w:val="NormalTok"/>
+        </w:rPr>
+        <w:t xml:space="preserve">(</w:t>
+      </w:r>
+      <w:r>
+        <w:br/>
+      </w:r>
+      <w:r>
+        <w:rPr>
+          <w:rStyle w:val="NormalTok"/>
+        </w:rPr>
+        <w:t xml:space="preserve">    </w:t>
+      </w:r>
+      <w:r>
+        <w:rPr>
+          <w:rStyle w:val="AttributeTok"/>
+        </w:rPr>
+        <w:t xml:space="preserve">title =</w:t>
+      </w:r>
+      <w:r>
+        <w:rPr>
+          <w:rStyle w:val="NormalTok"/>
+        </w:rPr>
+        <w:t xml:space="preserve"> </w:t>
+      </w:r>
+      <w:r>
+        <w:rPr>
+          <w:rStyle w:val="StringTok"/>
+        </w:rPr>
+        <w:t xml:space="preserve">"Distribucija ciljne promenljive (Satisfaction)"</w:t>
+      </w:r>
+      <w:r>
+        <w:rPr>
+          <w:rStyle w:val="NormalTok"/>
+        </w:rPr>
+        <w:t xml:space="preserve">,</w:t>
+      </w:r>
+      <w:r>
+        <w:br/>
+      </w:r>
+      <w:r>
+        <w:rPr>
+          <w:rStyle w:val="NormalTok"/>
+        </w:rPr>
+        <w:t xml:space="preserve">    </w:t>
+      </w:r>
+      <w:r>
+        <w:rPr>
+          <w:rStyle w:val="AttributeTok"/>
+        </w:rPr>
+        <w:t xml:space="preserve">x =</w:t>
+      </w:r>
+      <w:r>
+        <w:rPr>
+          <w:rStyle w:val="NormalTok"/>
+        </w:rPr>
+        <w:t xml:space="preserve"> </w:t>
+      </w:r>
+      <w:r>
+        <w:rPr>
+          <w:rStyle w:val="StringTok"/>
+        </w:rPr>
+        <w:t xml:space="preserve">"Status zadovoljstva"</w:t>
+      </w:r>
+      <w:r>
+        <w:rPr>
+          <w:rStyle w:val="NormalTok"/>
+        </w:rPr>
+        <w:t xml:space="preserve">,</w:t>
+      </w:r>
+      <w:r>
+        <w:br/>
+      </w:r>
+      <w:r>
+        <w:rPr>
+          <w:rStyle w:val="NormalTok"/>
+        </w:rPr>
+        <w:t xml:space="preserve">    </w:t>
+      </w:r>
+      <w:r>
+        <w:rPr>
+          <w:rStyle w:val="AttributeTok"/>
+        </w:rPr>
+        <w:t xml:space="preserve">y =</w:t>
+      </w:r>
+      <w:r>
+        <w:rPr>
+          <w:rStyle w:val="NormalTok"/>
+        </w:rPr>
+        <w:t xml:space="preserve"> </w:t>
+      </w:r>
+      <w:r>
+        <w:rPr>
+          <w:rStyle w:val="StringTok"/>
+        </w:rPr>
+        <w:t xml:space="preserve">"Broj putnika"</w:t>
+      </w:r>
+      <w:r>
+        <w:rPr>
+          <w:rStyle w:val="NormalTok"/>
+        </w:rPr>
+        <w:t xml:space="preserve">,</w:t>
+      </w:r>
+      <w:r>
+        <w:br/>
+      </w:r>
+      <w:r>
+        <w:rPr>
+          <w:rStyle w:val="NormalTok"/>
+        </w:rPr>
+        <w:t xml:space="preserve">    </w:t>
+      </w:r>
+      <w:r>
+        <w:rPr>
+          <w:rStyle w:val="AttributeTok"/>
+        </w:rPr>
+        <w:t xml:space="preserve">fill =</w:t>
+      </w:r>
+      <w:r>
+        <w:rPr>
+          <w:rStyle w:val="NormalTok"/>
+        </w:rPr>
+        <w:t xml:space="preserve"> </w:t>
+      </w:r>
+      <w:r>
+        <w:rPr>
+          <w:rStyle w:val="StringTok"/>
+        </w:rPr>
+        <w:t xml:space="preserve">"Status"</w:t>
+      </w:r>
+      <w:r>
+        <w:br/>
+      </w:r>
+      <w:r>
+        <w:rPr>
+          <w:rStyle w:val="NormalTok"/>
+        </w:rPr>
+        <w:t xml:space="preserve">  ) </w:t>
+      </w:r>
+      <w:r>
+        <w:rPr>
+          <w:rStyle w:val="SpecialCharTok"/>
+        </w:rPr>
+        <w:t xml:space="preserve">+</w:t>
+      </w:r>
+      <w:r>
+        <w:br/>
+      </w:r>
+      <w:r>
+        <w:rPr>
+          <w:rStyle w:val="NormalTok"/>
+        </w:rPr>
+        <w:t xml:space="preserve">  </w:t>
+      </w:r>
+      <w:r>
+        <w:rPr>
+          <w:rStyle w:val="FunctionTok"/>
+        </w:rPr>
+        <w:t xml:space="preserve">theme</w:t>
+      </w:r>
+      <w:r>
+        <w:rPr>
+          <w:rStyle w:val="NormalTok"/>
+        </w:rPr>
+        <w:t xml:space="preserve">(</w:t>
+      </w:r>
+      <w:r>
+        <w:rPr>
+          <w:rStyle w:val="AttributeTok"/>
+        </w:rPr>
+        <w:t xml:space="preserve">legend.position =</w:t>
+      </w:r>
+      <w:r>
+        <w:rPr>
+          <w:rStyle w:val="NormalTok"/>
+        </w:rPr>
+        <w:t xml:space="preserve"> </w:t>
+      </w:r>
+      <w:r>
+        <w:rPr>
+          <w:rStyle w:val="StringTok"/>
+        </w:rPr>
+        <w:t xml:space="preserve">"none"</w:t>
+      </w:r>
+      <w:r>
+        <w:rPr>
+          <w:rStyle w:val="NormalTok"/>
+        </w:rPr>
+        <w:t xml:space="preserve">)</w:t>
+      </w:r>
+    </w:p>
+    <w:p>
+      <w:pPr>
+        <w:pStyle w:val="FirstParagraph"/>
+      </w:pPr>
+      <w:r>
+        <w:drawing>
+          <wp:inline>
+            <wp:extent cx="5943600" cy="3714750"/>
+            <wp:effectExtent b="0" l="0" r="0" t="0"/>
+            <wp:docPr descr="" title="" id="1" name="Picture"/>
+            <a:graphic>
+              <a:graphicData uri="http://schemas.openxmlformats.org/drawingml/2006/picture">
+                <pic:pic>
+                  <pic:nvPicPr>
+                    <pic:cNvPr descr="airline_satisfaction_files/figure-docx/unnamed-chunk-12-1.png" id="0" name="Picture"/>
+                    <pic:cNvPicPr>
+                      <a:picLocks noChangeArrowheads="1" noChangeAspect="1"/>
+                    </pic:cNvPicPr>
+                  </pic:nvPicPr>
+                  <pic:blipFill>
+                    <a:blip r:embed="rId31"/>
+                    <a:stretch>
+                      <a:fillRect/>
+                    </a:stretch>
+                  </pic:blipFill>
+                  <pic:spPr bwMode="auto">
+                    <a:xfrm>
+                      <a:off x="0" y="0"/>
+                      <a:ext cx="5943600" cy="3714750"/>
+                    </a:xfrm>
+                    <a:prstGeom prst="rect">
+                      <a:avLst/>
+                    </a:prstGeom>
+                    <a:noFill/>
+                    <a:ln w="9525">
+                      <a:noFill/>
+                      <a:headEnd/>
+                      <a:tailEnd/>
+                    </a:ln>
+                  </pic:spPr>
+                </pic:pic>
+              </a:graphicData>
+            </a:graphic>
+          </wp:inline>
+        </w:drawing>
+      </w:r>
+    </w:p>
+    <w:bookmarkEnd w:id="32"/>
+    <w:bookmarkEnd w:id="33"/>
+    <w:bookmarkEnd w:id="34"/>
     <w:sectPr>
       <w:pgSz w:h="15840" w:w="12240"/>
       <w:pgMar w:bottom="1440" w:footer="720" w:gutter="0" w:header="720" w:left="1440" w:right="1440" w:top="1440"/>
@@ -5725,7 +6754,7 @@
     <w:name w:val="ConstantTok"/>
     <w:basedOn w:val="VerbatimChar"/>
     <w:rPr>
-      <w:color w:val="8f5902"/>
+      <w:color w:val="000000"/>
       <w:shd w:val="clear" w:fill="f8f8f8"/>
     </w:rPr>
   </w:style>
@@ -5741,9 +6770,8 @@
     <w:name w:val="SpecialCharTok"/>
     <w:basedOn w:val="VerbatimChar"/>
     <w:rPr>
-      <w:color w:val="ce5c00"/>
+      <w:color w:val="000000"/>
       <w:shd w:val="clear" w:fill="f8f8f8"/>
-      <w:b/>
     </w:rPr>
   </w:style>
   <w:style w:type="character" w:customStyle="1" w:styleId="StringTok">
@@ -5828,9 +6856,8 @@
     <w:name w:val="FunctionTok"/>
     <w:basedOn w:val="VerbatimChar"/>
     <w:rPr>
-      <w:color w:val="204a87"/>
+      <w:color w:val="000000"/>
       <w:shd w:val="clear" w:fill="f8f8f8"/>
-      <w:b/>
     </w:rPr>
   </w:style>
   <w:style w:type="character" w:customStyle="1" w:styleId="VariableTok">
@@ -5886,7 +6913,7 @@
     <w:name w:val="AttributeTok"/>
     <w:basedOn w:val="VerbatimChar"/>
     <w:rPr>
-      <w:color w:val="204a87"/>
+      <w:color w:val="c4a000"/>
       <w:shd w:val="clear" w:fill="f8f8f8"/>
     </w:rPr>
   </w:style>

</xml_diff>

<commit_message>
vracen template za word
</commit_message>
<xml_diff>
--- a/reports/airline_satisfaction.docx
+++ b/reports/airline_satisfaction.docx
@@ -210,7 +210,7 @@
     </w:p>
     <w:bookmarkEnd w:id="22"/>
     <w:bookmarkEnd w:id="23"/>
-    <w:bookmarkStart w:id="34" w:name="pregled-podataka"/>
+    <w:bookmarkStart w:id="31" w:name="pregled-podataka"/>
     <w:p>
       <w:pPr>
         <w:pStyle w:val="Heading1"/>
@@ -4619,24 +4619,26 @@
         <w:t xml:space="preserve">, gde ćemo detaljnije ispitati distribucije i odnose među promenljivama.</w:t>
       </w:r>
     </w:p>
-    <w:p>
-      <w:pPr>
-        <w:pStyle w:val="BodyText"/>
-      </w:pPr>
-      <w:r>
-        <w:t xml:space="preserve">#Eksplorativna analiza podataka(EDA)</w:t>
-      </w:r>
-    </w:p>
-    <w:p>
-      <w:pPr>
-        <w:pStyle w:val="BodyText"/>
+    <w:bookmarkEnd w:id="30"/>
+    <w:bookmarkEnd w:id="31"/>
+    <w:bookmarkStart w:id="37" w:name="eksplorativna-analiza-podatakaeda"/>
+    <w:p>
+      <w:pPr>
+        <w:pStyle w:val="Heading1"/>
+      </w:pPr>
+      <w:r>
+        <w:t xml:space="preserve">Eksplorativna analiza podataka(EDA)</w:t>
+      </w:r>
+    </w:p>
+    <w:p>
+      <w:pPr>
+        <w:pStyle w:val="FirstParagraph"/>
       </w:pPr>
       <w:r>
         <w:t xml:space="preserve">Eksplorativna analiza podataka (Exploratory Data Analysis - EDA) predstavlja ključni korak u analizi u okviru koga istražujemo i vizualizujemo podatke, kako bismo saznali njihovu strukturu, uočili šablone, anomalije i proverili međusobne veze između promenljivih pre nego što pređemo na kreiranje modela mašinskog učenja.</w:t>
       </w:r>
     </w:p>
-    <w:bookmarkEnd w:id="30"/>
-    <w:bookmarkStart w:id="33" w:name="univarijantna-analiza"/>
+    <w:bookmarkStart w:id="36" w:name="univarijantna-analiza"/>
     <w:p>
       <w:pPr>
         <w:pStyle w:val="Heading2"/>
@@ -4669,7 +4671,7 @@
         <w:t xml:space="preserve">(zadovoljstvo putnika), jer nam njena raspodela govori o ravnoteži klasa koje ćemo kasnije predviđati.</w:t>
       </w:r>
     </w:p>
-    <w:bookmarkStart w:id="32" w:name="analiza-ciljne-promenljive-satisfaction"/>
+    <w:bookmarkStart w:id="35" w:name="analiza-ciljne-promenljive-satisfaction"/>
     <w:p>
       <w:pPr>
         <w:pStyle w:val="Heading3"/>
@@ -5609,18 +5611,18 @@
           <wp:inline>
             <wp:extent cx="5943600" cy="3714750"/>
             <wp:effectExtent b="0" l="0" r="0" t="0"/>
-            <wp:docPr descr="" title="" id="1" name="Picture"/>
+            <wp:docPr descr="" title="" id="33" name="Picture"/>
             <a:graphic>
               <a:graphicData uri="http://schemas.openxmlformats.org/drawingml/2006/picture">
                 <pic:pic>
                   <pic:nvPicPr>
-                    <pic:cNvPr descr="airline_satisfaction_files/figure-docx/unnamed-chunk-12-1.png" id="0" name="Picture"/>
+                    <pic:cNvPr descr="airline_satisfaction_files/figure-docx/unnamed-chunk-12-1.png" id="34" name="Picture"/>
                     <pic:cNvPicPr>
                       <a:picLocks noChangeArrowheads="1" noChangeAspect="1"/>
                     </pic:cNvPicPr>
                   </pic:nvPicPr>
                   <pic:blipFill>
-                    <a:blip r:embed="rId31"/>
+                    <a:blip r:embed="rId32"/>
                     <a:stretch>
                       <a:fillRect/>
                     </a:stretch>
@@ -5647,9 +5649,66 @@
         </w:drawing>
       </w:r>
     </w:p>
-    <w:bookmarkEnd w:id="32"/>
-    <w:bookmarkEnd w:id="33"/>
-    <w:bookmarkEnd w:id="34"/>
+    <w:p>
+      <w:pPr>
+        <w:pStyle w:val="BodyText"/>
+      </w:pPr>
+      <w:r>
+        <w:t xml:space="preserve">Nakon vizuelne i numeričke analize ciljne promenljive, uočavamo da su nezadovoljni putnici (</w:t>
+      </w:r>
+      <w:r>
+        <w:rPr>
+          <w:iCs/>
+          <w:i/>
+        </w:rPr>
+        <w:t xml:space="preserve">Not Satisfied</w:t>
+      </w:r>
+      <w:r>
+        <w:t xml:space="preserve">) blago zastupljeniji sa</w:t>
+      </w:r>
+      <w:r>
+        <w:t xml:space="preserve"> </w:t>
+      </w:r>
+      <w:r>
+        <w:rPr>
+          <w:bCs/>
+          <w:b/>
+        </w:rPr>
+        <w:t xml:space="preserve">56.6%</w:t>
+      </w:r>
+      <w:r>
+        <w:t xml:space="preserve">, dok zadovoljni (</w:t>
+      </w:r>
+      <w:r>
+        <w:rPr>
+          <w:iCs/>
+          <w:i/>
+        </w:rPr>
+        <w:t xml:space="preserve">Satisfied</w:t>
+      </w:r>
+      <w:r>
+        <w:t xml:space="preserve">) čine</w:t>
+      </w:r>
+      <w:r>
+        <w:t xml:space="preserve"> </w:t>
+      </w:r>
+      <w:r>
+        <w:rPr>
+          <w:bCs/>
+          <w:b/>
+        </w:rPr>
+        <w:t xml:space="preserve">43.4%</w:t>
+      </w:r>
+      <w:r>
+        <w:t xml:space="preserve"> </w:t>
+      </w:r>
+      <w:r>
+        <w:t xml:space="preserve">uzorka. Ova raspodela ukazuje na to da podaci nemaju drastičan disbalans klasa, što predstavlja povoljnu osnovu za kasniju izgradnju i treniranje modela klasifikacije, jer nijedna klasa nije zanemarljivo mala.</w:t>
+      </w:r>
+    </w:p>
+    <w:bookmarkEnd w:id="35"/>
+    <w:bookmarkEnd w:id="36"/>
+    <w:bookmarkEnd w:id="37"/>
     <w:sectPr>
       <w:pgSz w:h="15840" w:w="12240"/>
       <w:pgMar w:bottom="1440" w:footer="720" w:gutter="0" w:header="720" w:left="1440" w:right="1440" w:top="1440"/>
@@ -6754,7 +6813,7 @@
     <w:name w:val="ConstantTok"/>
     <w:basedOn w:val="VerbatimChar"/>
     <w:rPr>
-      <w:color w:val="000000"/>
+      <w:color w:val="8f5902"/>
       <w:shd w:val="clear" w:fill="f8f8f8"/>
     </w:rPr>
   </w:style>
@@ -6770,8 +6829,9 @@
     <w:name w:val="SpecialCharTok"/>
     <w:basedOn w:val="VerbatimChar"/>
     <w:rPr>
-      <w:color w:val="000000"/>
+      <w:color w:val="ce5c00"/>
       <w:shd w:val="clear" w:fill="f8f8f8"/>
+      <w:b/>
     </w:rPr>
   </w:style>
   <w:style w:type="character" w:customStyle="1" w:styleId="StringTok">
@@ -6856,8 +6916,9 @@
     <w:name w:val="FunctionTok"/>
     <w:basedOn w:val="VerbatimChar"/>
     <w:rPr>
-      <w:color w:val="000000"/>
+      <w:color w:val="204a87"/>
       <w:shd w:val="clear" w:fill="f8f8f8"/>
+      <w:b/>
     </w:rPr>
   </w:style>
   <w:style w:type="character" w:customStyle="1" w:styleId="VariableTok">
@@ -6913,7 +6974,7 @@
     <w:name w:val="AttributeTok"/>
     <w:basedOn w:val="VerbatimChar"/>
     <w:rPr>
-      <w:color w:val="c4a000"/>
+      <w:color w:val="204a87"/>
       <w:shd w:val="clear" w:fill="f8f8f8"/>
     </w:rPr>
   </w:style>

</xml_diff>

<commit_message>
Dodata univarijantna analiza kategorijskih promenljivih
</commit_message>
<xml_diff>
--- a/reports/airline_satisfaction.docx
+++ b/reports/airline_satisfaction.docx
@@ -4621,7 +4621,7 @@
     </w:p>
     <w:bookmarkEnd w:id="30"/>
     <w:bookmarkEnd w:id="31"/>
-    <w:bookmarkStart w:id="38" w:name="eksplorativna-analiza-podataka-eda"/>
+    <w:bookmarkStart w:id="36" w:name="eksplorativna-analiza-podataka-eda"/>
     <w:p>
       <w:pPr>
         <w:pStyle w:val="Heading1"/>
@@ -6591,7 +6591,7 @@
       </w:r>
     </w:p>
     <w:bookmarkEnd w:id="32"/>
-    <w:bookmarkStart w:id="37" w:name="univarijantna-analiza"/>
+    <w:bookmarkStart w:id="35" w:name="univarijantna-analiza"/>
     <w:p>
       <w:pPr>
         <w:pStyle w:val="Heading2"/>
@@ -6624,7 +6624,7 @@
         <w:t xml:space="preserve">(zadovoljstvo putnika), jer nam njena raspodela govori o ravnoteži klasa koje ćemo kasnije predviđati.</w:t>
       </w:r>
     </w:p>
-    <w:bookmarkStart w:id="36" w:name="analiza-ciljne-promenljive-satisfaction"/>
+    <w:bookmarkStart w:id="34" w:name="analiza-ciljne-promenljive-satisfaction"/>
     <w:p>
       <w:pPr>
         <w:pStyle w:val="Heading3"/>
@@ -7564,12 +7564,12 @@
           <wp:inline>
             <wp:extent cx="5943600" cy="3714750"/>
             <wp:effectExtent b="0" l="0" r="0" t="0"/>
-            <wp:docPr descr="" title="" id="34" name="Picture"/>
+            <wp:docPr descr="" title="" id="1" name="Picture"/>
             <a:graphic>
               <a:graphicData uri="http://schemas.openxmlformats.org/drawingml/2006/picture">
                 <pic:pic>
                   <pic:nvPicPr>
-                    <pic:cNvPr descr="airline_satisfaction_files/figure-docx/unnamed-chunk-16-1.png" id="35" name="Picture"/>
+                    <pic:cNvPr descr="airline_satisfaction_files/figure-docx/unnamed-chunk-16-1.png" id="0" name="Picture"/>
                     <pic:cNvPicPr>
                       <a:picLocks noChangeArrowheads="1" noChangeAspect="1"/>
                     </pic:cNvPicPr>
@@ -7659,9 +7659,9 @@
         <w:t xml:space="preserve">uzorka. Ova raspodela ukazuje na to da podaci nemaju drastičan disbalans klasa, što predstavlja povoljnu osnovu za kasniju izgradnju i treniranje modela klasifikacije, jer nijedna klasa nije zanemarljivo mala.</w:t>
       </w:r>
     </w:p>
+    <w:bookmarkEnd w:id="34"/>
+    <w:bookmarkEnd w:id="35"/>
     <w:bookmarkEnd w:id="36"/>
-    <w:bookmarkEnd w:id="37"/>
-    <w:bookmarkEnd w:id="38"/>
     <w:sectPr>
       <w:pgSz w:h="15840" w:w="12240"/>
       <w:pgMar w:bottom="1440" w:footer="720" w:gutter="0" w:header="720" w:left="1440" w:right="1440" w:top="1440"/>
@@ -8769,7 +8769,7 @@
     <w:name w:val="ConstantTok"/>
     <w:basedOn w:val="VerbatimChar"/>
     <w:rPr>
-      <w:color w:val="8f5902"/>
+      <w:color w:val="000000"/>
       <w:shd w:val="clear" w:fill="f8f8f8"/>
     </w:rPr>
   </w:style>
@@ -8785,9 +8785,8 @@
     <w:name w:val="SpecialCharTok"/>
     <w:basedOn w:val="VerbatimChar"/>
     <w:rPr>
-      <w:color w:val="ce5c00"/>
+      <w:color w:val="000000"/>
       <w:shd w:val="clear" w:fill="f8f8f8"/>
-      <w:b/>
     </w:rPr>
   </w:style>
   <w:style w:type="character" w:customStyle="1" w:styleId="StringTok">
@@ -8872,9 +8871,8 @@
     <w:name w:val="FunctionTok"/>
     <w:basedOn w:val="VerbatimChar"/>
     <w:rPr>
-      <w:color w:val="204a87"/>
+      <w:color w:val="000000"/>
       <w:shd w:val="clear" w:fill="f8f8f8"/>
-      <w:b/>
     </w:rPr>
   </w:style>
   <w:style w:type="character" w:customStyle="1" w:styleId="VariableTok">
@@ -8930,7 +8928,7 @@
     <w:name w:val="AttributeTok"/>
     <w:basedOn w:val="VerbatimChar"/>
     <w:rPr>
-      <w:color w:val="204a87"/>
+      <w:color w:val="c4a000"/>
       <w:shd w:val="clear" w:fill="f8f8f8"/>
     </w:rPr>
   </w:style>

</xml_diff>

<commit_message>
zapoceta bivarijantna analiza kategorijskih promenljivih
</commit_message>
<xml_diff>
--- a/reports/airline_satisfaction.docx
+++ b/reports/airline_satisfaction.docx
@@ -4621,7 +4621,7 @@
     </w:p>
     <w:bookmarkEnd w:id="30"/>
     <w:bookmarkEnd w:id="31"/>
-    <w:bookmarkStart w:id="71" w:name="eksplorativna-analiza-podataka-eda"/>
+    <w:bookmarkStart w:id="78" w:name="eksplorativna-analiza-podataka-eda"/>
     <w:p>
       <w:pPr>
         <w:pStyle w:val="Heading1"/>
@@ -12899,7 +12899,1476 @@
     </w:p>
     <w:bookmarkEnd w:id="69"/>
     <w:bookmarkEnd w:id="70"/>
-    <w:bookmarkEnd w:id="71"/>
+    <w:bookmarkStart w:id="77" w:name="bivarijantna-analiza"/>
+    <w:p>
+      <w:pPr>
+        <w:pStyle w:val="Heading2"/>
+      </w:pPr>
+      <w:r>
+        <w:t xml:space="preserve">Bivarijantna analiza</w:t>
+      </w:r>
+    </w:p>
+    <w:p>
+      <w:pPr>
+        <w:pStyle w:val="FirstParagraph"/>
+      </w:pPr>
+      <w:r>
+        <w:t xml:space="preserve">Bivarijantna analiza predstavlja deo eksplorativne analize u okviru koga se ispituje odnos između dve promenljive. Za razliku od univarijantne analize, u kojoj se svaka promenljiva posmatra pojedinačno, bivarijantna analiza omogućava da utvrdimo da li između promenljivih postoje određeni obrasci, razlike ili povezanosti.</w:t>
+      </w:r>
+    </w:p>
+    <w:p>
+      <w:pPr>
+        <w:pStyle w:val="BodyText"/>
+      </w:pPr>
+      <w:r>
+        <w:t xml:space="preserve">U ovom radu posebnu pažnju posvetićemo ispitivanju odnosa između karakteristika putnika i leta, sa jedne strane, i ciljne promenljive</w:t>
+      </w:r>
+      <w:r>
+        <w:t xml:space="preserve"> </w:t>
+      </w:r>
+      <w:r>
+        <w:rPr>
+          <w:rStyle w:val="VerbatimChar"/>
+        </w:rPr>
+        <w:t xml:space="preserve">Satisfaction</w:t>
+      </w:r>
+      <w:r>
+        <w:t xml:space="preserve">, sa druge strane. Cilj je da se utvrdi da li se zadovoljstvo putnika razlikuje u zavisnosti od pola, tipa korisnika, svrhe putovanja, klase leta, starosti, dužine leta, vremena kašnjenja i ocena pojedinačnih usluga.</w:t>
+      </w:r>
+    </w:p>
+    <w:p>
+      <w:pPr>
+        <w:pStyle w:val="BodyText"/>
+      </w:pPr>
+      <w:r>
+        <w:t xml:space="preserve">Kod kategorijskih promenljivih analiziraćemo raspodelu zadovoljnih i nezadovoljnih putnika unutar svake kategorije. Na primer, ispitaćemo da li se procenat zadovoljnih putnika razlikuje između poslovne i ekonomske klase, između lojalnih i dislojalnih korisnika, kao i između poslovnih i ličnih putovanja. Za ove prikaze koristićemo tabele frekvencija, procentualne stubičaste dijagrame i, po potrebi, test nezavisnosti.</w:t>
+      </w:r>
+    </w:p>
+    <w:p>
+      <w:pPr>
+        <w:pStyle w:val="BodyText"/>
+      </w:pPr>
+      <w:r>
+        <w:t xml:space="preserve">Kod numeričkih promenljivih poredićemo njihove distribucije između zadovoljnih i nezadovoljnih putnika. Na taj način možemo ispitati da li se, na primer, starost putnika, dužina leta ili vreme kašnjenja razlikuju između ove dve grupe. Za prikaz odnosa koristićemo boxplot grafikone, a kod promenljivih za koje je to opravdano i korelacionu analizu.</w:t>
+      </w:r>
+    </w:p>
+    <w:p>
+      <w:pPr>
+        <w:pStyle w:val="BodyText"/>
+      </w:pPr>
+      <w:r>
+        <w:t xml:space="preserve">Posebno ćemo analizirati odnos između ocena usluga i ciljne promenljive</w:t>
+      </w:r>
+      <w:r>
+        <w:t xml:space="preserve"> </w:t>
+      </w:r>
+      <w:r>
+        <w:rPr>
+          <w:rStyle w:val="VerbatimChar"/>
+        </w:rPr>
+        <w:t xml:space="preserve">Satisfaction</w:t>
+      </w:r>
+      <w:r>
+        <w:t xml:space="preserve">. Na osnovu tih analiza možemo utvrditi da li su više ocene usluga češće povezane sa zadovoljnim putnicima i koje karakteristike potencijalno imaju najveći značaj za predviđanje zadovoljstva.</w:t>
+      </w:r>
+    </w:p>
+    <w:p>
+      <w:pPr>
+        <w:pStyle w:val="BodyText"/>
+      </w:pPr>
+      <w:r>
+        <w:t xml:space="preserve">Rezultate bivarijantne analize nećemo tumačiti kao dokaz uzročno-posledične veze. Uočene razlike i povezanosti opisuju obrasce u posmatranom skupu podataka i poslužiće kao osnova za izbor promenljivih i izgradnju modela mašinskog učenja.</w:t>
+      </w:r>
+    </w:p>
+    <w:bookmarkStart w:id="75" w:name="X5217c69aba886573b720b1404d40e9d4f26bb3e"/>
+    <w:p>
+      <w:pPr>
+        <w:pStyle w:val="Heading3"/>
+      </w:pPr>
+      <w:r>
+        <w:t xml:space="preserve">Bivarijantna analiza kategorijskih promenljivih</w:t>
+      </w:r>
+    </w:p>
+    <w:bookmarkStart w:id="74" w:name="odnos-pola-i-zadovoljstva-putnika"/>
+    <w:p>
+      <w:pPr>
+        <w:pStyle w:val="Heading4"/>
+      </w:pPr>
+      <w:r>
+        <w:t xml:space="preserve">Odnos pola i zadovoljstva putnika</w:t>
+      </w:r>
+    </w:p>
+    <w:p>
+      <w:pPr>
+        <w:pStyle w:val="FirstParagraph"/>
+      </w:pPr>
+      <w:r>
+        <w:t xml:space="preserve">U ovom delu ispitaćemo da li se zadovoljstvo putnika razlikuje u zavisnosti od pola. Za razliku od univarijantne analize, u kojoj smo posmatrali samo zastupljenost muškaraca i žena, sada ćemo analizirati raspodelu kategorija</w:t>
+      </w:r>
+      <w:r>
+        <w:t xml:space="preserve"> </w:t>
+      </w:r>
+      <w:r>
+        <w:rPr>
+          <w:rStyle w:val="VerbatimChar"/>
+        </w:rPr>
+        <w:t xml:space="preserve">Satisfied</w:t>
+      </w:r>
+      <w:r>
+        <w:t xml:space="preserve"> </w:t>
+      </w:r>
+      <w:r>
+        <w:t xml:space="preserve">i</w:t>
+      </w:r>
+      <w:r>
+        <w:t xml:space="preserve"> </w:t>
+      </w:r>
+      <w:r>
+        <w:rPr>
+          <w:rStyle w:val="VerbatimChar"/>
+        </w:rPr>
+        <w:t xml:space="preserve">Not Satisfied</w:t>
+      </w:r>
+      <w:r>
+        <w:t xml:space="preserve"> </w:t>
+      </w:r>
+      <w:r>
+        <w:t xml:space="preserve">unutar svake polne grupe.</w:t>
+      </w:r>
+    </w:p>
+    <w:p>
+      <w:pPr>
+        <w:pStyle w:val="BodyText"/>
+      </w:pPr>
+      <w:r>
+        <w:t xml:space="preserve">Za poređenje ćemo koristiti relativne frekvencije, odnosno procenat zadovoljnih i nezadovoljnih putnika unutar svake kategorije pola. Korišćenje procenata je važno zato što omogućava pravično poređenje grupa, čak i kada njihov ukupan broj nije potpuno jednak.</w:t>
+      </w:r>
+    </w:p>
+    <w:p>
+      <w:pPr>
+        <w:pStyle w:val="SourceCode"/>
+      </w:pPr>
+      <w:r>
+        <w:rPr>
+          <w:rStyle w:val="NormalTok"/>
+        </w:rPr>
+        <w:t xml:space="preserve">gender_satisfaction </w:t>
+      </w:r>
+      <w:r>
+        <w:rPr>
+          <w:rStyle w:val="OtherTok"/>
+        </w:rPr>
+        <w:t xml:space="preserve">&lt;-</w:t>
+      </w:r>
+      <w:r>
+        <w:rPr>
+          <w:rStyle w:val="NormalTok"/>
+        </w:rPr>
+        <w:t xml:space="preserve"> data </w:t>
+      </w:r>
+      <w:r>
+        <w:rPr>
+          <w:rStyle w:val="SpecialCharTok"/>
+        </w:rPr>
+        <w:t xml:space="preserve">%&gt;%</w:t>
+      </w:r>
+      <w:r>
+        <w:br/>
+      </w:r>
+      <w:r>
+        <w:rPr>
+          <w:rStyle w:val="NormalTok"/>
+        </w:rPr>
+        <w:t xml:space="preserve">  </w:t>
+      </w:r>
+      <w:r>
+        <w:rPr>
+          <w:rStyle w:val="FunctionTok"/>
+        </w:rPr>
+        <w:t xml:space="preserve">count</w:t>
+      </w:r>
+      <w:r>
+        <w:rPr>
+          <w:rStyle w:val="NormalTok"/>
+        </w:rPr>
+        <w:t xml:space="preserve">(Gender, Satisfaction, </w:t>
+      </w:r>
+      <w:r>
+        <w:rPr>
+          <w:rStyle w:val="AttributeTok"/>
+        </w:rPr>
+        <w:t xml:space="preserve">name =</w:t>
+      </w:r>
+      <w:r>
+        <w:rPr>
+          <w:rStyle w:val="NormalTok"/>
+        </w:rPr>
+        <w:t xml:space="preserve"> </w:t>
+      </w:r>
+      <w:r>
+        <w:rPr>
+          <w:rStyle w:val="StringTok"/>
+        </w:rPr>
+        <w:t xml:space="preserve">"Broj"</w:t>
+      </w:r>
+      <w:r>
+        <w:rPr>
+          <w:rStyle w:val="NormalTok"/>
+        </w:rPr>
+        <w:t xml:space="preserve">) </w:t>
+      </w:r>
+      <w:r>
+        <w:rPr>
+          <w:rStyle w:val="SpecialCharTok"/>
+        </w:rPr>
+        <w:t xml:space="preserve">%&gt;%</w:t>
+      </w:r>
+      <w:r>
+        <w:br/>
+      </w:r>
+      <w:r>
+        <w:rPr>
+          <w:rStyle w:val="NormalTok"/>
+        </w:rPr>
+        <w:t xml:space="preserve">  </w:t>
+      </w:r>
+      <w:r>
+        <w:rPr>
+          <w:rStyle w:val="FunctionTok"/>
+        </w:rPr>
+        <w:t xml:space="preserve">group_by</w:t>
+      </w:r>
+      <w:r>
+        <w:rPr>
+          <w:rStyle w:val="NormalTok"/>
+        </w:rPr>
+        <w:t xml:space="preserve">(Gender) </w:t>
+      </w:r>
+      <w:r>
+        <w:rPr>
+          <w:rStyle w:val="SpecialCharTok"/>
+        </w:rPr>
+        <w:t xml:space="preserve">%&gt;%</w:t>
+      </w:r>
+      <w:r>
+        <w:br/>
+      </w:r>
+      <w:r>
+        <w:rPr>
+          <w:rStyle w:val="NormalTok"/>
+        </w:rPr>
+        <w:t xml:space="preserve">  </w:t>
+      </w:r>
+      <w:r>
+        <w:rPr>
+          <w:rStyle w:val="FunctionTok"/>
+        </w:rPr>
+        <w:t xml:space="preserve">mutate</w:t>
+      </w:r>
+      <w:r>
+        <w:rPr>
+          <w:rStyle w:val="NormalTok"/>
+        </w:rPr>
+        <w:t xml:space="preserve">(</w:t>
+      </w:r>
+      <w:r>
+        <w:rPr>
+          <w:rStyle w:val="AttributeTok"/>
+        </w:rPr>
+        <w:t xml:space="preserve">Procenat =</w:t>
+      </w:r>
+      <w:r>
+        <w:rPr>
+          <w:rStyle w:val="NormalTok"/>
+        </w:rPr>
+        <w:t xml:space="preserve"> </w:t>
+      </w:r>
+      <w:r>
+        <w:rPr>
+          <w:rStyle w:val="FunctionTok"/>
+        </w:rPr>
+        <w:t xml:space="preserve">round</w:t>
+      </w:r>
+      <w:r>
+        <w:rPr>
+          <w:rStyle w:val="NormalTok"/>
+        </w:rPr>
+        <w:t xml:space="preserve">(Broj </w:t>
+      </w:r>
+      <w:r>
+        <w:rPr>
+          <w:rStyle w:val="SpecialCharTok"/>
+        </w:rPr>
+        <w:t xml:space="preserve">/</w:t>
+      </w:r>
+      <w:r>
+        <w:rPr>
+          <w:rStyle w:val="NormalTok"/>
+        </w:rPr>
+        <w:t xml:space="preserve"> </w:t>
+      </w:r>
+      <w:r>
+        <w:rPr>
+          <w:rStyle w:val="FunctionTok"/>
+        </w:rPr>
+        <w:t xml:space="preserve">sum</w:t>
+      </w:r>
+      <w:r>
+        <w:rPr>
+          <w:rStyle w:val="NormalTok"/>
+        </w:rPr>
+        <w:t xml:space="preserve">(Broj) </w:t>
+      </w:r>
+      <w:r>
+        <w:rPr>
+          <w:rStyle w:val="SpecialCharTok"/>
+        </w:rPr>
+        <w:t xml:space="preserve">*</w:t>
+      </w:r>
+      <w:r>
+        <w:rPr>
+          <w:rStyle w:val="NormalTok"/>
+        </w:rPr>
+        <w:t xml:space="preserve"> </w:t>
+      </w:r>
+      <w:r>
+        <w:rPr>
+          <w:rStyle w:val="DecValTok"/>
+        </w:rPr>
+        <w:t xml:space="preserve">100</w:t>
+      </w:r>
+      <w:r>
+        <w:rPr>
+          <w:rStyle w:val="NormalTok"/>
+        </w:rPr>
+        <w:t xml:space="preserve">, </w:t>
+      </w:r>
+      <w:r>
+        <w:rPr>
+          <w:rStyle w:val="DecValTok"/>
+        </w:rPr>
+        <w:t xml:space="preserve">2</w:t>
+      </w:r>
+      <w:r>
+        <w:rPr>
+          <w:rStyle w:val="NormalTok"/>
+        </w:rPr>
+        <w:t xml:space="preserve">)) </w:t>
+      </w:r>
+      <w:r>
+        <w:rPr>
+          <w:rStyle w:val="SpecialCharTok"/>
+        </w:rPr>
+        <w:t xml:space="preserve">%&gt;%</w:t>
+      </w:r>
+      <w:r>
+        <w:br/>
+      </w:r>
+      <w:r>
+        <w:rPr>
+          <w:rStyle w:val="NormalTok"/>
+        </w:rPr>
+        <w:t xml:space="preserve">  </w:t>
+      </w:r>
+      <w:r>
+        <w:rPr>
+          <w:rStyle w:val="FunctionTok"/>
+        </w:rPr>
+        <w:t xml:space="preserve">ungroup</w:t>
+      </w:r>
+      <w:r>
+        <w:rPr>
+          <w:rStyle w:val="NormalTok"/>
+        </w:rPr>
+        <w:t xml:space="preserve">()</w:t>
+      </w:r>
+      <w:r>
+        <w:br/>
+      </w:r>
+      <w:r>
+        <w:br/>
+      </w:r>
+      <w:r>
+        <w:rPr>
+          <w:rStyle w:val="NormalTok"/>
+        </w:rPr>
+        <w:t xml:space="preserve">gender_satisfaction</w:t>
+      </w:r>
+    </w:p>
+    <w:p>
+      <w:pPr>
+        <w:pStyle w:val="SourceCode"/>
+      </w:pPr>
+      <w:r>
+        <w:rPr>
+          <w:rStyle w:val="VerbatimChar"/>
+        </w:rPr>
+        <w:t xml:space="preserve">## # A tibble: 4 × 4</w:t>
+      </w:r>
+      <w:r>
+        <w:br/>
+      </w:r>
+      <w:r>
+        <w:rPr>
+          <w:rStyle w:val="VerbatimChar"/>
+        </w:rPr>
+        <w:t xml:space="preserve">##   Gender Satisfaction   Broj Procenat</w:t>
+      </w:r>
+      <w:r>
+        <w:br/>
+      </w:r>
+      <w:r>
+        <w:rPr>
+          <w:rStyle w:val="VerbatimChar"/>
+        </w:rPr>
+        <w:t xml:space="preserve">##   &lt;fct&gt;  &lt;fct&gt;         &lt;int&gt;    &lt;dbl&gt;</w:t>
+      </w:r>
+      <w:r>
+        <w:br/>
+      </w:r>
+      <w:r>
+        <w:rPr>
+          <w:rStyle w:val="VerbatimChar"/>
+        </w:rPr>
+        <w:t xml:space="preserve">## 1 Female Satisfied     28269     42.9</w:t>
+      </w:r>
+      <w:r>
+        <w:br/>
+      </w:r>
+      <w:r>
+        <w:rPr>
+          <w:rStyle w:val="VerbatimChar"/>
+        </w:rPr>
+        <w:t xml:space="preserve">## 2 Female Not Satisfied 37630     57.1</w:t>
+      </w:r>
+      <w:r>
+        <w:br/>
+      </w:r>
+      <w:r>
+        <w:rPr>
+          <w:rStyle w:val="VerbatimChar"/>
+        </w:rPr>
+        <w:t xml:space="preserve">## 3 Male   Satisfied     28159     44.0</w:t>
+      </w:r>
+      <w:r>
+        <w:br/>
+      </w:r>
+      <w:r>
+        <w:rPr>
+          <w:rStyle w:val="VerbatimChar"/>
+        </w:rPr>
+        <w:t xml:space="preserve">## 4 Male   Not Satisfied 35822     56.0</w:t>
+      </w:r>
+    </w:p>
+    <w:p>
+      <w:pPr>
+        <w:pStyle w:val="FirstParagraph"/>
+      </w:pPr>
+      <w:r>
+        <w:t xml:space="preserve">Da bismo lakše uporedili zadovoljstvo putnika između polnih grupa, prikazaćemo proporcionalni stubičasti dijagram. Visina svakog stuba predstavlja 100% putnika unutar jedne polne grupe, dok boje prikazuju udeo zadovoljnih i nezadovoljnih putnika.</w:t>
+      </w:r>
+    </w:p>
+    <w:p>
+      <w:pPr>
+        <w:pStyle w:val="SourceCode"/>
+      </w:pPr>
+      <w:r>
+        <w:rPr>
+          <w:rStyle w:val="FunctionTok"/>
+        </w:rPr>
+        <w:t xml:space="preserve">ggplot</w:t>
+      </w:r>
+      <w:r>
+        <w:rPr>
+          <w:rStyle w:val="NormalTok"/>
+        </w:rPr>
+        <w:t xml:space="preserve">(data, </w:t>
+      </w:r>
+      <w:r>
+        <w:rPr>
+          <w:rStyle w:val="FunctionTok"/>
+        </w:rPr>
+        <w:t xml:space="preserve">aes</w:t>
+      </w:r>
+      <w:r>
+        <w:rPr>
+          <w:rStyle w:val="NormalTok"/>
+        </w:rPr>
+        <w:t xml:space="preserve">(</w:t>
+      </w:r>
+      <w:r>
+        <w:rPr>
+          <w:rStyle w:val="AttributeTok"/>
+        </w:rPr>
+        <w:t xml:space="preserve">x =</w:t>
+      </w:r>
+      <w:r>
+        <w:rPr>
+          <w:rStyle w:val="NormalTok"/>
+        </w:rPr>
+        <w:t xml:space="preserve"> Gender, </w:t>
+      </w:r>
+      <w:r>
+        <w:rPr>
+          <w:rStyle w:val="AttributeTok"/>
+        </w:rPr>
+        <w:t xml:space="preserve">fill =</w:t>
+      </w:r>
+      <w:r>
+        <w:rPr>
+          <w:rStyle w:val="NormalTok"/>
+        </w:rPr>
+        <w:t xml:space="preserve"> Satisfaction)) </w:t>
+      </w:r>
+      <w:r>
+        <w:rPr>
+          <w:rStyle w:val="SpecialCharTok"/>
+        </w:rPr>
+        <w:t xml:space="preserve">+</w:t>
+      </w:r>
+      <w:r>
+        <w:br/>
+      </w:r>
+      <w:r>
+        <w:rPr>
+          <w:rStyle w:val="NormalTok"/>
+        </w:rPr>
+        <w:t xml:space="preserve">  </w:t>
+      </w:r>
+      <w:r>
+        <w:rPr>
+          <w:rStyle w:val="FunctionTok"/>
+        </w:rPr>
+        <w:t xml:space="preserve">geom_bar</w:t>
+      </w:r>
+      <w:r>
+        <w:rPr>
+          <w:rStyle w:val="NormalTok"/>
+        </w:rPr>
+        <w:t xml:space="preserve">(</w:t>
+      </w:r>
+      <w:r>
+        <w:rPr>
+          <w:rStyle w:val="AttributeTok"/>
+        </w:rPr>
+        <w:t xml:space="preserve">position =</w:t>
+      </w:r>
+      <w:r>
+        <w:rPr>
+          <w:rStyle w:val="NormalTok"/>
+        </w:rPr>
+        <w:t xml:space="preserve"> </w:t>
+      </w:r>
+      <w:r>
+        <w:rPr>
+          <w:rStyle w:val="StringTok"/>
+        </w:rPr>
+        <w:t xml:space="preserve">"fill"</w:t>
+      </w:r>
+      <w:r>
+        <w:rPr>
+          <w:rStyle w:val="NormalTok"/>
+        </w:rPr>
+        <w:t xml:space="preserve">) </w:t>
+      </w:r>
+      <w:r>
+        <w:rPr>
+          <w:rStyle w:val="SpecialCharTok"/>
+        </w:rPr>
+        <w:t xml:space="preserve">+</w:t>
+      </w:r>
+      <w:r>
+        <w:br/>
+      </w:r>
+      <w:r>
+        <w:rPr>
+          <w:rStyle w:val="NormalTok"/>
+        </w:rPr>
+        <w:t xml:space="preserve">  </w:t>
+      </w:r>
+      <w:r>
+        <w:rPr>
+          <w:rStyle w:val="FunctionTok"/>
+        </w:rPr>
+        <w:t xml:space="preserve">scale_y_continuous</w:t>
+      </w:r>
+      <w:r>
+        <w:rPr>
+          <w:rStyle w:val="NormalTok"/>
+        </w:rPr>
+        <w:t xml:space="preserve">(</w:t>
+      </w:r>
+      <w:r>
+        <w:br/>
+      </w:r>
+      <w:r>
+        <w:rPr>
+          <w:rStyle w:val="NormalTok"/>
+        </w:rPr>
+        <w:t xml:space="preserve">    </w:t>
+      </w:r>
+      <w:r>
+        <w:rPr>
+          <w:rStyle w:val="AttributeTok"/>
+        </w:rPr>
+        <w:t xml:space="preserve">labels =</w:t>
+      </w:r>
+      <w:r>
+        <w:rPr>
+          <w:rStyle w:val="NormalTok"/>
+        </w:rPr>
+        <w:t xml:space="preserve"> scales</w:t>
+      </w:r>
+      <w:r>
+        <w:rPr>
+          <w:rStyle w:val="SpecialCharTok"/>
+        </w:rPr>
+        <w:t xml:space="preserve">::</w:t>
+      </w:r>
+      <w:r>
+        <w:rPr>
+          <w:rStyle w:val="FunctionTok"/>
+        </w:rPr>
+        <w:t xml:space="preserve">percent_format</w:t>
+      </w:r>
+      <w:r>
+        <w:rPr>
+          <w:rStyle w:val="NormalTok"/>
+        </w:rPr>
+        <w:t xml:space="preserve">()</w:t>
+      </w:r>
+      <w:r>
+        <w:br/>
+      </w:r>
+      <w:r>
+        <w:rPr>
+          <w:rStyle w:val="NormalTok"/>
+        </w:rPr>
+        <w:t xml:space="preserve">  ) </w:t>
+      </w:r>
+      <w:r>
+        <w:rPr>
+          <w:rStyle w:val="SpecialCharTok"/>
+        </w:rPr>
+        <w:t xml:space="preserve">+</w:t>
+      </w:r>
+      <w:r>
+        <w:br/>
+      </w:r>
+      <w:r>
+        <w:rPr>
+          <w:rStyle w:val="NormalTok"/>
+        </w:rPr>
+        <w:t xml:space="preserve">  </w:t>
+      </w:r>
+      <w:r>
+        <w:rPr>
+          <w:rStyle w:val="FunctionTok"/>
+        </w:rPr>
+        <w:t xml:space="preserve">scale_fill_manual</w:t>
+      </w:r>
+      <w:r>
+        <w:rPr>
+          <w:rStyle w:val="NormalTok"/>
+        </w:rPr>
+        <w:t xml:space="preserve">(</w:t>
+      </w:r>
+      <w:r>
+        <w:br/>
+      </w:r>
+      <w:r>
+        <w:rPr>
+          <w:rStyle w:val="NormalTok"/>
+        </w:rPr>
+        <w:t xml:space="preserve">    </w:t>
+      </w:r>
+      <w:r>
+        <w:rPr>
+          <w:rStyle w:val="AttributeTok"/>
+        </w:rPr>
+        <w:t xml:space="preserve">values =</w:t>
+      </w:r>
+      <w:r>
+        <w:rPr>
+          <w:rStyle w:val="NormalTok"/>
+        </w:rPr>
+        <w:t xml:space="preserve"> </w:t>
+      </w:r>
+      <w:r>
+        <w:rPr>
+          <w:rStyle w:val="FunctionTok"/>
+        </w:rPr>
+        <w:t xml:space="preserve">c</w:t>
+      </w:r>
+      <w:r>
+        <w:rPr>
+          <w:rStyle w:val="NormalTok"/>
+        </w:rPr>
+        <w:t xml:space="preserve">(</w:t>
+      </w:r>
+      <w:r>
+        <w:br/>
+      </w:r>
+      <w:r>
+        <w:rPr>
+          <w:rStyle w:val="NormalTok"/>
+        </w:rPr>
+        <w:t xml:space="preserve">      </w:t>
+      </w:r>
+      <w:r>
+        <w:rPr>
+          <w:rStyle w:val="StringTok"/>
+        </w:rPr>
+        <w:t xml:space="preserve">"Satisfied"</w:t>
+      </w:r>
+      <w:r>
+        <w:rPr>
+          <w:rStyle w:val="NormalTok"/>
+        </w:rPr>
+        <w:t xml:space="preserve"> </w:t>
+      </w:r>
+      <w:r>
+        <w:rPr>
+          <w:rStyle w:val="OtherTok"/>
+        </w:rPr>
+        <w:t xml:space="preserve">=</w:t>
+      </w:r>
+      <w:r>
+        <w:rPr>
+          <w:rStyle w:val="NormalTok"/>
+        </w:rPr>
+        <w:t xml:space="preserve"> </w:t>
+      </w:r>
+      <w:r>
+        <w:rPr>
+          <w:rStyle w:val="StringTok"/>
+        </w:rPr>
+        <w:t xml:space="preserve">"#2ecc71"</w:t>
+      </w:r>
+      <w:r>
+        <w:rPr>
+          <w:rStyle w:val="NormalTok"/>
+        </w:rPr>
+        <w:t xml:space="preserve">,</w:t>
+      </w:r>
+      <w:r>
+        <w:br/>
+      </w:r>
+      <w:r>
+        <w:rPr>
+          <w:rStyle w:val="NormalTok"/>
+        </w:rPr>
+        <w:t xml:space="preserve">      </w:t>
+      </w:r>
+      <w:r>
+        <w:rPr>
+          <w:rStyle w:val="StringTok"/>
+        </w:rPr>
+        <w:t xml:space="preserve">"Not Satisfied"</w:t>
+      </w:r>
+      <w:r>
+        <w:rPr>
+          <w:rStyle w:val="NormalTok"/>
+        </w:rPr>
+        <w:t xml:space="preserve"> </w:t>
+      </w:r>
+      <w:r>
+        <w:rPr>
+          <w:rStyle w:val="OtherTok"/>
+        </w:rPr>
+        <w:t xml:space="preserve">=</w:t>
+      </w:r>
+      <w:r>
+        <w:rPr>
+          <w:rStyle w:val="NormalTok"/>
+        </w:rPr>
+        <w:t xml:space="preserve"> </w:t>
+      </w:r>
+      <w:r>
+        <w:rPr>
+          <w:rStyle w:val="StringTok"/>
+        </w:rPr>
+        <w:t xml:space="preserve">"#e74c3c"</w:t>
+      </w:r>
+      <w:r>
+        <w:br/>
+      </w:r>
+      <w:r>
+        <w:rPr>
+          <w:rStyle w:val="NormalTok"/>
+        </w:rPr>
+        <w:t xml:space="preserve">    )</w:t>
+      </w:r>
+      <w:r>
+        <w:br/>
+      </w:r>
+      <w:r>
+        <w:rPr>
+          <w:rStyle w:val="NormalTok"/>
+        </w:rPr>
+        <w:t xml:space="preserve">  ) </w:t>
+      </w:r>
+      <w:r>
+        <w:rPr>
+          <w:rStyle w:val="SpecialCharTok"/>
+        </w:rPr>
+        <w:t xml:space="preserve">+</w:t>
+      </w:r>
+      <w:r>
+        <w:br/>
+      </w:r>
+      <w:r>
+        <w:rPr>
+          <w:rStyle w:val="NormalTok"/>
+        </w:rPr>
+        <w:t xml:space="preserve">  </w:t>
+      </w:r>
+      <w:r>
+        <w:rPr>
+          <w:rStyle w:val="FunctionTok"/>
+        </w:rPr>
+        <w:t xml:space="preserve">theme_minimal</w:t>
+      </w:r>
+      <w:r>
+        <w:rPr>
+          <w:rStyle w:val="NormalTok"/>
+        </w:rPr>
+        <w:t xml:space="preserve">() </w:t>
+      </w:r>
+      <w:r>
+        <w:rPr>
+          <w:rStyle w:val="SpecialCharTok"/>
+        </w:rPr>
+        <w:t xml:space="preserve">+</w:t>
+      </w:r>
+      <w:r>
+        <w:br/>
+      </w:r>
+      <w:r>
+        <w:rPr>
+          <w:rStyle w:val="NormalTok"/>
+        </w:rPr>
+        <w:t xml:space="preserve">  </w:t>
+      </w:r>
+      <w:r>
+        <w:rPr>
+          <w:rStyle w:val="FunctionTok"/>
+        </w:rPr>
+        <w:t xml:space="preserve">labs</w:t>
+      </w:r>
+      <w:r>
+        <w:rPr>
+          <w:rStyle w:val="NormalTok"/>
+        </w:rPr>
+        <w:t xml:space="preserve">(</w:t>
+      </w:r>
+      <w:r>
+        <w:br/>
+      </w:r>
+      <w:r>
+        <w:rPr>
+          <w:rStyle w:val="NormalTok"/>
+        </w:rPr>
+        <w:t xml:space="preserve">    </w:t>
+      </w:r>
+      <w:r>
+        <w:rPr>
+          <w:rStyle w:val="AttributeTok"/>
+        </w:rPr>
+        <w:t xml:space="preserve">title =</w:t>
+      </w:r>
+      <w:r>
+        <w:rPr>
+          <w:rStyle w:val="NormalTok"/>
+        </w:rPr>
+        <w:t xml:space="preserve"> </w:t>
+      </w:r>
+      <w:r>
+        <w:rPr>
+          <w:rStyle w:val="StringTok"/>
+        </w:rPr>
+        <w:t xml:space="preserve">"Zadovoljstvo putnika prema polu"</w:t>
+      </w:r>
+      <w:r>
+        <w:rPr>
+          <w:rStyle w:val="NormalTok"/>
+        </w:rPr>
+        <w:t xml:space="preserve">,</w:t>
+      </w:r>
+      <w:r>
+        <w:br/>
+      </w:r>
+      <w:r>
+        <w:rPr>
+          <w:rStyle w:val="NormalTok"/>
+        </w:rPr>
+        <w:t xml:space="preserve">    </w:t>
+      </w:r>
+      <w:r>
+        <w:rPr>
+          <w:rStyle w:val="AttributeTok"/>
+        </w:rPr>
+        <w:t xml:space="preserve">x =</w:t>
+      </w:r>
+      <w:r>
+        <w:rPr>
+          <w:rStyle w:val="NormalTok"/>
+        </w:rPr>
+        <w:t xml:space="preserve"> </w:t>
+      </w:r>
+      <w:r>
+        <w:rPr>
+          <w:rStyle w:val="StringTok"/>
+        </w:rPr>
+        <w:t xml:space="preserve">"Pol"</w:t>
+      </w:r>
+      <w:r>
+        <w:rPr>
+          <w:rStyle w:val="NormalTok"/>
+        </w:rPr>
+        <w:t xml:space="preserve">,</w:t>
+      </w:r>
+      <w:r>
+        <w:br/>
+      </w:r>
+      <w:r>
+        <w:rPr>
+          <w:rStyle w:val="NormalTok"/>
+        </w:rPr>
+        <w:t xml:space="preserve">    </w:t>
+      </w:r>
+      <w:r>
+        <w:rPr>
+          <w:rStyle w:val="AttributeTok"/>
+        </w:rPr>
+        <w:t xml:space="preserve">y =</w:t>
+      </w:r>
+      <w:r>
+        <w:rPr>
+          <w:rStyle w:val="NormalTok"/>
+        </w:rPr>
+        <w:t xml:space="preserve"> </w:t>
+      </w:r>
+      <w:r>
+        <w:rPr>
+          <w:rStyle w:val="StringTok"/>
+        </w:rPr>
+        <w:t xml:space="preserve">"Procenat putnika"</w:t>
+      </w:r>
+      <w:r>
+        <w:rPr>
+          <w:rStyle w:val="NormalTok"/>
+        </w:rPr>
+        <w:t xml:space="preserve">,</w:t>
+      </w:r>
+      <w:r>
+        <w:br/>
+      </w:r>
+      <w:r>
+        <w:rPr>
+          <w:rStyle w:val="NormalTok"/>
+        </w:rPr>
+        <w:t xml:space="preserve">    </w:t>
+      </w:r>
+      <w:r>
+        <w:rPr>
+          <w:rStyle w:val="AttributeTok"/>
+        </w:rPr>
+        <w:t xml:space="preserve">fill =</w:t>
+      </w:r>
+      <w:r>
+        <w:rPr>
+          <w:rStyle w:val="NormalTok"/>
+        </w:rPr>
+        <w:t xml:space="preserve"> </w:t>
+      </w:r>
+      <w:r>
+        <w:rPr>
+          <w:rStyle w:val="StringTok"/>
+        </w:rPr>
+        <w:t xml:space="preserve">"Status zadovoljstva"</w:t>
+      </w:r>
+      <w:r>
+        <w:br/>
+      </w:r>
+      <w:r>
+        <w:rPr>
+          <w:rStyle w:val="NormalTok"/>
+        </w:rPr>
+        <w:t xml:space="preserve">  )</w:t>
+      </w:r>
+    </w:p>
+    <w:p>
+      <w:pPr>
+        <w:pStyle w:val="FirstParagraph"/>
+      </w:pPr>
+      <w:r>
+        <w:drawing>
+          <wp:inline>
+            <wp:extent cx="5943600" cy="3714750"/>
+            <wp:effectExtent b="0" l="0" r="0" t="0"/>
+            <wp:docPr descr="" title="" id="72" name="Picture"/>
+            <a:graphic>
+              <a:graphicData uri="http://schemas.openxmlformats.org/drawingml/2006/picture">
+                <pic:pic>
+                  <pic:nvPicPr>
+                    <pic:cNvPr descr="airline_satisfaction_files/figure-docx/unnamed-chunk-30-1.png" id="73" name="Picture"/>
+                    <pic:cNvPicPr>
+                      <a:picLocks noChangeArrowheads="1" noChangeAspect="1"/>
+                    </pic:cNvPicPr>
+                  </pic:nvPicPr>
+                  <pic:blipFill>
+                    <a:blip r:embed="rId71"/>
+                    <a:stretch>
+                      <a:fillRect/>
+                    </a:stretch>
+                  </pic:blipFill>
+                  <pic:spPr bwMode="auto">
+                    <a:xfrm>
+                      <a:off x="0" y="0"/>
+                      <a:ext cx="5943600" cy="3714750"/>
+                    </a:xfrm>
+                    <a:prstGeom prst="rect">
+                      <a:avLst/>
+                    </a:prstGeom>
+                    <a:noFill/>
+                    <a:ln w="9525">
+                      <a:noFill/>
+                      <a:headEnd/>
+                      <a:tailEnd/>
+                    </a:ln>
+                  </pic:spPr>
+                </pic:pic>
+              </a:graphicData>
+            </a:graphic>
+          </wp:inline>
+        </w:drawing>
+      </w:r>
+    </w:p>
+    <w:p>
+      <w:pPr>
+        <w:pStyle w:val="BodyText"/>
+      </w:pPr>
+      <w:r>
+        <w:t xml:space="preserve">Na osnovu tabele i proporcionalnog stubičastog dijagrama uočavamo da su raspodele zadovoljstva kod muškaraca i žena veoma slične. U grupi žena 42,9% putnika je zadovoljno, dok je 57,1% nezadovoljno. Kod muškaraca zadovoljni putnici čine 44,0%, a nezadovoljni 56,0%.</w:t>
+      </w:r>
+    </w:p>
+    <w:p>
+      <w:pPr>
+        <w:pStyle w:val="BodyText"/>
+      </w:pPr>
+      <w:r>
+        <w:t xml:space="preserve">Razlika u procentu zadovoljnih putnika između muškaraca i žena iznosi približno 1,1 procentni poen, što predstavlja malu razliku. Na osnovu ovog prikaza ne uočava se značajna razlika u zadovoljstvu putnika između dve polne grupe. Ipak, grafički prikaz sam po sebi ne predstavlja formalni statistički test, pa bi se značajnost eventualne povezanosti mogla dodatno proveriti hi-kvadrat testom.</w:t>
+      </w:r>
+    </w:p>
+    <w:p>
+      <w:pPr>
+        <w:pStyle w:val="BodyText"/>
+      </w:pPr>
+      <w:r>
+        <w:t xml:space="preserve">Da bismo formalno proverili da li postoji povezanost između pola i zadovoljstva putnika, primenjen je hi-kvadrat test nezavisnosti. Nultom hipotezom pretpostavlja se da pol i zadovoljstvo putnika nisu povezani, dok alternativna hipoteza pretpostavlja da između njih postoji povezanost.</w:t>
+      </w:r>
+    </w:p>
+    <w:p>
+      <w:pPr>
+        <w:pStyle w:val="SourceCode"/>
+      </w:pPr>
+      <w:r>
+        <w:rPr>
+          <w:rStyle w:val="NormalTok"/>
+        </w:rPr>
+        <w:t xml:space="preserve">gender_satisfaction_table </w:t>
+      </w:r>
+      <w:r>
+        <w:rPr>
+          <w:rStyle w:val="OtherTok"/>
+        </w:rPr>
+        <w:t xml:space="preserve">&lt;-</w:t>
+      </w:r>
+      <w:r>
+        <w:rPr>
+          <w:rStyle w:val="NormalTok"/>
+        </w:rPr>
+        <w:t xml:space="preserve"> </w:t>
+      </w:r>
+      <w:r>
+        <w:rPr>
+          <w:rStyle w:val="FunctionTok"/>
+        </w:rPr>
+        <w:t xml:space="preserve">table</w:t>
+      </w:r>
+      <w:r>
+        <w:rPr>
+          <w:rStyle w:val="NormalTok"/>
+        </w:rPr>
+        <w:t xml:space="preserve">(data</w:t>
+      </w:r>
+      <w:r>
+        <w:rPr>
+          <w:rStyle w:val="SpecialCharTok"/>
+        </w:rPr>
+        <w:t xml:space="preserve">$</w:t>
+      </w:r>
+      <w:r>
+        <w:rPr>
+          <w:rStyle w:val="NormalTok"/>
+        </w:rPr>
+        <w:t xml:space="preserve">Gender, data</w:t>
+      </w:r>
+      <w:r>
+        <w:rPr>
+          <w:rStyle w:val="SpecialCharTok"/>
+        </w:rPr>
+        <w:t xml:space="preserve">$</w:t>
+      </w:r>
+      <w:r>
+        <w:rPr>
+          <w:rStyle w:val="NormalTok"/>
+        </w:rPr>
+        <w:t xml:space="preserve">Satisfaction)</w:t>
+      </w:r>
+      <w:r>
+        <w:br/>
+      </w:r>
+      <w:r>
+        <w:br/>
+      </w:r>
+      <w:r>
+        <w:rPr>
+          <w:rStyle w:val="NormalTok"/>
+        </w:rPr>
+        <w:t xml:space="preserve">gender_satisfaction_table</w:t>
+      </w:r>
+    </w:p>
+    <w:p>
+      <w:pPr>
+        <w:pStyle w:val="SourceCode"/>
+      </w:pPr>
+      <w:r>
+        <w:rPr>
+          <w:rStyle w:val="VerbatimChar"/>
+        </w:rPr>
+        <w:t xml:space="preserve">##         </w:t>
+      </w:r>
+      <w:r>
+        <w:br/>
+      </w:r>
+      <w:r>
+        <w:rPr>
+          <w:rStyle w:val="VerbatimChar"/>
+        </w:rPr>
+        <w:t xml:space="preserve">##          Satisfied Not Satisfied</w:t>
+      </w:r>
+      <w:r>
+        <w:br/>
+      </w:r>
+      <w:r>
+        <w:rPr>
+          <w:rStyle w:val="VerbatimChar"/>
+        </w:rPr>
+        <w:t xml:space="preserve">##   Female     28269         37630</w:t>
+      </w:r>
+      <w:r>
+        <w:br/>
+      </w:r>
+      <w:r>
+        <w:rPr>
+          <w:rStyle w:val="VerbatimChar"/>
+        </w:rPr>
+        <w:t xml:space="preserve">##   Male       28159         35822</w:t>
+      </w:r>
+    </w:p>
+    <w:p>
+      <w:pPr>
+        <w:pStyle w:val="SourceCode"/>
+      </w:pPr>
+      <w:r>
+        <w:rPr>
+          <w:rStyle w:val="NormalTok"/>
+        </w:rPr>
+        <w:t xml:space="preserve">gender_chisq </w:t>
+      </w:r>
+      <w:r>
+        <w:rPr>
+          <w:rStyle w:val="OtherTok"/>
+        </w:rPr>
+        <w:t xml:space="preserve">&lt;-</w:t>
+      </w:r>
+      <w:r>
+        <w:rPr>
+          <w:rStyle w:val="NormalTok"/>
+        </w:rPr>
+        <w:t xml:space="preserve"> </w:t>
+      </w:r>
+      <w:r>
+        <w:rPr>
+          <w:rStyle w:val="FunctionTok"/>
+        </w:rPr>
+        <w:t xml:space="preserve">chisq.test</w:t>
+      </w:r>
+      <w:r>
+        <w:rPr>
+          <w:rStyle w:val="NormalTok"/>
+        </w:rPr>
+        <w:t xml:space="preserve">(gender_satisfaction_table)</w:t>
+      </w:r>
+      <w:r>
+        <w:br/>
+      </w:r>
+      <w:r>
+        <w:br/>
+      </w:r>
+      <w:r>
+        <w:rPr>
+          <w:rStyle w:val="NormalTok"/>
+        </w:rPr>
+        <w:t xml:space="preserve">gender_chisq</w:t>
+      </w:r>
+    </w:p>
+    <w:p>
+      <w:pPr>
+        <w:pStyle w:val="SourceCode"/>
+      </w:pPr>
+      <w:r>
+        <w:rPr>
+          <w:rStyle w:val="VerbatimChar"/>
+        </w:rPr>
+        <w:t xml:space="preserve">## </w:t>
+      </w:r>
+      <w:r>
+        <w:br/>
+      </w:r>
+      <w:r>
+        <w:rPr>
+          <w:rStyle w:val="VerbatimChar"/>
+        </w:rPr>
+        <w:t xml:space="preserve">##  Pearson's Chi-squared test with Yates' continuity correction</w:t>
+      </w:r>
+      <w:r>
+        <w:br/>
+      </w:r>
+      <w:r>
+        <w:rPr>
+          <w:rStyle w:val="VerbatimChar"/>
+        </w:rPr>
+        <w:t xml:space="preserve">## </w:t>
+      </w:r>
+      <w:r>
+        <w:br/>
+      </w:r>
+      <w:r>
+        <w:rPr>
+          <w:rStyle w:val="VerbatimChar"/>
+        </w:rPr>
+        <w:t xml:space="preserve">## data:  gender_satisfaction_table</w:t>
+      </w:r>
+      <w:r>
+        <w:br/>
+      </w:r>
+      <w:r>
+        <w:rPr>
+          <w:rStyle w:val="VerbatimChar"/>
+        </w:rPr>
+        <w:t xml:space="preserve">## X-squared = 16.352, df = 1, p-value = 5.26e-05</w:t>
+      </w:r>
+    </w:p>
+    <w:p>
+      <w:pPr>
+        <w:pStyle w:val="FirstParagraph"/>
+      </w:pPr>
+      <w:r>
+        <w:t xml:space="preserve">Rezultat hi-kvadrat testa pokazuje da postoji statistički značajna povezanost između pola i zadovoljstva putnika, χ²(1) = 16,352, p &lt; 0,001. Zbog toga odbacujemo nultu hipotezu o nezavisnosti ove dve promenljive.</w:t>
+      </w:r>
+    </w:p>
+    <w:p>
+      <w:pPr>
+        <w:pStyle w:val="BodyText"/>
+      </w:pPr>
+      <w:r>
+        <w:t xml:space="preserve">Međutim, statistička značajnost ne znači nužno da je razlika praktično velika. U grupi žena zadovoljni putnici čine 42,9%, dok kod muškaraca čine 44,0%, što predstavlja razliku od približno 1,1 procentnog poena. Zbog velikog broja opservacija i ovako mala razlika može biti statistički značajna.</w:t>
+      </w:r>
+    </w:p>
+    <w:p>
+      <w:pPr>
+        <w:pStyle w:val="BodyText"/>
+      </w:pPr>
+      <w:r>
+        <w:t xml:space="preserve">Da bismo procenili jačinu povezanosti, izračunat je Cramerov koeficijent V.</w:t>
+      </w:r>
+    </w:p>
+    <w:p>
+      <w:pPr>
+        <w:pStyle w:val="SourceCode"/>
+      </w:pPr>
+      <w:r>
+        <w:rPr>
+          <w:rStyle w:val="NormalTok"/>
+        </w:rPr>
+        <w:t xml:space="preserve">n </w:t>
+      </w:r>
+      <w:r>
+        <w:rPr>
+          <w:rStyle w:val="OtherTok"/>
+        </w:rPr>
+        <w:t xml:space="preserve">&lt;-</w:t>
+      </w:r>
+      <w:r>
+        <w:rPr>
+          <w:rStyle w:val="NormalTok"/>
+        </w:rPr>
+        <w:t xml:space="preserve"> </w:t>
+      </w:r>
+      <w:r>
+        <w:rPr>
+          <w:rStyle w:val="FunctionTok"/>
+        </w:rPr>
+        <w:t xml:space="preserve">sum</w:t>
+      </w:r>
+      <w:r>
+        <w:rPr>
+          <w:rStyle w:val="NormalTok"/>
+        </w:rPr>
+        <w:t xml:space="preserve">(gender_satisfaction_table)</w:t>
+      </w:r>
+      <w:r>
+        <w:br/>
+      </w:r>
+      <w:r>
+        <w:rPr>
+          <w:rStyle w:val="NormalTok"/>
+        </w:rPr>
+        <w:t xml:space="preserve">chi_square </w:t>
+      </w:r>
+      <w:r>
+        <w:rPr>
+          <w:rStyle w:val="OtherTok"/>
+        </w:rPr>
+        <w:t xml:space="preserve">&lt;-</w:t>
+      </w:r>
+      <w:r>
+        <w:rPr>
+          <w:rStyle w:val="NormalTok"/>
+        </w:rPr>
+        <w:t xml:space="preserve"> </w:t>
+      </w:r>
+      <w:r>
+        <w:rPr>
+          <w:rStyle w:val="FunctionTok"/>
+        </w:rPr>
+        <w:t xml:space="preserve">as.numeric</w:t>
+      </w:r>
+      <w:r>
+        <w:rPr>
+          <w:rStyle w:val="NormalTok"/>
+        </w:rPr>
+        <w:t xml:space="preserve">(gender_chisq</w:t>
+      </w:r>
+      <w:r>
+        <w:rPr>
+          <w:rStyle w:val="SpecialCharTok"/>
+        </w:rPr>
+        <w:t xml:space="preserve">$</w:t>
+      </w:r>
+      <w:r>
+        <w:rPr>
+          <w:rStyle w:val="NormalTok"/>
+        </w:rPr>
+        <w:t xml:space="preserve">statistic)</w:t>
+      </w:r>
+      <w:r>
+        <w:br/>
+      </w:r>
+      <w:r>
+        <w:br/>
+      </w:r>
+      <w:r>
+        <w:rPr>
+          <w:rStyle w:val="NormalTok"/>
+        </w:rPr>
+        <w:t xml:space="preserve">cramers_v </w:t>
+      </w:r>
+      <w:r>
+        <w:rPr>
+          <w:rStyle w:val="OtherTok"/>
+        </w:rPr>
+        <w:t xml:space="preserve">&lt;-</w:t>
+      </w:r>
+      <w:r>
+        <w:rPr>
+          <w:rStyle w:val="NormalTok"/>
+        </w:rPr>
+        <w:t xml:space="preserve"> </w:t>
+      </w:r>
+      <w:r>
+        <w:rPr>
+          <w:rStyle w:val="FunctionTok"/>
+        </w:rPr>
+        <w:t xml:space="preserve">sqrt</w:t>
+      </w:r>
+      <w:r>
+        <w:rPr>
+          <w:rStyle w:val="NormalTok"/>
+        </w:rPr>
+        <w:t xml:space="preserve">(chi_square </w:t>
+      </w:r>
+      <w:r>
+        <w:rPr>
+          <w:rStyle w:val="SpecialCharTok"/>
+        </w:rPr>
+        <w:t xml:space="preserve">/</w:t>
+      </w:r>
+      <w:r>
+        <w:rPr>
+          <w:rStyle w:val="NormalTok"/>
+        </w:rPr>
+        <w:t xml:space="preserve"> n)</w:t>
+      </w:r>
+      <w:r>
+        <w:br/>
+      </w:r>
+      <w:r>
+        <w:br/>
+      </w:r>
+      <w:r>
+        <w:rPr>
+          <w:rStyle w:val="NormalTok"/>
+        </w:rPr>
+        <w:t xml:space="preserve">cramers_v</w:t>
+      </w:r>
+    </w:p>
+    <w:p>
+      <w:pPr>
+        <w:pStyle w:val="SourceCode"/>
+      </w:pPr>
+      <w:r>
+        <w:rPr>
+          <w:rStyle w:val="VerbatimChar"/>
+        </w:rPr>
+        <w:t xml:space="preserve">## [1] 0.01122058</w:t>
+      </w:r>
+    </w:p>
+    <w:p>
+      <w:pPr>
+        <w:pStyle w:val="FirstParagraph"/>
+      </w:pPr>
+      <w:r>
+        <w:t xml:space="preserve">Dobijena vrednost Cramerovog V iznosi približno 0,011, što ukazuje na veoma slabu povezanost između pola i zadovoljstva putnika. Prema tome, iako je povezanost statistički značajna, njena praktična važnost je veoma mala. Na osnovu ove analize ne može se zaključiti da pol značajno određuje zadovoljstvo putnika, već samo da u posmatranom skupu postoji vrlo mala razlika između dve polne grupe.</w:t>
+      </w:r>
+    </w:p>
+    <w:bookmarkEnd w:id="74"/>
+    <w:bookmarkEnd w:id="75"/>
+    <w:bookmarkStart w:id="76" w:name="X1203714cc99f79146cd0d42ff12c9c190835c1d"/>
+    <w:p>
+      <w:pPr>
+        <w:pStyle w:val="Heading3"/>
+      </w:pPr>
+      <w:r>
+        <w:t xml:space="preserve">Odnos tipa korisnika i zadovoljstva putnika (Customer_Type)</w:t>
+      </w:r>
+    </w:p>
+    <w:bookmarkEnd w:id="76"/>
+    <w:bookmarkEnd w:id="77"/>
+    <w:bookmarkEnd w:id="78"/>
     <w:sectPr>
       <w:pgSz w:h="15840" w:w="12240"/>
       <w:pgMar w:bottom="1440" w:footer="720" w:gutter="0" w:header="720" w:left="1440" w:right="1440" w:top="1440"/>

</xml_diff>

<commit_message>
nastavak bivarijantne-customer_type i type_of_travel
</commit_message>
<xml_diff>
--- a/reports/airline_satisfaction.docx
+++ b/reports/airline_satisfaction.docx
@@ -4621,7 +4621,7 @@
     </w:p>
     <w:bookmarkEnd w:id="30"/>
     <w:bookmarkEnd w:id="31"/>
-    <w:bookmarkStart w:id="78" w:name="eksplorativna-analiza-podataka-eda"/>
+    <w:bookmarkStart w:id="85" w:name="eksplorativna-analiza-podataka-eda"/>
     <w:p>
       <w:pPr>
         <w:pStyle w:val="Heading1"/>
@@ -12899,7 +12899,7 @@
     </w:p>
     <w:bookmarkEnd w:id="69"/>
     <w:bookmarkEnd w:id="70"/>
-    <w:bookmarkStart w:id="77" w:name="bivarijantna-analiza"/>
+    <w:bookmarkStart w:id="84" w:name="bivarijantna-analiza"/>
     <w:p>
       <w:pPr>
         <w:pStyle w:val="Heading2"/>
@@ -14357,18 +14357,2914 @@
     </w:p>
     <w:bookmarkEnd w:id="74"/>
     <w:bookmarkEnd w:id="75"/>
-    <w:bookmarkStart w:id="76" w:name="X1203714cc99f79146cd0d42ff12c9c190835c1d"/>
+    <w:bookmarkStart w:id="79" w:name="X1203714cc99f79146cd0d42ff12c9c190835c1d"/>
     <w:p>
       <w:pPr>
         <w:pStyle w:val="Heading3"/>
       </w:pPr>
       <w:r>
-        <w:t xml:space="preserve">Odnos tipa korisnika i zadovoljstva putnika (Customer_Type)</w:t>
-      </w:r>
-    </w:p>
-    <w:bookmarkEnd w:id="76"/>
-    <w:bookmarkEnd w:id="77"/>
-    <w:bookmarkEnd w:id="78"/>
+        <w:t xml:space="preserve">Odnos tipa korisnika i zadovoljstva putnika (</w:t>
+      </w:r>
+      <w:r>
+        <w:rPr>
+          <w:rStyle w:val="VerbatimChar"/>
+        </w:rPr>
+        <w:t xml:space="preserve">Customer_Type</w:t>
+      </w:r>
+      <w:r>
+        <w:t xml:space="preserve">)</w:t>
+      </w:r>
+    </w:p>
+    <w:p>
+      <w:pPr>
+        <w:pStyle w:val="FirstParagraph"/>
+      </w:pPr>
+      <w:r>
+        <w:t xml:space="preserve">U nastavku ćemo ispitati da li se zadovoljstvo putnika razlikuje između lojalnih i dislojalnih korisnika. U univarijantnoj analizi uočeno je da su lojalni korisnici znatno zastupljeniji u odnosu na dislojalne korisnike. Zbog toga ćemo u ovoj analizi koristiti relativne frekvencije, odnosno procenat zadovoljnih i nezadovoljnih putnika unutar svake kategorije korisnika.</w:t>
+      </w:r>
+    </w:p>
+    <w:p>
+      <w:pPr>
+        <w:pStyle w:val="BodyText"/>
+      </w:pPr>
+      <w:r>
+        <w:t xml:space="preserve">Na ovaj način možemo da proverimo da li se raspodela zadovoljstva razlikuje između ove dve grupe, nezavisno od njihovog ukupnog broja u skupu podataka.</w:t>
+      </w:r>
+    </w:p>
+    <w:p>
+      <w:pPr>
+        <w:pStyle w:val="SourceCode"/>
+      </w:pPr>
+      <w:r>
+        <w:rPr>
+          <w:rStyle w:val="NormalTok"/>
+        </w:rPr>
+        <w:t xml:space="preserve">customer_satisfaction </w:t>
+      </w:r>
+      <w:r>
+        <w:rPr>
+          <w:rStyle w:val="OtherTok"/>
+        </w:rPr>
+        <w:t xml:space="preserve">&lt;-</w:t>
+      </w:r>
+      <w:r>
+        <w:rPr>
+          <w:rStyle w:val="NormalTok"/>
+        </w:rPr>
+        <w:t xml:space="preserve"> data </w:t>
+      </w:r>
+      <w:r>
+        <w:rPr>
+          <w:rStyle w:val="SpecialCharTok"/>
+        </w:rPr>
+        <w:t xml:space="preserve">%&gt;%</w:t>
+      </w:r>
+      <w:r>
+        <w:br/>
+      </w:r>
+      <w:r>
+        <w:rPr>
+          <w:rStyle w:val="NormalTok"/>
+        </w:rPr>
+        <w:t xml:space="preserve">  </w:t>
+      </w:r>
+      <w:r>
+        <w:rPr>
+          <w:rStyle w:val="FunctionTok"/>
+        </w:rPr>
+        <w:t xml:space="preserve">count</w:t>
+      </w:r>
+      <w:r>
+        <w:rPr>
+          <w:rStyle w:val="NormalTok"/>
+        </w:rPr>
+        <w:t xml:space="preserve">(Customer_Type, Satisfaction, </w:t>
+      </w:r>
+      <w:r>
+        <w:rPr>
+          <w:rStyle w:val="AttributeTok"/>
+        </w:rPr>
+        <w:t xml:space="preserve">name =</w:t>
+      </w:r>
+      <w:r>
+        <w:rPr>
+          <w:rStyle w:val="NormalTok"/>
+        </w:rPr>
+        <w:t xml:space="preserve"> </w:t>
+      </w:r>
+      <w:r>
+        <w:rPr>
+          <w:rStyle w:val="StringTok"/>
+        </w:rPr>
+        <w:t xml:space="preserve">"Broj"</w:t>
+      </w:r>
+      <w:r>
+        <w:rPr>
+          <w:rStyle w:val="NormalTok"/>
+        </w:rPr>
+        <w:t xml:space="preserve">) </w:t>
+      </w:r>
+      <w:r>
+        <w:rPr>
+          <w:rStyle w:val="SpecialCharTok"/>
+        </w:rPr>
+        <w:t xml:space="preserve">%&gt;%</w:t>
+      </w:r>
+      <w:r>
+        <w:br/>
+      </w:r>
+      <w:r>
+        <w:rPr>
+          <w:rStyle w:val="NormalTok"/>
+        </w:rPr>
+        <w:t xml:space="preserve">  </w:t>
+      </w:r>
+      <w:r>
+        <w:rPr>
+          <w:rStyle w:val="FunctionTok"/>
+        </w:rPr>
+        <w:t xml:space="preserve">group_by</w:t>
+      </w:r>
+      <w:r>
+        <w:rPr>
+          <w:rStyle w:val="NormalTok"/>
+        </w:rPr>
+        <w:t xml:space="preserve">(Customer_Type) </w:t>
+      </w:r>
+      <w:r>
+        <w:rPr>
+          <w:rStyle w:val="SpecialCharTok"/>
+        </w:rPr>
+        <w:t xml:space="preserve">%&gt;%</w:t>
+      </w:r>
+      <w:r>
+        <w:br/>
+      </w:r>
+      <w:r>
+        <w:rPr>
+          <w:rStyle w:val="NormalTok"/>
+        </w:rPr>
+        <w:t xml:space="preserve">  </w:t>
+      </w:r>
+      <w:r>
+        <w:rPr>
+          <w:rStyle w:val="FunctionTok"/>
+        </w:rPr>
+        <w:t xml:space="preserve">mutate</w:t>
+      </w:r>
+      <w:r>
+        <w:rPr>
+          <w:rStyle w:val="NormalTok"/>
+        </w:rPr>
+        <w:t xml:space="preserve">(</w:t>
+      </w:r>
+      <w:r>
+        <w:rPr>
+          <w:rStyle w:val="AttributeTok"/>
+        </w:rPr>
+        <w:t xml:space="preserve">Procenat =</w:t>
+      </w:r>
+      <w:r>
+        <w:rPr>
+          <w:rStyle w:val="NormalTok"/>
+        </w:rPr>
+        <w:t xml:space="preserve"> </w:t>
+      </w:r>
+      <w:r>
+        <w:rPr>
+          <w:rStyle w:val="FunctionTok"/>
+        </w:rPr>
+        <w:t xml:space="preserve">round</w:t>
+      </w:r>
+      <w:r>
+        <w:rPr>
+          <w:rStyle w:val="NormalTok"/>
+        </w:rPr>
+        <w:t xml:space="preserve">(Broj </w:t>
+      </w:r>
+      <w:r>
+        <w:rPr>
+          <w:rStyle w:val="SpecialCharTok"/>
+        </w:rPr>
+        <w:t xml:space="preserve">/</w:t>
+      </w:r>
+      <w:r>
+        <w:rPr>
+          <w:rStyle w:val="NormalTok"/>
+        </w:rPr>
+        <w:t xml:space="preserve"> </w:t>
+      </w:r>
+      <w:r>
+        <w:rPr>
+          <w:rStyle w:val="FunctionTok"/>
+        </w:rPr>
+        <w:t xml:space="preserve">sum</w:t>
+      </w:r>
+      <w:r>
+        <w:rPr>
+          <w:rStyle w:val="NormalTok"/>
+        </w:rPr>
+        <w:t xml:space="preserve">(Broj) </w:t>
+      </w:r>
+      <w:r>
+        <w:rPr>
+          <w:rStyle w:val="SpecialCharTok"/>
+        </w:rPr>
+        <w:t xml:space="preserve">*</w:t>
+      </w:r>
+      <w:r>
+        <w:rPr>
+          <w:rStyle w:val="NormalTok"/>
+        </w:rPr>
+        <w:t xml:space="preserve"> </w:t>
+      </w:r>
+      <w:r>
+        <w:rPr>
+          <w:rStyle w:val="DecValTok"/>
+        </w:rPr>
+        <w:t xml:space="preserve">100</w:t>
+      </w:r>
+      <w:r>
+        <w:rPr>
+          <w:rStyle w:val="NormalTok"/>
+        </w:rPr>
+        <w:t xml:space="preserve">, </w:t>
+      </w:r>
+      <w:r>
+        <w:rPr>
+          <w:rStyle w:val="DecValTok"/>
+        </w:rPr>
+        <w:t xml:space="preserve">2</w:t>
+      </w:r>
+      <w:r>
+        <w:rPr>
+          <w:rStyle w:val="NormalTok"/>
+        </w:rPr>
+        <w:t xml:space="preserve">)) </w:t>
+      </w:r>
+      <w:r>
+        <w:rPr>
+          <w:rStyle w:val="SpecialCharTok"/>
+        </w:rPr>
+        <w:t xml:space="preserve">%&gt;%</w:t>
+      </w:r>
+      <w:r>
+        <w:br/>
+      </w:r>
+      <w:r>
+        <w:rPr>
+          <w:rStyle w:val="NormalTok"/>
+        </w:rPr>
+        <w:t xml:space="preserve">  </w:t>
+      </w:r>
+      <w:r>
+        <w:rPr>
+          <w:rStyle w:val="FunctionTok"/>
+        </w:rPr>
+        <w:t xml:space="preserve">ungroup</w:t>
+      </w:r>
+      <w:r>
+        <w:rPr>
+          <w:rStyle w:val="NormalTok"/>
+        </w:rPr>
+        <w:t xml:space="preserve">()</w:t>
+      </w:r>
+      <w:r>
+        <w:br/>
+      </w:r>
+      <w:r>
+        <w:br/>
+      </w:r>
+      <w:r>
+        <w:rPr>
+          <w:rStyle w:val="NormalTok"/>
+        </w:rPr>
+        <w:t xml:space="preserve">customer_satisfaction</w:t>
+      </w:r>
+    </w:p>
+    <w:p>
+      <w:pPr>
+        <w:pStyle w:val="SourceCode"/>
+      </w:pPr>
+      <w:r>
+        <w:rPr>
+          <w:rStyle w:val="VerbatimChar"/>
+        </w:rPr>
+        <w:t xml:space="preserve">## # A tibble: 4 × 4</w:t>
+      </w:r>
+      <w:r>
+        <w:br/>
+      </w:r>
+      <w:r>
+        <w:rPr>
+          <w:rStyle w:val="VerbatimChar"/>
+        </w:rPr>
+        <w:t xml:space="preserve">##   Customer_Type     Satisfaction   Broj Procenat</w:t>
+      </w:r>
+      <w:r>
+        <w:br/>
+      </w:r>
+      <w:r>
+        <w:rPr>
+          <w:rStyle w:val="VerbatimChar"/>
+        </w:rPr>
+        <w:t xml:space="preserve">##   &lt;fct&gt;             &lt;fct&gt;         &lt;int&gt;    &lt;dbl&gt;</w:t>
+      </w:r>
+      <w:r>
+        <w:br/>
+      </w:r>
+      <w:r>
+        <w:rPr>
+          <w:rStyle w:val="VerbatimChar"/>
+        </w:rPr>
+        <w:t xml:space="preserve">## 1 Disloyal Customer Satisfied      5700     24.0</w:t>
+      </w:r>
+      <w:r>
+        <w:br/>
+      </w:r>
+      <w:r>
+        <w:rPr>
+          <w:rStyle w:val="VerbatimChar"/>
+        </w:rPr>
+        <w:t xml:space="preserve">## 2 Disloyal Customer Not Satisfied 18080     76.0</w:t>
+      </w:r>
+      <w:r>
+        <w:br/>
+      </w:r>
+      <w:r>
+        <w:rPr>
+          <w:rStyle w:val="VerbatimChar"/>
+        </w:rPr>
+        <w:t xml:space="preserve">## 3 Loyal Customer    Satisfied     50728     47.8</w:t>
+      </w:r>
+      <w:r>
+        <w:br/>
+      </w:r>
+      <w:r>
+        <w:rPr>
+          <w:rStyle w:val="VerbatimChar"/>
+        </w:rPr>
+        <w:t xml:space="preserve">## 4 Loyal Customer    Not Satisfied 55372     52.2</w:t>
+      </w:r>
+    </w:p>
+    <w:p>
+      <w:pPr>
+        <w:pStyle w:val="FirstParagraph"/>
+      </w:pPr>
+      <w:r>
+        <w:t xml:space="preserve">Da bismo vizuelno uporedili zadovoljstvo između lojalnih i dislojalnih korisnika, prikazaćemo proporcionalni stubičasti dijagram.</w:t>
+      </w:r>
+    </w:p>
+    <w:p>
+      <w:pPr>
+        <w:pStyle w:val="SourceCode"/>
+      </w:pPr>
+      <w:r>
+        <w:rPr>
+          <w:rStyle w:val="FunctionTok"/>
+        </w:rPr>
+        <w:t xml:space="preserve">ggplot</w:t>
+      </w:r>
+      <w:r>
+        <w:rPr>
+          <w:rStyle w:val="NormalTok"/>
+        </w:rPr>
+        <w:t xml:space="preserve">(data, </w:t>
+      </w:r>
+      <w:r>
+        <w:rPr>
+          <w:rStyle w:val="FunctionTok"/>
+        </w:rPr>
+        <w:t xml:space="preserve">aes</w:t>
+      </w:r>
+      <w:r>
+        <w:rPr>
+          <w:rStyle w:val="NormalTok"/>
+        </w:rPr>
+        <w:t xml:space="preserve">(</w:t>
+      </w:r>
+      <w:r>
+        <w:rPr>
+          <w:rStyle w:val="AttributeTok"/>
+        </w:rPr>
+        <w:t xml:space="preserve">x =</w:t>
+      </w:r>
+      <w:r>
+        <w:rPr>
+          <w:rStyle w:val="NormalTok"/>
+        </w:rPr>
+        <w:t xml:space="preserve"> Customer_Type, </w:t>
+      </w:r>
+      <w:r>
+        <w:rPr>
+          <w:rStyle w:val="AttributeTok"/>
+        </w:rPr>
+        <w:t xml:space="preserve">fill =</w:t>
+      </w:r>
+      <w:r>
+        <w:rPr>
+          <w:rStyle w:val="NormalTok"/>
+        </w:rPr>
+        <w:t xml:space="preserve"> Satisfaction)) </w:t>
+      </w:r>
+      <w:r>
+        <w:rPr>
+          <w:rStyle w:val="SpecialCharTok"/>
+        </w:rPr>
+        <w:t xml:space="preserve">+</w:t>
+      </w:r>
+      <w:r>
+        <w:br/>
+      </w:r>
+      <w:r>
+        <w:rPr>
+          <w:rStyle w:val="NormalTok"/>
+        </w:rPr>
+        <w:t xml:space="preserve">  </w:t>
+      </w:r>
+      <w:r>
+        <w:rPr>
+          <w:rStyle w:val="FunctionTok"/>
+        </w:rPr>
+        <w:t xml:space="preserve">geom_bar</w:t>
+      </w:r>
+      <w:r>
+        <w:rPr>
+          <w:rStyle w:val="NormalTok"/>
+        </w:rPr>
+        <w:t xml:space="preserve">(</w:t>
+      </w:r>
+      <w:r>
+        <w:rPr>
+          <w:rStyle w:val="AttributeTok"/>
+        </w:rPr>
+        <w:t xml:space="preserve">position =</w:t>
+      </w:r>
+      <w:r>
+        <w:rPr>
+          <w:rStyle w:val="NormalTok"/>
+        </w:rPr>
+        <w:t xml:space="preserve"> </w:t>
+      </w:r>
+      <w:r>
+        <w:rPr>
+          <w:rStyle w:val="StringTok"/>
+        </w:rPr>
+        <w:t xml:space="preserve">"fill"</w:t>
+      </w:r>
+      <w:r>
+        <w:rPr>
+          <w:rStyle w:val="NormalTok"/>
+        </w:rPr>
+        <w:t xml:space="preserve">) </w:t>
+      </w:r>
+      <w:r>
+        <w:rPr>
+          <w:rStyle w:val="SpecialCharTok"/>
+        </w:rPr>
+        <w:t xml:space="preserve">+</w:t>
+      </w:r>
+      <w:r>
+        <w:br/>
+      </w:r>
+      <w:r>
+        <w:rPr>
+          <w:rStyle w:val="NormalTok"/>
+        </w:rPr>
+        <w:t xml:space="preserve">  </w:t>
+      </w:r>
+      <w:r>
+        <w:rPr>
+          <w:rStyle w:val="FunctionTok"/>
+        </w:rPr>
+        <w:t xml:space="preserve">scale_y_continuous</w:t>
+      </w:r>
+      <w:r>
+        <w:rPr>
+          <w:rStyle w:val="NormalTok"/>
+        </w:rPr>
+        <w:t xml:space="preserve">(</w:t>
+      </w:r>
+      <w:r>
+        <w:br/>
+      </w:r>
+      <w:r>
+        <w:rPr>
+          <w:rStyle w:val="NormalTok"/>
+        </w:rPr>
+        <w:t xml:space="preserve">    </w:t>
+      </w:r>
+      <w:r>
+        <w:rPr>
+          <w:rStyle w:val="AttributeTok"/>
+        </w:rPr>
+        <w:t xml:space="preserve">labels =</w:t>
+      </w:r>
+      <w:r>
+        <w:rPr>
+          <w:rStyle w:val="NormalTok"/>
+        </w:rPr>
+        <w:t xml:space="preserve"> scales</w:t>
+      </w:r>
+      <w:r>
+        <w:rPr>
+          <w:rStyle w:val="SpecialCharTok"/>
+        </w:rPr>
+        <w:t xml:space="preserve">::</w:t>
+      </w:r>
+      <w:r>
+        <w:rPr>
+          <w:rStyle w:val="FunctionTok"/>
+        </w:rPr>
+        <w:t xml:space="preserve">percent_format</w:t>
+      </w:r>
+      <w:r>
+        <w:rPr>
+          <w:rStyle w:val="NormalTok"/>
+        </w:rPr>
+        <w:t xml:space="preserve">()</w:t>
+      </w:r>
+      <w:r>
+        <w:br/>
+      </w:r>
+      <w:r>
+        <w:rPr>
+          <w:rStyle w:val="NormalTok"/>
+        </w:rPr>
+        <w:t xml:space="preserve">  ) </w:t>
+      </w:r>
+      <w:r>
+        <w:rPr>
+          <w:rStyle w:val="SpecialCharTok"/>
+        </w:rPr>
+        <w:t xml:space="preserve">+</w:t>
+      </w:r>
+      <w:r>
+        <w:br/>
+      </w:r>
+      <w:r>
+        <w:rPr>
+          <w:rStyle w:val="NormalTok"/>
+        </w:rPr>
+        <w:t xml:space="preserve">  </w:t>
+      </w:r>
+      <w:r>
+        <w:rPr>
+          <w:rStyle w:val="FunctionTok"/>
+        </w:rPr>
+        <w:t xml:space="preserve">scale_fill_manual</w:t>
+      </w:r>
+      <w:r>
+        <w:rPr>
+          <w:rStyle w:val="NormalTok"/>
+        </w:rPr>
+        <w:t xml:space="preserve">(</w:t>
+      </w:r>
+      <w:r>
+        <w:br/>
+      </w:r>
+      <w:r>
+        <w:rPr>
+          <w:rStyle w:val="NormalTok"/>
+        </w:rPr>
+        <w:t xml:space="preserve">    </w:t>
+      </w:r>
+      <w:r>
+        <w:rPr>
+          <w:rStyle w:val="AttributeTok"/>
+        </w:rPr>
+        <w:t xml:space="preserve">values =</w:t>
+      </w:r>
+      <w:r>
+        <w:rPr>
+          <w:rStyle w:val="NormalTok"/>
+        </w:rPr>
+        <w:t xml:space="preserve"> </w:t>
+      </w:r>
+      <w:r>
+        <w:rPr>
+          <w:rStyle w:val="FunctionTok"/>
+        </w:rPr>
+        <w:t xml:space="preserve">c</w:t>
+      </w:r>
+      <w:r>
+        <w:rPr>
+          <w:rStyle w:val="NormalTok"/>
+        </w:rPr>
+        <w:t xml:space="preserve">(</w:t>
+      </w:r>
+      <w:r>
+        <w:br/>
+      </w:r>
+      <w:r>
+        <w:rPr>
+          <w:rStyle w:val="NormalTok"/>
+        </w:rPr>
+        <w:t xml:space="preserve">      </w:t>
+      </w:r>
+      <w:r>
+        <w:rPr>
+          <w:rStyle w:val="StringTok"/>
+        </w:rPr>
+        <w:t xml:space="preserve">"Satisfied"</w:t>
+      </w:r>
+      <w:r>
+        <w:rPr>
+          <w:rStyle w:val="NormalTok"/>
+        </w:rPr>
+        <w:t xml:space="preserve"> </w:t>
+      </w:r>
+      <w:r>
+        <w:rPr>
+          <w:rStyle w:val="OtherTok"/>
+        </w:rPr>
+        <w:t xml:space="preserve">=</w:t>
+      </w:r>
+      <w:r>
+        <w:rPr>
+          <w:rStyle w:val="NormalTok"/>
+        </w:rPr>
+        <w:t xml:space="preserve"> </w:t>
+      </w:r>
+      <w:r>
+        <w:rPr>
+          <w:rStyle w:val="StringTok"/>
+        </w:rPr>
+        <w:t xml:space="preserve">"#2ecc71"</w:t>
+      </w:r>
+      <w:r>
+        <w:rPr>
+          <w:rStyle w:val="NormalTok"/>
+        </w:rPr>
+        <w:t xml:space="preserve">,</w:t>
+      </w:r>
+      <w:r>
+        <w:br/>
+      </w:r>
+      <w:r>
+        <w:rPr>
+          <w:rStyle w:val="NormalTok"/>
+        </w:rPr>
+        <w:t xml:space="preserve">      </w:t>
+      </w:r>
+      <w:r>
+        <w:rPr>
+          <w:rStyle w:val="StringTok"/>
+        </w:rPr>
+        <w:t xml:space="preserve">"Not Satisfied"</w:t>
+      </w:r>
+      <w:r>
+        <w:rPr>
+          <w:rStyle w:val="NormalTok"/>
+        </w:rPr>
+        <w:t xml:space="preserve"> </w:t>
+      </w:r>
+      <w:r>
+        <w:rPr>
+          <w:rStyle w:val="OtherTok"/>
+        </w:rPr>
+        <w:t xml:space="preserve">=</w:t>
+      </w:r>
+      <w:r>
+        <w:rPr>
+          <w:rStyle w:val="NormalTok"/>
+        </w:rPr>
+        <w:t xml:space="preserve"> </w:t>
+      </w:r>
+      <w:r>
+        <w:rPr>
+          <w:rStyle w:val="StringTok"/>
+        </w:rPr>
+        <w:t xml:space="preserve">"#e74c3c"</w:t>
+      </w:r>
+      <w:r>
+        <w:br/>
+      </w:r>
+      <w:r>
+        <w:rPr>
+          <w:rStyle w:val="NormalTok"/>
+        </w:rPr>
+        <w:t xml:space="preserve">    )</w:t>
+      </w:r>
+      <w:r>
+        <w:br/>
+      </w:r>
+      <w:r>
+        <w:rPr>
+          <w:rStyle w:val="NormalTok"/>
+        </w:rPr>
+        <w:t xml:space="preserve">  ) </w:t>
+      </w:r>
+      <w:r>
+        <w:rPr>
+          <w:rStyle w:val="SpecialCharTok"/>
+        </w:rPr>
+        <w:t xml:space="preserve">+</w:t>
+      </w:r>
+      <w:r>
+        <w:br/>
+      </w:r>
+      <w:r>
+        <w:rPr>
+          <w:rStyle w:val="NormalTok"/>
+        </w:rPr>
+        <w:t xml:space="preserve">  </w:t>
+      </w:r>
+      <w:r>
+        <w:rPr>
+          <w:rStyle w:val="FunctionTok"/>
+        </w:rPr>
+        <w:t xml:space="preserve">theme_minimal</w:t>
+      </w:r>
+      <w:r>
+        <w:rPr>
+          <w:rStyle w:val="NormalTok"/>
+        </w:rPr>
+        <w:t xml:space="preserve">() </w:t>
+      </w:r>
+      <w:r>
+        <w:rPr>
+          <w:rStyle w:val="SpecialCharTok"/>
+        </w:rPr>
+        <w:t xml:space="preserve">+</w:t>
+      </w:r>
+      <w:r>
+        <w:br/>
+      </w:r>
+      <w:r>
+        <w:rPr>
+          <w:rStyle w:val="NormalTok"/>
+        </w:rPr>
+        <w:t xml:space="preserve">  </w:t>
+      </w:r>
+      <w:r>
+        <w:rPr>
+          <w:rStyle w:val="FunctionTok"/>
+        </w:rPr>
+        <w:t xml:space="preserve">labs</w:t>
+      </w:r>
+      <w:r>
+        <w:rPr>
+          <w:rStyle w:val="NormalTok"/>
+        </w:rPr>
+        <w:t xml:space="preserve">(</w:t>
+      </w:r>
+      <w:r>
+        <w:br/>
+      </w:r>
+      <w:r>
+        <w:rPr>
+          <w:rStyle w:val="NormalTok"/>
+        </w:rPr>
+        <w:t xml:space="preserve">    </w:t>
+      </w:r>
+      <w:r>
+        <w:rPr>
+          <w:rStyle w:val="AttributeTok"/>
+        </w:rPr>
+        <w:t xml:space="preserve">title =</w:t>
+      </w:r>
+      <w:r>
+        <w:rPr>
+          <w:rStyle w:val="NormalTok"/>
+        </w:rPr>
+        <w:t xml:space="preserve"> </w:t>
+      </w:r>
+      <w:r>
+        <w:rPr>
+          <w:rStyle w:val="StringTok"/>
+        </w:rPr>
+        <w:t xml:space="preserve">"Zadovoljstvo putnika prema tipu korisnika"</w:t>
+      </w:r>
+      <w:r>
+        <w:rPr>
+          <w:rStyle w:val="NormalTok"/>
+        </w:rPr>
+        <w:t xml:space="preserve">,</w:t>
+      </w:r>
+      <w:r>
+        <w:br/>
+      </w:r>
+      <w:r>
+        <w:rPr>
+          <w:rStyle w:val="NormalTok"/>
+        </w:rPr>
+        <w:t xml:space="preserve">    </w:t>
+      </w:r>
+      <w:r>
+        <w:rPr>
+          <w:rStyle w:val="AttributeTok"/>
+        </w:rPr>
+        <w:t xml:space="preserve">x =</w:t>
+      </w:r>
+      <w:r>
+        <w:rPr>
+          <w:rStyle w:val="NormalTok"/>
+        </w:rPr>
+        <w:t xml:space="preserve"> </w:t>
+      </w:r>
+      <w:r>
+        <w:rPr>
+          <w:rStyle w:val="StringTok"/>
+        </w:rPr>
+        <w:t xml:space="preserve">"Tip korisnika"</w:t>
+      </w:r>
+      <w:r>
+        <w:rPr>
+          <w:rStyle w:val="NormalTok"/>
+        </w:rPr>
+        <w:t xml:space="preserve">,</w:t>
+      </w:r>
+      <w:r>
+        <w:br/>
+      </w:r>
+      <w:r>
+        <w:rPr>
+          <w:rStyle w:val="NormalTok"/>
+        </w:rPr>
+        <w:t xml:space="preserve">    </w:t>
+      </w:r>
+      <w:r>
+        <w:rPr>
+          <w:rStyle w:val="AttributeTok"/>
+        </w:rPr>
+        <w:t xml:space="preserve">y =</w:t>
+      </w:r>
+      <w:r>
+        <w:rPr>
+          <w:rStyle w:val="NormalTok"/>
+        </w:rPr>
+        <w:t xml:space="preserve"> </w:t>
+      </w:r>
+      <w:r>
+        <w:rPr>
+          <w:rStyle w:val="StringTok"/>
+        </w:rPr>
+        <w:t xml:space="preserve">"Procenat putnika"</w:t>
+      </w:r>
+      <w:r>
+        <w:rPr>
+          <w:rStyle w:val="NormalTok"/>
+        </w:rPr>
+        <w:t xml:space="preserve">,</w:t>
+      </w:r>
+      <w:r>
+        <w:br/>
+      </w:r>
+      <w:r>
+        <w:rPr>
+          <w:rStyle w:val="NormalTok"/>
+        </w:rPr>
+        <w:t xml:space="preserve">    </w:t>
+      </w:r>
+      <w:r>
+        <w:rPr>
+          <w:rStyle w:val="AttributeTok"/>
+        </w:rPr>
+        <w:t xml:space="preserve">fill =</w:t>
+      </w:r>
+      <w:r>
+        <w:rPr>
+          <w:rStyle w:val="NormalTok"/>
+        </w:rPr>
+        <w:t xml:space="preserve"> </w:t>
+      </w:r>
+      <w:r>
+        <w:rPr>
+          <w:rStyle w:val="StringTok"/>
+        </w:rPr>
+        <w:t xml:space="preserve">"Status zadovoljstva"</w:t>
+      </w:r>
+      <w:r>
+        <w:br/>
+      </w:r>
+      <w:r>
+        <w:rPr>
+          <w:rStyle w:val="NormalTok"/>
+        </w:rPr>
+        <w:t xml:space="preserve">  )</w:t>
+      </w:r>
+    </w:p>
+    <w:p>
+      <w:pPr>
+        <w:pStyle w:val="FirstParagraph"/>
+      </w:pPr>
+      <w:r>
+        <w:drawing>
+          <wp:inline>
+            <wp:extent cx="5943600" cy="3714750"/>
+            <wp:effectExtent b="0" l="0" r="0" t="0"/>
+            <wp:docPr descr="" title="" id="77" name="Picture"/>
+            <a:graphic>
+              <a:graphicData uri="http://schemas.openxmlformats.org/drawingml/2006/picture">
+                <pic:pic>
+                  <pic:nvPicPr>
+                    <pic:cNvPr descr="airline_satisfaction_files/figure-docx/unnamed-chunk-34-1.png" id="78" name="Picture"/>
+                    <pic:cNvPicPr>
+                      <a:picLocks noChangeArrowheads="1" noChangeAspect="1"/>
+                    </pic:cNvPicPr>
+                  </pic:nvPicPr>
+                  <pic:blipFill>
+                    <a:blip r:embed="rId76"/>
+                    <a:stretch>
+                      <a:fillRect/>
+                    </a:stretch>
+                  </pic:blipFill>
+                  <pic:spPr bwMode="auto">
+                    <a:xfrm>
+                      <a:off x="0" y="0"/>
+                      <a:ext cx="5943600" cy="3714750"/>
+                    </a:xfrm>
+                    <a:prstGeom prst="rect">
+                      <a:avLst/>
+                    </a:prstGeom>
+                    <a:noFill/>
+                    <a:ln w="9525">
+                      <a:noFill/>
+                      <a:headEnd/>
+                      <a:tailEnd/>
+                    </a:ln>
+                  </pic:spPr>
+                </pic:pic>
+              </a:graphicData>
+            </a:graphic>
+          </wp:inline>
+        </w:drawing>
+      </w:r>
+    </w:p>
+    <w:p>
+      <w:pPr>
+        <w:pStyle w:val="BodyText"/>
+      </w:pPr>
+      <w:r>
+        <w:t xml:space="preserve">Na osnovu tabele i proporcionalnog stubičastog dijagrama uočava se jasna razlika u raspodeli zadovoljstva između lojalnih i dislojalnih korisnika. Kod dislojalnih korisnika zadovoljni putnici čine 24,0%, dok nezadovoljni čine 76,0% ukupnog broja putnika u toj grupi. Kod lojalnih korisnika zadovoljni putnici čine 47,8%, a nezadovoljni 52,2%.</w:t>
+      </w:r>
+    </w:p>
+    <w:p>
+      <w:pPr>
+        <w:pStyle w:val="BodyText"/>
+      </w:pPr>
+      <w:r>
+        <w:t xml:space="preserve">Udeo zadovoljnih putnika kod lojalnih korisnika veći je za približno 23,8 procentnih poena u odnosu na dislojalne korisnike. Ova razlika ukazuje na moguću povezanost između tipa korisnika i zadovoljstva putnika, koju ćemo formalno proveriti hi-kvadrat testom nezavisnosti.</w:t>
+      </w:r>
+    </w:p>
+    <w:p>
+      <w:pPr>
+        <w:pStyle w:val="BodyText"/>
+      </w:pPr>
+      <w:r>
+        <w:t xml:space="preserve">Nulta hipoteza glasi da su tip korisnika i zadovoljstvo putnika nezavisne promenljive. Alternativna hipoteza glasi da između njih postoji povezanost.</w:t>
+      </w:r>
+    </w:p>
+    <w:p>
+      <w:pPr>
+        <w:pStyle w:val="SourceCode"/>
+      </w:pPr>
+      <w:r>
+        <w:rPr>
+          <w:rStyle w:val="NormalTok"/>
+        </w:rPr>
+        <w:t xml:space="preserve">customer_satisfaction_table </w:t>
+      </w:r>
+      <w:r>
+        <w:rPr>
+          <w:rStyle w:val="OtherTok"/>
+        </w:rPr>
+        <w:t xml:space="preserve">&lt;-</w:t>
+      </w:r>
+      <w:r>
+        <w:rPr>
+          <w:rStyle w:val="NormalTok"/>
+        </w:rPr>
+        <w:t xml:space="preserve"> </w:t>
+      </w:r>
+      <w:r>
+        <w:rPr>
+          <w:rStyle w:val="FunctionTok"/>
+        </w:rPr>
+        <w:t xml:space="preserve">table</w:t>
+      </w:r>
+      <w:r>
+        <w:rPr>
+          <w:rStyle w:val="NormalTok"/>
+        </w:rPr>
+        <w:t xml:space="preserve">(</w:t>
+      </w:r>
+      <w:r>
+        <w:br/>
+      </w:r>
+      <w:r>
+        <w:rPr>
+          <w:rStyle w:val="NormalTok"/>
+        </w:rPr>
+        <w:t xml:space="preserve">  data</w:t>
+      </w:r>
+      <w:r>
+        <w:rPr>
+          <w:rStyle w:val="SpecialCharTok"/>
+        </w:rPr>
+        <w:t xml:space="preserve">$</w:t>
+      </w:r>
+      <w:r>
+        <w:rPr>
+          <w:rStyle w:val="NormalTok"/>
+        </w:rPr>
+        <w:t xml:space="preserve">Customer_Type,</w:t>
+      </w:r>
+      <w:r>
+        <w:br/>
+      </w:r>
+      <w:r>
+        <w:rPr>
+          <w:rStyle w:val="NormalTok"/>
+        </w:rPr>
+        <w:t xml:space="preserve">  data</w:t>
+      </w:r>
+      <w:r>
+        <w:rPr>
+          <w:rStyle w:val="SpecialCharTok"/>
+        </w:rPr>
+        <w:t xml:space="preserve">$</w:t>
+      </w:r>
+      <w:r>
+        <w:rPr>
+          <w:rStyle w:val="NormalTok"/>
+        </w:rPr>
+        <w:t xml:space="preserve">Satisfaction</w:t>
+      </w:r>
+      <w:r>
+        <w:br/>
+      </w:r>
+      <w:r>
+        <w:rPr>
+          <w:rStyle w:val="NormalTok"/>
+        </w:rPr>
+        <w:t xml:space="preserve">)</w:t>
+      </w:r>
+      <w:r>
+        <w:br/>
+      </w:r>
+      <w:r>
+        <w:br/>
+      </w:r>
+      <w:r>
+        <w:rPr>
+          <w:rStyle w:val="NormalTok"/>
+        </w:rPr>
+        <w:t xml:space="preserve">customer_satisfaction_table</w:t>
+      </w:r>
+    </w:p>
+    <w:p>
+      <w:pPr>
+        <w:pStyle w:val="SourceCode"/>
+      </w:pPr>
+      <w:r>
+        <w:rPr>
+          <w:rStyle w:val="VerbatimChar"/>
+        </w:rPr>
+        <w:t xml:space="preserve">##                    </w:t>
+      </w:r>
+      <w:r>
+        <w:br/>
+      </w:r>
+      <w:r>
+        <w:rPr>
+          <w:rStyle w:val="VerbatimChar"/>
+        </w:rPr>
+        <w:t xml:space="preserve">##                     Satisfied Not Satisfied</w:t>
+      </w:r>
+      <w:r>
+        <w:br/>
+      </w:r>
+      <w:r>
+        <w:rPr>
+          <w:rStyle w:val="VerbatimChar"/>
+        </w:rPr>
+        <w:t xml:space="preserve">##   Disloyal Customer      5700         18080</w:t>
+      </w:r>
+      <w:r>
+        <w:br/>
+      </w:r>
+      <w:r>
+        <w:rPr>
+          <w:rStyle w:val="VerbatimChar"/>
+        </w:rPr>
+        <w:t xml:space="preserve">##   Loyal Customer        50728         55372</w:t>
+      </w:r>
+    </w:p>
+    <w:p>
+      <w:pPr>
+        <w:pStyle w:val="SourceCode"/>
+      </w:pPr>
+      <w:r>
+        <w:rPr>
+          <w:rStyle w:val="NormalTok"/>
+        </w:rPr>
+        <w:t xml:space="preserve">customer_chisq </w:t>
+      </w:r>
+      <w:r>
+        <w:rPr>
+          <w:rStyle w:val="OtherTok"/>
+        </w:rPr>
+        <w:t xml:space="preserve">&lt;-</w:t>
+      </w:r>
+      <w:r>
+        <w:rPr>
+          <w:rStyle w:val="NormalTok"/>
+        </w:rPr>
+        <w:t xml:space="preserve"> </w:t>
+      </w:r>
+      <w:r>
+        <w:rPr>
+          <w:rStyle w:val="FunctionTok"/>
+        </w:rPr>
+        <w:t xml:space="preserve">chisq.test</w:t>
+      </w:r>
+      <w:r>
+        <w:rPr>
+          <w:rStyle w:val="NormalTok"/>
+        </w:rPr>
+        <w:t xml:space="preserve">(</w:t>
+      </w:r>
+      <w:r>
+        <w:br/>
+      </w:r>
+      <w:r>
+        <w:rPr>
+          <w:rStyle w:val="NormalTok"/>
+        </w:rPr>
+        <w:t xml:space="preserve">  customer_satisfaction_table,</w:t>
+      </w:r>
+      <w:r>
+        <w:br/>
+      </w:r>
+      <w:r>
+        <w:rPr>
+          <w:rStyle w:val="NormalTok"/>
+        </w:rPr>
+        <w:t xml:space="preserve">  </w:t>
+      </w:r>
+      <w:r>
+        <w:rPr>
+          <w:rStyle w:val="AttributeTok"/>
+        </w:rPr>
+        <w:t xml:space="preserve">correct =</w:t>
+      </w:r>
+      <w:r>
+        <w:rPr>
+          <w:rStyle w:val="NormalTok"/>
+        </w:rPr>
+        <w:t xml:space="preserve"> </w:t>
+      </w:r>
+      <w:r>
+        <w:rPr>
+          <w:rStyle w:val="ConstantTok"/>
+        </w:rPr>
+        <w:t xml:space="preserve">FALSE</w:t>
+      </w:r>
+      <w:r>
+        <w:br/>
+      </w:r>
+      <w:r>
+        <w:rPr>
+          <w:rStyle w:val="NormalTok"/>
+        </w:rPr>
+        <w:t xml:space="preserve">)</w:t>
+      </w:r>
+      <w:r>
+        <w:br/>
+      </w:r>
+      <w:r>
+        <w:br/>
+      </w:r>
+      <w:r>
+        <w:rPr>
+          <w:rStyle w:val="NormalTok"/>
+        </w:rPr>
+        <w:t xml:space="preserve">customer_chisq</w:t>
+      </w:r>
+    </w:p>
+    <w:p>
+      <w:pPr>
+        <w:pStyle w:val="SourceCode"/>
+      </w:pPr>
+      <w:r>
+        <w:rPr>
+          <w:rStyle w:val="VerbatimChar"/>
+        </w:rPr>
+        <w:t xml:space="preserve">## </w:t>
+      </w:r>
+      <w:r>
+        <w:br/>
+      </w:r>
+      <w:r>
+        <w:rPr>
+          <w:rStyle w:val="VerbatimChar"/>
+        </w:rPr>
+        <w:t xml:space="preserve">##  Pearson's Chi-squared test</w:t>
+      </w:r>
+      <w:r>
+        <w:br/>
+      </w:r>
+      <w:r>
+        <w:rPr>
+          <w:rStyle w:val="VerbatimChar"/>
+        </w:rPr>
+        <w:t xml:space="preserve">## </w:t>
+      </w:r>
+      <w:r>
+        <w:br/>
+      </w:r>
+      <w:r>
+        <w:rPr>
+          <w:rStyle w:val="VerbatimChar"/>
+        </w:rPr>
+        <w:t xml:space="preserve">## data:  customer_satisfaction_table</w:t>
+      </w:r>
+      <w:r>
+        <w:br/>
+      </w:r>
+      <w:r>
+        <w:rPr>
+          <w:rStyle w:val="VerbatimChar"/>
+        </w:rPr>
+        <w:t xml:space="preserve">## X-squared = 4494.2, df = 1, p-value &lt; 2.2e-16</w:t>
+      </w:r>
+    </w:p>
+    <w:p>
+      <w:pPr>
+        <w:pStyle w:val="FirstParagraph"/>
+      </w:pPr>
+      <w:r>
+        <w:t xml:space="preserve">Za procenu jačine povezanosti između tipa korisnika i zadovoljstva putnika izračunaćemo Cramerov koeficijent V.</w:t>
+      </w:r>
+    </w:p>
+    <w:p>
+      <w:pPr>
+        <w:pStyle w:val="SourceCode"/>
+      </w:pPr>
+      <w:r>
+        <w:rPr>
+          <w:rStyle w:val="NormalTok"/>
+        </w:rPr>
+        <w:t xml:space="preserve">n </w:t>
+      </w:r>
+      <w:r>
+        <w:rPr>
+          <w:rStyle w:val="OtherTok"/>
+        </w:rPr>
+        <w:t xml:space="preserve">&lt;-</w:t>
+      </w:r>
+      <w:r>
+        <w:rPr>
+          <w:rStyle w:val="NormalTok"/>
+        </w:rPr>
+        <w:t xml:space="preserve"> </w:t>
+      </w:r>
+      <w:r>
+        <w:rPr>
+          <w:rStyle w:val="FunctionTok"/>
+        </w:rPr>
+        <w:t xml:space="preserve">sum</w:t>
+      </w:r>
+      <w:r>
+        <w:rPr>
+          <w:rStyle w:val="NormalTok"/>
+        </w:rPr>
+        <w:t xml:space="preserve">(customer_satisfaction_table)</w:t>
+      </w:r>
+      <w:r>
+        <w:br/>
+      </w:r>
+      <w:r>
+        <w:rPr>
+          <w:rStyle w:val="NormalTok"/>
+        </w:rPr>
+        <w:t xml:space="preserve">chi_square </w:t>
+      </w:r>
+      <w:r>
+        <w:rPr>
+          <w:rStyle w:val="OtherTok"/>
+        </w:rPr>
+        <w:t xml:space="preserve">&lt;-</w:t>
+      </w:r>
+      <w:r>
+        <w:rPr>
+          <w:rStyle w:val="NormalTok"/>
+        </w:rPr>
+        <w:t xml:space="preserve"> </w:t>
+      </w:r>
+      <w:r>
+        <w:rPr>
+          <w:rStyle w:val="FunctionTok"/>
+        </w:rPr>
+        <w:t xml:space="preserve">as.numeric</w:t>
+      </w:r>
+      <w:r>
+        <w:rPr>
+          <w:rStyle w:val="NormalTok"/>
+        </w:rPr>
+        <w:t xml:space="preserve">(customer_chisq</w:t>
+      </w:r>
+      <w:r>
+        <w:rPr>
+          <w:rStyle w:val="SpecialCharTok"/>
+        </w:rPr>
+        <w:t xml:space="preserve">$</w:t>
+      </w:r>
+      <w:r>
+        <w:rPr>
+          <w:rStyle w:val="NormalTok"/>
+        </w:rPr>
+        <w:t xml:space="preserve">statistic)</w:t>
+      </w:r>
+      <w:r>
+        <w:br/>
+      </w:r>
+      <w:r>
+        <w:br/>
+      </w:r>
+      <w:r>
+        <w:rPr>
+          <w:rStyle w:val="NormalTok"/>
+        </w:rPr>
+        <w:t xml:space="preserve">customer_cramers_v </w:t>
+      </w:r>
+      <w:r>
+        <w:rPr>
+          <w:rStyle w:val="OtherTok"/>
+        </w:rPr>
+        <w:t xml:space="preserve">&lt;-</w:t>
+      </w:r>
+      <w:r>
+        <w:rPr>
+          <w:rStyle w:val="NormalTok"/>
+        </w:rPr>
+        <w:t xml:space="preserve"> </w:t>
+      </w:r>
+      <w:r>
+        <w:rPr>
+          <w:rStyle w:val="FunctionTok"/>
+        </w:rPr>
+        <w:t xml:space="preserve">sqrt</w:t>
+      </w:r>
+      <w:r>
+        <w:rPr>
+          <w:rStyle w:val="NormalTok"/>
+        </w:rPr>
+        <w:t xml:space="preserve">(chi_square </w:t>
+      </w:r>
+      <w:r>
+        <w:rPr>
+          <w:rStyle w:val="SpecialCharTok"/>
+        </w:rPr>
+        <w:t xml:space="preserve">/</w:t>
+      </w:r>
+      <w:r>
+        <w:rPr>
+          <w:rStyle w:val="NormalTok"/>
+        </w:rPr>
+        <w:t xml:space="preserve"> n)</w:t>
+      </w:r>
+      <w:r>
+        <w:br/>
+      </w:r>
+      <w:r>
+        <w:br/>
+      </w:r>
+      <w:r>
+        <w:rPr>
+          <w:rStyle w:val="NormalTok"/>
+        </w:rPr>
+        <w:t xml:space="preserve">customer_cramers_v</w:t>
+      </w:r>
+    </w:p>
+    <w:p>
+      <w:pPr>
+        <w:pStyle w:val="SourceCode"/>
+      </w:pPr>
+      <w:r>
+        <w:rPr>
+          <w:rStyle w:val="VerbatimChar"/>
+        </w:rPr>
+        <w:t xml:space="preserve">## [1] 0.1860172</w:t>
+      </w:r>
+    </w:p>
+    <w:p>
+      <w:pPr>
+        <w:pStyle w:val="FirstParagraph"/>
+      </w:pPr>
+      <w:r>
+        <w:t xml:space="preserve">Rezultat Pearsonovog hi-kvadrat testa pokazuje da postoji statistički značajna povezanost između tipa korisnika i zadovoljstva putnika, χ²(1) = 4494,2, p &lt; 0,001. Na osnovu ovog rezultata odbacujemo nultu hipotezu o nezavisnosti ove dve promenljive.</w:t>
+      </w:r>
+    </w:p>
+    <w:p>
+      <w:pPr>
+        <w:pStyle w:val="BodyText"/>
+      </w:pPr>
+      <w:r>
+        <w:t xml:space="preserve">Cramerov koeficijent V iznosi 0,186, što ukazuje na povezanost slabog intenziteta, ali sa većim praktičnim značajem nego u slučaju promenljive</w:t>
+      </w:r>
+      <w:r>
+        <w:t xml:space="preserve"> </w:t>
+      </w:r>
+      <w:r>
+        <w:rPr>
+          <w:rStyle w:val="VerbatimChar"/>
+        </w:rPr>
+        <w:t xml:space="preserve">Gender</w:t>
+      </w:r>
+      <w:r>
+        <w:t xml:space="preserve">. Iako je povezanost statistički značajna, rezultat ne dokazuje da tip korisnika direktno uzrokuje zadovoljstvo ili nezadovoljstvo. On pokazuje da se raspodela zadovoljstva značajno razlikuje između lojalnih i dislojalnih korisnika u posmatranom skupu podataka.</w:t>
+      </w:r>
+    </w:p>
+    <w:bookmarkEnd w:id="79"/>
+    <w:bookmarkStart w:id="83" w:name="X55fa3250898416e6b15ab3a3ba3e54612e214b7"/>
+    <w:p>
+      <w:pPr>
+        <w:pStyle w:val="Heading3"/>
+      </w:pPr>
+      <w:r>
+        <w:t xml:space="preserve">Odnos tipa putovanja i zadovoljstva putnika (</w:t>
+      </w:r>
+      <w:r>
+        <w:rPr>
+          <w:rStyle w:val="VerbatimChar"/>
+        </w:rPr>
+        <w:t xml:space="preserve">Type_of_Travel</w:t>
+      </w:r>
+      <w:r>
+        <w:t xml:space="preserve">)</w:t>
+      </w:r>
+    </w:p>
+    <w:p>
+      <w:pPr>
+        <w:pStyle w:val="FirstParagraph"/>
+      </w:pPr>
+      <w:r>
+        <w:t xml:space="preserve">U nastavku ćemo ispitati da li se zadovoljstvo putnika razlikuje u zavisnosti od svrhe putovanja. Promenljiva</w:t>
+      </w:r>
+      <w:r>
+        <w:t xml:space="preserve"> </w:t>
+      </w:r>
+      <w:r>
+        <w:rPr>
+          <w:rStyle w:val="VerbatimChar"/>
+        </w:rPr>
+        <w:t xml:space="preserve">Type_of_Travel</w:t>
+      </w:r>
+      <w:r>
+        <w:t xml:space="preserve"> </w:t>
+      </w:r>
+      <w:r>
+        <w:t xml:space="preserve">sadrži dve kategorije:</w:t>
+      </w:r>
+      <w:r>
+        <w:t xml:space="preserve"> </w:t>
+      </w:r>
+      <w:r>
+        <w:rPr>
+          <w:rStyle w:val="VerbatimChar"/>
+        </w:rPr>
+        <w:t xml:space="preserve">Business Travel</w:t>
+      </w:r>
+      <w:r>
+        <w:t xml:space="preserve"> </w:t>
+      </w:r>
+      <w:r>
+        <w:t xml:space="preserve">i</w:t>
+      </w:r>
+      <w:r>
+        <w:t xml:space="preserve"> </w:t>
+      </w:r>
+      <w:r>
+        <w:rPr>
+          <w:rStyle w:val="VerbatimChar"/>
+        </w:rPr>
+        <w:t xml:space="preserve">Personal Travel</w:t>
+      </w:r>
+      <w:r>
+        <w:t xml:space="preserve">.</w:t>
+      </w:r>
+    </w:p>
+    <w:p>
+      <w:pPr>
+        <w:pStyle w:val="BodyText"/>
+      </w:pPr>
+      <w:r>
+        <w:t xml:space="preserve">U ovoj analizi koristićemo relativne frekvencije, odnosno procenat zadovoljnih i nezadovoljnih putnika unutar svake kategorije svrhe putovanja. Na taj način možemo pravično da uporedimo ove dve grupe, nezavisno od njihovog ukupnog broja u skupu podataka.</w:t>
+      </w:r>
+    </w:p>
+    <w:p>
+      <w:pPr>
+        <w:pStyle w:val="SourceCode"/>
+      </w:pPr>
+      <w:r>
+        <w:rPr>
+          <w:rStyle w:val="NormalTok"/>
+        </w:rPr>
+        <w:t xml:space="preserve">travel_satisfaction </w:t>
+      </w:r>
+      <w:r>
+        <w:rPr>
+          <w:rStyle w:val="OtherTok"/>
+        </w:rPr>
+        <w:t xml:space="preserve">&lt;-</w:t>
+      </w:r>
+      <w:r>
+        <w:rPr>
+          <w:rStyle w:val="NormalTok"/>
+        </w:rPr>
+        <w:t xml:space="preserve"> data </w:t>
+      </w:r>
+      <w:r>
+        <w:rPr>
+          <w:rStyle w:val="SpecialCharTok"/>
+        </w:rPr>
+        <w:t xml:space="preserve">%&gt;%</w:t>
+      </w:r>
+      <w:r>
+        <w:br/>
+      </w:r>
+      <w:r>
+        <w:rPr>
+          <w:rStyle w:val="NormalTok"/>
+        </w:rPr>
+        <w:t xml:space="preserve">  </w:t>
+      </w:r>
+      <w:r>
+        <w:rPr>
+          <w:rStyle w:val="FunctionTok"/>
+        </w:rPr>
+        <w:t xml:space="preserve">count</w:t>
+      </w:r>
+      <w:r>
+        <w:rPr>
+          <w:rStyle w:val="NormalTok"/>
+        </w:rPr>
+        <w:t xml:space="preserve">(Type_of_Travel, Satisfaction, </w:t>
+      </w:r>
+      <w:r>
+        <w:rPr>
+          <w:rStyle w:val="AttributeTok"/>
+        </w:rPr>
+        <w:t xml:space="preserve">name =</w:t>
+      </w:r>
+      <w:r>
+        <w:rPr>
+          <w:rStyle w:val="NormalTok"/>
+        </w:rPr>
+        <w:t xml:space="preserve"> </w:t>
+      </w:r>
+      <w:r>
+        <w:rPr>
+          <w:rStyle w:val="StringTok"/>
+        </w:rPr>
+        <w:t xml:space="preserve">"Broj"</w:t>
+      </w:r>
+      <w:r>
+        <w:rPr>
+          <w:rStyle w:val="NormalTok"/>
+        </w:rPr>
+        <w:t xml:space="preserve">) </w:t>
+      </w:r>
+      <w:r>
+        <w:rPr>
+          <w:rStyle w:val="SpecialCharTok"/>
+        </w:rPr>
+        <w:t xml:space="preserve">%&gt;%</w:t>
+      </w:r>
+      <w:r>
+        <w:br/>
+      </w:r>
+      <w:r>
+        <w:rPr>
+          <w:rStyle w:val="NormalTok"/>
+        </w:rPr>
+        <w:t xml:space="preserve">  </w:t>
+      </w:r>
+      <w:r>
+        <w:rPr>
+          <w:rStyle w:val="FunctionTok"/>
+        </w:rPr>
+        <w:t xml:space="preserve">group_by</w:t>
+      </w:r>
+      <w:r>
+        <w:rPr>
+          <w:rStyle w:val="NormalTok"/>
+        </w:rPr>
+        <w:t xml:space="preserve">(Type_of_Travel) </w:t>
+      </w:r>
+      <w:r>
+        <w:rPr>
+          <w:rStyle w:val="SpecialCharTok"/>
+        </w:rPr>
+        <w:t xml:space="preserve">%&gt;%</w:t>
+      </w:r>
+      <w:r>
+        <w:br/>
+      </w:r>
+      <w:r>
+        <w:rPr>
+          <w:rStyle w:val="NormalTok"/>
+        </w:rPr>
+        <w:t xml:space="preserve">  </w:t>
+      </w:r>
+      <w:r>
+        <w:rPr>
+          <w:rStyle w:val="FunctionTok"/>
+        </w:rPr>
+        <w:t xml:space="preserve">mutate</w:t>
+      </w:r>
+      <w:r>
+        <w:rPr>
+          <w:rStyle w:val="NormalTok"/>
+        </w:rPr>
+        <w:t xml:space="preserve">(</w:t>
+      </w:r>
+      <w:r>
+        <w:rPr>
+          <w:rStyle w:val="AttributeTok"/>
+        </w:rPr>
+        <w:t xml:space="preserve">Procenat =</w:t>
+      </w:r>
+      <w:r>
+        <w:rPr>
+          <w:rStyle w:val="NormalTok"/>
+        </w:rPr>
+        <w:t xml:space="preserve"> </w:t>
+      </w:r>
+      <w:r>
+        <w:rPr>
+          <w:rStyle w:val="FunctionTok"/>
+        </w:rPr>
+        <w:t xml:space="preserve">round</w:t>
+      </w:r>
+      <w:r>
+        <w:rPr>
+          <w:rStyle w:val="NormalTok"/>
+        </w:rPr>
+        <w:t xml:space="preserve">(Broj </w:t>
+      </w:r>
+      <w:r>
+        <w:rPr>
+          <w:rStyle w:val="SpecialCharTok"/>
+        </w:rPr>
+        <w:t xml:space="preserve">/</w:t>
+      </w:r>
+      <w:r>
+        <w:rPr>
+          <w:rStyle w:val="NormalTok"/>
+        </w:rPr>
+        <w:t xml:space="preserve"> </w:t>
+      </w:r>
+      <w:r>
+        <w:rPr>
+          <w:rStyle w:val="FunctionTok"/>
+        </w:rPr>
+        <w:t xml:space="preserve">sum</w:t>
+      </w:r>
+      <w:r>
+        <w:rPr>
+          <w:rStyle w:val="NormalTok"/>
+        </w:rPr>
+        <w:t xml:space="preserve">(Broj) </w:t>
+      </w:r>
+      <w:r>
+        <w:rPr>
+          <w:rStyle w:val="SpecialCharTok"/>
+        </w:rPr>
+        <w:t xml:space="preserve">*</w:t>
+      </w:r>
+      <w:r>
+        <w:rPr>
+          <w:rStyle w:val="NormalTok"/>
+        </w:rPr>
+        <w:t xml:space="preserve"> </w:t>
+      </w:r>
+      <w:r>
+        <w:rPr>
+          <w:rStyle w:val="DecValTok"/>
+        </w:rPr>
+        <w:t xml:space="preserve">100</w:t>
+      </w:r>
+      <w:r>
+        <w:rPr>
+          <w:rStyle w:val="NormalTok"/>
+        </w:rPr>
+        <w:t xml:space="preserve">, </w:t>
+      </w:r>
+      <w:r>
+        <w:rPr>
+          <w:rStyle w:val="DecValTok"/>
+        </w:rPr>
+        <w:t xml:space="preserve">2</w:t>
+      </w:r>
+      <w:r>
+        <w:rPr>
+          <w:rStyle w:val="NormalTok"/>
+        </w:rPr>
+        <w:t xml:space="preserve">)) </w:t>
+      </w:r>
+      <w:r>
+        <w:rPr>
+          <w:rStyle w:val="SpecialCharTok"/>
+        </w:rPr>
+        <w:t xml:space="preserve">%&gt;%</w:t>
+      </w:r>
+      <w:r>
+        <w:br/>
+      </w:r>
+      <w:r>
+        <w:rPr>
+          <w:rStyle w:val="NormalTok"/>
+        </w:rPr>
+        <w:t xml:space="preserve">  </w:t>
+      </w:r>
+      <w:r>
+        <w:rPr>
+          <w:rStyle w:val="FunctionTok"/>
+        </w:rPr>
+        <w:t xml:space="preserve">ungroup</w:t>
+      </w:r>
+      <w:r>
+        <w:rPr>
+          <w:rStyle w:val="NormalTok"/>
+        </w:rPr>
+        <w:t xml:space="preserve">()</w:t>
+      </w:r>
+      <w:r>
+        <w:br/>
+      </w:r>
+      <w:r>
+        <w:br/>
+      </w:r>
+      <w:r>
+        <w:rPr>
+          <w:rStyle w:val="NormalTok"/>
+        </w:rPr>
+        <w:t xml:space="preserve">travel_satisfaction</w:t>
+      </w:r>
+    </w:p>
+    <w:p>
+      <w:pPr>
+        <w:pStyle w:val="SourceCode"/>
+      </w:pPr>
+      <w:r>
+        <w:rPr>
+          <w:rStyle w:val="VerbatimChar"/>
+        </w:rPr>
+        <w:t xml:space="preserve">## # A tibble: 4 × 4</w:t>
+      </w:r>
+      <w:r>
+        <w:br/>
+      </w:r>
+      <w:r>
+        <w:rPr>
+          <w:rStyle w:val="VerbatimChar"/>
+        </w:rPr>
+        <w:t xml:space="preserve">##   Type_of_Travel  Satisfaction   Broj Procenat</w:t>
+      </w:r>
+      <w:r>
+        <w:br/>
+      </w:r>
+      <w:r>
+        <w:rPr>
+          <w:rStyle w:val="VerbatimChar"/>
+        </w:rPr>
+        <w:t xml:space="preserve">##   &lt;fct&gt;           &lt;fct&gt;         &lt;int&gt;    &lt;dbl&gt;</w:t>
+      </w:r>
+      <w:r>
+        <w:br/>
+      </w:r>
+      <w:r>
+        <w:rPr>
+          <w:rStyle w:val="VerbatimChar"/>
+        </w:rPr>
+        <w:t xml:space="preserve">## 1 Business Travel Satisfied     52356     58.4</w:t>
+      </w:r>
+      <w:r>
+        <w:br/>
+      </w:r>
+      <w:r>
+        <w:rPr>
+          <w:rStyle w:val="VerbatimChar"/>
+        </w:rPr>
+        <w:t xml:space="preserve">## 2 Business Travel Not Satisfied 37337     41.6</w:t>
+      </w:r>
+      <w:r>
+        <w:br/>
+      </w:r>
+      <w:r>
+        <w:rPr>
+          <w:rStyle w:val="VerbatimChar"/>
+        </w:rPr>
+        <w:t xml:space="preserve">## 3 Personal Travel Satisfied      4072     10.1</w:t>
+      </w:r>
+      <w:r>
+        <w:br/>
+      </w:r>
+      <w:r>
+        <w:rPr>
+          <w:rStyle w:val="VerbatimChar"/>
+        </w:rPr>
+        <w:t xml:space="preserve">## 4 Personal Travel Not Satisfied 36115     89.9</w:t>
+      </w:r>
+    </w:p>
+    <w:p>
+      <w:pPr>
+        <w:pStyle w:val="FirstParagraph"/>
+      </w:pPr>
+      <w:r>
+        <w:t xml:space="preserve">Da bismo vizuelno uporedili raspodelu zadovoljstva prema svrsi putovanja, prikazaćemo proporcionalni stubičasti dijagram.</w:t>
+      </w:r>
+    </w:p>
+    <w:p>
+      <w:pPr>
+        <w:pStyle w:val="SourceCode"/>
+      </w:pPr>
+      <w:r>
+        <w:rPr>
+          <w:rStyle w:val="FunctionTok"/>
+        </w:rPr>
+        <w:t xml:space="preserve">ggplot</w:t>
+      </w:r>
+      <w:r>
+        <w:rPr>
+          <w:rStyle w:val="NormalTok"/>
+        </w:rPr>
+        <w:t xml:space="preserve">(data, </w:t>
+      </w:r>
+      <w:r>
+        <w:rPr>
+          <w:rStyle w:val="FunctionTok"/>
+        </w:rPr>
+        <w:t xml:space="preserve">aes</w:t>
+      </w:r>
+      <w:r>
+        <w:rPr>
+          <w:rStyle w:val="NormalTok"/>
+        </w:rPr>
+        <w:t xml:space="preserve">(</w:t>
+      </w:r>
+      <w:r>
+        <w:rPr>
+          <w:rStyle w:val="AttributeTok"/>
+        </w:rPr>
+        <w:t xml:space="preserve">x =</w:t>
+      </w:r>
+      <w:r>
+        <w:rPr>
+          <w:rStyle w:val="NormalTok"/>
+        </w:rPr>
+        <w:t xml:space="preserve"> Type_of_Travel, </w:t>
+      </w:r>
+      <w:r>
+        <w:rPr>
+          <w:rStyle w:val="AttributeTok"/>
+        </w:rPr>
+        <w:t xml:space="preserve">fill =</w:t>
+      </w:r>
+      <w:r>
+        <w:rPr>
+          <w:rStyle w:val="NormalTok"/>
+        </w:rPr>
+        <w:t xml:space="preserve"> Satisfaction)) </w:t>
+      </w:r>
+      <w:r>
+        <w:rPr>
+          <w:rStyle w:val="SpecialCharTok"/>
+        </w:rPr>
+        <w:t xml:space="preserve">+</w:t>
+      </w:r>
+      <w:r>
+        <w:br/>
+      </w:r>
+      <w:r>
+        <w:rPr>
+          <w:rStyle w:val="NormalTok"/>
+        </w:rPr>
+        <w:t xml:space="preserve">  </w:t>
+      </w:r>
+      <w:r>
+        <w:rPr>
+          <w:rStyle w:val="FunctionTok"/>
+        </w:rPr>
+        <w:t xml:space="preserve">geom_bar</w:t>
+      </w:r>
+      <w:r>
+        <w:rPr>
+          <w:rStyle w:val="NormalTok"/>
+        </w:rPr>
+        <w:t xml:space="preserve">(</w:t>
+      </w:r>
+      <w:r>
+        <w:rPr>
+          <w:rStyle w:val="AttributeTok"/>
+        </w:rPr>
+        <w:t xml:space="preserve">position =</w:t>
+      </w:r>
+      <w:r>
+        <w:rPr>
+          <w:rStyle w:val="NormalTok"/>
+        </w:rPr>
+        <w:t xml:space="preserve"> </w:t>
+      </w:r>
+      <w:r>
+        <w:rPr>
+          <w:rStyle w:val="StringTok"/>
+        </w:rPr>
+        <w:t xml:space="preserve">"fill"</w:t>
+      </w:r>
+      <w:r>
+        <w:rPr>
+          <w:rStyle w:val="NormalTok"/>
+        </w:rPr>
+        <w:t xml:space="preserve">) </w:t>
+      </w:r>
+      <w:r>
+        <w:rPr>
+          <w:rStyle w:val="SpecialCharTok"/>
+        </w:rPr>
+        <w:t xml:space="preserve">+</w:t>
+      </w:r>
+      <w:r>
+        <w:br/>
+      </w:r>
+      <w:r>
+        <w:rPr>
+          <w:rStyle w:val="NormalTok"/>
+        </w:rPr>
+        <w:t xml:space="preserve">  </w:t>
+      </w:r>
+      <w:r>
+        <w:rPr>
+          <w:rStyle w:val="FunctionTok"/>
+        </w:rPr>
+        <w:t xml:space="preserve">scale_y_continuous</w:t>
+      </w:r>
+      <w:r>
+        <w:rPr>
+          <w:rStyle w:val="NormalTok"/>
+        </w:rPr>
+        <w:t xml:space="preserve">(</w:t>
+      </w:r>
+      <w:r>
+        <w:br/>
+      </w:r>
+      <w:r>
+        <w:rPr>
+          <w:rStyle w:val="NormalTok"/>
+        </w:rPr>
+        <w:t xml:space="preserve">    </w:t>
+      </w:r>
+      <w:r>
+        <w:rPr>
+          <w:rStyle w:val="AttributeTok"/>
+        </w:rPr>
+        <w:t xml:space="preserve">labels =</w:t>
+      </w:r>
+      <w:r>
+        <w:rPr>
+          <w:rStyle w:val="NormalTok"/>
+        </w:rPr>
+        <w:t xml:space="preserve"> scales</w:t>
+      </w:r>
+      <w:r>
+        <w:rPr>
+          <w:rStyle w:val="SpecialCharTok"/>
+        </w:rPr>
+        <w:t xml:space="preserve">::</w:t>
+      </w:r>
+      <w:r>
+        <w:rPr>
+          <w:rStyle w:val="FunctionTok"/>
+        </w:rPr>
+        <w:t xml:space="preserve">percent_format</w:t>
+      </w:r>
+      <w:r>
+        <w:rPr>
+          <w:rStyle w:val="NormalTok"/>
+        </w:rPr>
+        <w:t xml:space="preserve">()</w:t>
+      </w:r>
+      <w:r>
+        <w:br/>
+      </w:r>
+      <w:r>
+        <w:rPr>
+          <w:rStyle w:val="NormalTok"/>
+        </w:rPr>
+        <w:t xml:space="preserve">  ) </w:t>
+      </w:r>
+      <w:r>
+        <w:rPr>
+          <w:rStyle w:val="SpecialCharTok"/>
+        </w:rPr>
+        <w:t xml:space="preserve">+</w:t>
+      </w:r>
+      <w:r>
+        <w:br/>
+      </w:r>
+      <w:r>
+        <w:rPr>
+          <w:rStyle w:val="NormalTok"/>
+        </w:rPr>
+        <w:t xml:space="preserve">  </w:t>
+      </w:r>
+      <w:r>
+        <w:rPr>
+          <w:rStyle w:val="FunctionTok"/>
+        </w:rPr>
+        <w:t xml:space="preserve">scale_fill_manual</w:t>
+      </w:r>
+      <w:r>
+        <w:rPr>
+          <w:rStyle w:val="NormalTok"/>
+        </w:rPr>
+        <w:t xml:space="preserve">(</w:t>
+      </w:r>
+      <w:r>
+        <w:br/>
+      </w:r>
+      <w:r>
+        <w:rPr>
+          <w:rStyle w:val="NormalTok"/>
+        </w:rPr>
+        <w:t xml:space="preserve">    </w:t>
+      </w:r>
+      <w:r>
+        <w:rPr>
+          <w:rStyle w:val="AttributeTok"/>
+        </w:rPr>
+        <w:t xml:space="preserve">values =</w:t>
+      </w:r>
+      <w:r>
+        <w:rPr>
+          <w:rStyle w:val="NormalTok"/>
+        </w:rPr>
+        <w:t xml:space="preserve"> </w:t>
+      </w:r>
+      <w:r>
+        <w:rPr>
+          <w:rStyle w:val="FunctionTok"/>
+        </w:rPr>
+        <w:t xml:space="preserve">c</w:t>
+      </w:r>
+      <w:r>
+        <w:rPr>
+          <w:rStyle w:val="NormalTok"/>
+        </w:rPr>
+        <w:t xml:space="preserve">(</w:t>
+      </w:r>
+      <w:r>
+        <w:br/>
+      </w:r>
+      <w:r>
+        <w:rPr>
+          <w:rStyle w:val="NormalTok"/>
+        </w:rPr>
+        <w:t xml:space="preserve">      </w:t>
+      </w:r>
+      <w:r>
+        <w:rPr>
+          <w:rStyle w:val="StringTok"/>
+        </w:rPr>
+        <w:t xml:space="preserve">"Satisfied"</w:t>
+      </w:r>
+      <w:r>
+        <w:rPr>
+          <w:rStyle w:val="NormalTok"/>
+        </w:rPr>
+        <w:t xml:space="preserve"> </w:t>
+      </w:r>
+      <w:r>
+        <w:rPr>
+          <w:rStyle w:val="OtherTok"/>
+        </w:rPr>
+        <w:t xml:space="preserve">=</w:t>
+      </w:r>
+      <w:r>
+        <w:rPr>
+          <w:rStyle w:val="NormalTok"/>
+        </w:rPr>
+        <w:t xml:space="preserve"> </w:t>
+      </w:r>
+      <w:r>
+        <w:rPr>
+          <w:rStyle w:val="StringTok"/>
+        </w:rPr>
+        <w:t xml:space="preserve">"#2ecc71"</w:t>
+      </w:r>
+      <w:r>
+        <w:rPr>
+          <w:rStyle w:val="NormalTok"/>
+        </w:rPr>
+        <w:t xml:space="preserve">,</w:t>
+      </w:r>
+      <w:r>
+        <w:br/>
+      </w:r>
+      <w:r>
+        <w:rPr>
+          <w:rStyle w:val="NormalTok"/>
+        </w:rPr>
+        <w:t xml:space="preserve">      </w:t>
+      </w:r>
+      <w:r>
+        <w:rPr>
+          <w:rStyle w:val="StringTok"/>
+        </w:rPr>
+        <w:t xml:space="preserve">"Not Satisfied"</w:t>
+      </w:r>
+      <w:r>
+        <w:rPr>
+          <w:rStyle w:val="NormalTok"/>
+        </w:rPr>
+        <w:t xml:space="preserve"> </w:t>
+      </w:r>
+      <w:r>
+        <w:rPr>
+          <w:rStyle w:val="OtherTok"/>
+        </w:rPr>
+        <w:t xml:space="preserve">=</w:t>
+      </w:r>
+      <w:r>
+        <w:rPr>
+          <w:rStyle w:val="NormalTok"/>
+        </w:rPr>
+        <w:t xml:space="preserve"> </w:t>
+      </w:r>
+      <w:r>
+        <w:rPr>
+          <w:rStyle w:val="StringTok"/>
+        </w:rPr>
+        <w:t xml:space="preserve">"#e74c3c"</w:t>
+      </w:r>
+      <w:r>
+        <w:br/>
+      </w:r>
+      <w:r>
+        <w:rPr>
+          <w:rStyle w:val="NormalTok"/>
+        </w:rPr>
+        <w:t xml:space="preserve">    )</w:t>
+      </w:r>
+      <w:r>
+        <w:br/>
+      </w:r>
+      <w:r>
+        <w:rPr>
+          <w:rStyle w:val="NormalTok"/>
+        </w:rPr>
+        <w:t xml:space="preserve">  ) </w:t>
+      </w:r>
+      <w:r>
+        <w:rPr>
+          <w:rStyle w:val="SpecialCharTok"/>
+        </w:rPr>
+        <w:t xml:space="preserve">+</w:t>
+      </w:r>
+      <w:r>
+        <w:br/>
+      </w:r>
+      <w:r>
+        <w:rPr>
+          <w:rStyle w:val="NormalTok"/>
+        </w:rPr>
+        <w:t xml:space="preserve">  </w:t>
+      </w:r>
+      <w:r>
+        <w:rPr>
+          <w:rStyle w:val="FunctionTok"/>
+        </w:rPr>
+        <w:t xml:space="preserve">theme_minimal</w:t>
+      </w:r>
+      <w:r>
+        <w:rPr>
+          <w:rStyle w:val="NormalTok"/>
+        </w:rPr>
+        <w:t xml:space="preserve">() </w:t>
+      </w:r>
+      <w:r>
+        <w:rPr>
+          <w:rStyle w:val="SpecialCharTok"/>
+        </w:rPr>
+        <w:t xml:space="preserve">+</w:t>
+      </w:r>
+      <w:r>
+        <w:br/>
+      </w:r>
+      <w:r>
+        <w:rPr>
+          <w:rStyle w:val="NormalTok"/>
+        </w:rPr>
+        <w:t xml:space="preserve">  </w:t>
+      </w:r>
+      <w:r>
+        <w:rPr>
+          <w:rStyle w:val="FunctionTok"/>
+        </w:rPr>
+        <w:t xml:space="preserve">labs</w:t>
+      </w:r>
+      <w:r>
+        <w:rPr>
+          <w:rStyle w:val="NormalTok"/>
+        </w:rPr>
+        <w:t xml:space="preserve">(</w:t>
+      </w:r>
+      <w:r>
+        <w:br/>
+      </w:r>
+      <w:r>
+        <w:rPr>
+          <w:rStyle w:val="NormalTok"/>
+        </w:rPr>
+        <w:t xml:space="preserve">    </w:t>
+      </w:r>
+      <w:r>
+        <w:rPr>
+          <w:rStyle w:val="AttributeTok"/>
+        </w:rPr>
+        <w:t xml:space="preserve">title =</w:t>
+      </w:r>
+      <w:r>
+        <w:rPr>
+          <w:rStyle w:val="NormalTok"/>
+        </w:rPr>
+        <w:t xml:space="preserve"> </w:t>
+      </w:r>
+      <w:r>
+        <w:rPr>
+          <w:rStyle w:val="StringTok"/>
+        </w:rPr>
+        <w:t xml:space="preserve">"Zadovoljstvo putnika prema svrsi putovanja"</w:t>
+      </w:r>
+      <w:r>
+        <w:rPr>
+          <w:rStyle w:val="NormalTok"/>
+        </w:rPr>
+        <w:t xml:space="preserve">,</w:t>
+      </w:r>
+      <w:r>
+        <w:br/>
+      </w:r>
+      <w:r>
+        <w:rPr>
+          <w:rStyle w:val="NormalTok"/>
+        </w:rPr>
+        <w:t xml:space="preserve">    </w:t>
+      </w:r>
+      <w:r>
+        <w:rPr>
+          <w:rStyle w:val="AttributeTok"/>
+        </w:rPr>
+        <w:t xml:space="preserve">x =</w:t>
+      </w:r>
+      <w:r>
+        <w:rPr>
+          <w:rStyle w:val="NormalTok"/>
+        </w:rPr>
+        <w:t xml:space="preserve"> </w:t>
+      </w:r>
+      <w:r>
+        <w:rPr>
+          <w:rStyle w:val="StringTok"/>
+        </w:rPr>
+        <w:t xml:space="preserve">"Svrha putovanja"</w:t>
+      </w:r>
+      <w:r>
+        <w:rPr>
+          <w:rStyle w:val="NormalTok"/>
+        </w:rPr>
+        <w:t xml:space="preserve">,</w:t>
+      </w:r>
+      <w:r>
+        <w:br/>
+      </w:r>
+      <w:r>
+        <w:rPr>
+          <w:rStyle w:val="NormalTok"/>
+        </w:rPr>
+        <w:t xml:space="preserve">    </w:t>
+      </w:r>
+      <w:r>
+        <w:rPr>
+          <w:rStyle w:val="AttributeTok"/>
+        </w:rPr>
+        <w:t xml:space="preserve">y =</w:t>
+      </w:r>
+      <w:r>
+        <w:rPr>
+          <w:rStyle w:val="NormalTok"/>
+        </w:rPr>
+        <w:t xml:space="preserve"> </w:t>
+      </w:r>
+      <w:r>
+        <w:rPr>
+          <w:rStyle w:val="StringTok"/>
+        </w:rPr>
+        <w:t xml:space="preserve">"Procenat putnika"</w:t>
+      </w:r>
+      <w:r>
+        <w:rPr>
+          <w:rStyle w:val="NormalTok"/>
+        </w:rPr>
+        <w:t xml:space="preserve">,</w:t>
+      </w:r>
+      <w:r>
+        <w:br/>
+      </w:r>
+      <w:r>
+        <w:rPr>
+          <w:rStyle w:val="NormalTok"/>
+        </w:rPr>
+        <w:t xml:space="preserve">    </w:t>
+      </w:r>
+      <w:r>
+        <w:rPr>
+          <w:rStyle w:val="AttributeTok"/>
+        </w:rPr>
+        <w:t xml:space="preserve">fill =</w:t>
+      </w:r>
+      <w:r>
+        <w:rPr>
+          <w:rStyle w:val="NormalTok"/>
+        </w:rPr>
+        <w:t xml:space="preserve"> </w:t>
+      </w:r>
+      <w:r>
+        <w:rPr>
+          <w:rStyle w:val="StringTok"/>
+        </w:rPr>
+        <w:t xml:space="preserve">"Status zadovoljstva"</w:t>
+      </w:r>
+      <w:r>
+        <w:br/>
+      </w:r>
+      <w:r>
+        <w:rPr>
+          <w:rStyle w:val="NormalTok"/>
+        </w:rPr>
+        <w:t xml:space="preserve">  )</w:t>
+      </w:r>
+    </w:p>
+    <w:p>
+      <w:pPr>
+        <w:pStyle w:val="FirstParagraph"/>
+      </w:pPr>
+      <w:r>
+        <w:drawing>
+          <wp:inline>
+            <wp:extent cx="5943600" cy="3714750"/>
+            <wp:effectExtent b="0" l="0" r="0" t="0"/>
+            <wp:docPr descr="" title="" id="81" name="Picture"/>
+            <a:graphic>
+              <a:graphicData uri="http://schemas.openxmlformats.org/drawingml/2006/picture">
+                <pic:pic>
+                  <pic:nvPicPr>
+                    <pic:cNvPr descr="airline_satisfaction_files/figure-docx/unnamed-chunk-38-1.png" id="82" name="Picture"/>
+                    <pic:cNvPicPr>
+                      <a:picLocks noChangeArrowheads="1" noChangeAspect="1"/>
+                    </pic:cNvPicPr>
+                  </pic:nvPicPr>
+                  <pic:blipFill>
+                    <a:blip r:embed="rId80"/>
+                    <a:stretch>
+                      <a:fillRect/>
+                    </a:stretch>
+                  </pic:blipFill>
+                  <pic:spPr bwMode="auto">
+                    <a:xfrm>
+                      <a:off x="0" y="0"/>
+                      <a:ext cx="5943600" cy="3714750"/>
+                    </a:xfrm>
+                    <a:prstGeom prst="rect">
+                      <a:avLst/>
+                    </a:prstGeom>
+                    <a:noFill/>
+                    <a:ln w="9525">
+                      <a:noFill/>
+                      <a:headEnd/>
+                      <a:tailEnd/>
+                    </a:ln>
+                  </pic:spPr>
+                </pic:pic>
+              </a:graphicData>
+            </a:graphic>
+          </wp:inline>
+        </w:drawing>
+      </w:r>
+      <w:r>
+        <w:t xml:space="preserve"> </w:t>
+      </w:r>
+      <w:r>
+        <w:t xml:space="preserve">Razlika u procentu zadovoljnih putnika između poslovnih i ličnih putovanja iznosi 48,3 procentnih poena. Ova razlika ukazuje na moguću povezanost između svrhe putovanja i zadovoljstva putnika, koju ćemo formalno proveriti hi-kvadrat testom nezavisnosti.</w:t>
+      </w:r>
+    </w:p>
+    <w:p>
+      <w:pPr>
+        <w:pStyle w:val="SourceCode"/>
+      </w:pPr>
+      <w:r>
+        <w:rPr>
+          <w:rStyle w:val="NormalTok"/>
+        </w:rPr>
+        <w:t xml:space="preserve">travel_satisfaction_table </w:t>
+      </w:r>
+      <w:r>
+        <w:rPr>
+          <w:rStyle w:val="OtherTok"/>
+        </w:rPr>
+        <w:t xml:space="preserve">&lt;-</w:t>
+      </w:r>
+      <w:r>
+        <w:rPr>
+          <w:rStyle w:val="NormalTok"/>
+        </w:rPr>
+        <w:t xml:space="preserve"> </w:t>
+      </w:r>
+      <w:r>
+        <w:rPr>
+          <w:rStyle w:val="FunctionTok"/>
+        </w:rPr>
+        <w:t xml:space="preserve">table</w:t>
+      </w:r>
+      <w:r>
+        <w:rPr>
+          <w:rStyle w:val="NormalTok"/>
+        </w:rPr>
+        <w:t xml:space="preserve">(</w:t>
+      </w:r>
+      <w:r>
+        <w:br/>
+      </w:r>
+      <w:r>
+        <w:rPr>
+          <w:rStyle w:val="NormalTok"/>
+        </w:rPr>
+        <w:t xml:space="preserve">  data</w:t>
+      </w:r>
+      <w:r>
+        <w:rPr>
+          <w:rStyle w:val="SpecialCharTok"/>
+        </w:rPr>
+        <w:t xml:space="preserve">$</w:t>
+      </w:r>
+      <w:r>
+        <w:rPr>
+          <w:rStyle w:val="NormalTok"/>
+        </w:rPr>
+        <w:t xml:space="preserve">Type_of_Travel,</w:t>
+      </w:r>
+      <w:r>
+        <w:br/>
+      </w:r>
+      <w:r>
+        <w:rPr>
+          <w:rStyle w:val="NormalTok"/>
+        </w:rPr>
+        <w:t xml:space="preserve">  data</w:t>
+      </w:r>
+      <w:r>
+        <w:rPr>
+          <w:rStyle w:val="SpecialCharTok"/>
+        </w:rPr>
+        <w:t xml:space="preserve">$</w:t>
+      </w:r>
+      <w:r>
+        <w:rPr>
+          <w:rStyle w:val="NormalTok"/>
+        </w:rPr>
+        <w:t xml:space="preserve">Satisfaction</w:t>
+      </w:r>
+      <w:r>
+        <w:br/>
+      </w:r>
+      <w:r>
+        <w:rPr>
+          <w:rStyle w:val="NormalTok"/>
+        </w:rPr>
+        <w:t xml:space="preserve">)</w:t>
+      </w:r>
+      <w:r>
+        <w:br/>
+      </w:r>
+      <w:r>
+        <w:br/>
+      </w:r>
+      <w:r>
+        <w:rPr>
+          <w:rStyle w:val="NormalTok"/>
+        </w:rPr>
+        <w:t xml:space="preserve">travel_satisfaction_table</w:t>
+      </w:r>
+    </w:p>
+    <w:p>
+      <w:pPr>
+        <w:pStyle w:val="SourceCode"/>
+      </w:pPr>
+      <w:r>
+        <w:rPr>
+          <w:rStyle w:val="VerbatimChar"/>
+        </w:rPr>
+        <w:t xml:space="preserve">##                  </w:t>
+      </w:r>
+      <w:r>
+        <w:br/>
+      </w:r>
+      <w:r>
+        <w:rPr>
+          <w:rStyle w:val="VerbatimChar"/>
+        </w:rPr>
+        <w:t xml:space="preserve">##                   Satisfied Not Satisfied</w:t>
+      </w:r>
+      <w:r>
+        <w:br/>
+      </w:r>
+      <w:r>
+        <w:rPr>
+          <w:rStyle w:val="VerbatimChar"/>
+        </w:rPr>
+        <w:t xml:space="preserve">##   Business Travel     52356         37337</w:t>
+      </w:r>
+      <w:r>
+        <w:br/>
+      </w:r>
+      <w:r>
+        <w:rPr>
+          <w:rStyle w:val="VerbatimChar"/>
+        </w:rPr>
+        <w:t xml:space="preserve">##   Personal Travel      4072         36115</w:t>
+      </w:r>
+    </w:p>
+    <w:p>
+      <w:pPr>
+        <w:pStyle w:val="SourceCode"/>
+      </w:pPr>
+      <w:r>
+        <w:rPr>
+          <w:rStyle w:val="NormalTok"/>
+        </w:rPr>
+        <w:t xml:space="preserve">travel_chisq </w:t>
+      </w:r>
+      <w:r>
+        <w:rPr>
+          <w:rStyle w:val="OtherTok"/>
+        </w:rPr>
+        <w:t xml:space="preserve">&lt;-</w:t>
+      </w:r>
+      <w:r>
+        <w:rPr>
+          <w:rStyle w:val="NormalTok"/>
+        </w:rPr>
+        <w:t xml:space="preserve"> </w:t>
+      </w:r>
+      <w:r>
+        <w:rPr>
+          <w:rStyle w:val="FunctionTok"/>
+        </w:rPr>
+        <w:t xml:space="preserve">chisq.test</w:t>
+      </w:r>
+      <w:r>
+        <w:rPr>
+          <w:rStyle w:val="NormalTok"/>
+        </w:rPr>
+        <w:t xml:space="preserve">(</w:t>
+      </w:r>
+      <w:r>
+        <w:br/>
+      </w:r>
+      <w:r>
+        <w:rPr>
+          <w:rStyle w:val="NormalTok"/>
+        </w:rPr>
+        <w:t xml:space="preserve">  travel_satisfaction_table,</w:t>
+      </w:r>
+      <w:r>
+        <w:br/>
+      </w:r>
+      <w:r>
+        <w:rPr>
+          <w:rStyle w:val="NormalTok"/>
+        </w:rPr>
+        <w:t xml:space="preserve">  </w:t>
+      </w:r>
+      <w:r>
+        <w:rPr>
+          <w:rStyle w:val="AttributeTok"/>
+        </w:rPr>
+        <w:t xml:space="preserve">correct =</w:t>
+      </w:r>
+      <w:r>
+        <w:rPr>
+          <w:rStyle w:val="NormalTok"/>
+        </w:rPr>
+        <w:t xml:space="preserve"> </w:t>
+      </w:r>
+      <w:r>
+        <w:rPr>
+          <w:rStyle w:val="ConstantTok"/>
+        </w:rPr>
+        <w:t xml:space="preserve">FALSE</w:t>
+      </w:r>
+      <w:r>
+        <w:br/>
+      </w:r>
+      <w:r>
+        <w:rPr>
+          <w:rStyle w:val="NormalTok"/>
+        </w:rPr>
+        <w:t xml:space="preserve">)</w:t>
+      </w:r>
+      <w:r>
+        <w:br/>
+      </w:r>
+      <w:r>
+        <w:br/>
+      </w:r>
+      <w:r>
+        <w:rPr>
+          <w:rStyle w:val="NormalTok"/>
+        </w:rPr>
+        <w:t xml:space="preserve">travel_chisq</w:t>
+      </w:r>
+    </w:p>
+    <w:p>
+      <w:pPr>
+        <w:pStyle w:val="SourceCode"/>
+      </w:pPr>
+      <w:r>
+        <w:rPr>
+          <w:rStyle w:val="VerbatimChar"/>
+        </w:rPr>
+        <w:t xml:space="preserve">## </w:t>
+      </w:r>
+      <w:r>
+        <w:br/>
+      </w:r>
+      <w:r>
+        <w:rPr>
+          <w:rStyle w:val="VerbatimChar"/>
+        </w:rPr>
+        <w:t xml:space="preserve">##  Pearson's Chi-squared test</w:t>
+      </w:r>
+      <w:r>
+        <w:br/>
+      </w:r>
+      <w:r>
+        <w:rPr>
+          <w:rStyle w:val="VerbatimChar"/>
+        </w:rPr>
+        <w:t xml:space="preserve">## </w:t>
+      </w:r>
+      <w:r>
+        <w:br/>
+      </w:r>
+      <w:r>
+        <w:rPr>
+          <w:rStyle w:val="VerbatimChar"/>
+        </w:rPr>
+        <w:t xml:space="preserve">## data:  travel_satisfaction_table</w:t>
+      </w:r>
+      <w:r>
+        <w:br/>
+      </w:r>
+      <w:r>
+        <w:rPr>
+          <w:rStyle w:val="VerbatimChar"/>
+        </w:rPr>
+        <w:t xml:space="preserve">## X-squared = 26284, df = 1, p-value &lt; 2.2e-16</w:t>
+      </w:r>
+    </w:p>
+    <w:p>
+      <w:pPr>
+        <w:pStyle w:val="SourceCode"/>
+      </w:pPr>
+      <w:r>
+        <w:rPr>
+          <w:rStyle w:val="NormalTok"/>
+        </w:rPr>
+        <w:t xml:space="preserve">n </w:t>
+      </w:r>
+      <w:r>
+        <w:rPr>
+          <w:rStyle w:val="OtherTok"/>
+        </w:rPr>
+        <w:t xml:space="preserve">&lt;-</w:t>
+      </w:r>
+      <w:r>
+        <w:rPr>
+          <w:rStyle w:val="NormalTok"/>
+        </w:rPr>
+        <w:t xml:space="preserve"> </w:t>
+      </w:r>
+      <w:r>
+        <w:rPr>
+          <w:rStyle w:val="FunctionTok"/>
+        </w:rPr>
+        <w:t xml:space="preserve">sum</w:t>
+      </w:r>
+      <w:r>
+        <w:rPr>
+          <w:rStyle w:val="NormalTok"/>
+        </w:rPr>
+        <w:t xml:space="preserve">(travel_satisfaction_table)</w:t>
+      </w:r>
+      <w:r>
+        <w:br/>
+      </w:r>
+      <w:r>
+        <w:rPr>
+          <w:rStyle w:val="NormalTok"/>
+        </w:rPr>
+        <w:t xml:space="preserve">chi_square </w:t>
+      </w:r>
+      <w:r>
+        <w:rPr>
+          <w:rStyle w:val="OtherTok"/>
+        </w:rPr>
+        <w:t xml:space="preserve">&lt;-</w:t>
+      </w:r>
+      <w:r>
+        <w:rPr>
+          <w:rStyle w:val="NormalTok"/>
+        </w:rPr>
+        <w:t xml:space="preserve"> </w:t>
+      </w:r>
+      <w:r>
+        <w:rPr>
+          <w:rStyle w:val="FunctionTok"/>
+        </w:rPr>
+        <w:t xml:space="preserve">as.numeric</w:t>
+      </w:r>
+      <w:r>
+        <w:rPr>
+          <w:rStyle w:val="NormalTok"/>
+        </w:rPr>
+        <w:t xml:space="preserve">(travel_chisq</w:t>
+      </w:r>
+      <w:r>
+        <w:rPr>
+          <w:rStyle w:val="SpecialCharTok"/>
+        </w:rPr>
+        <w:t xml:space="preserve">$</w:t>
+      </w:r>
+      <w:r>
+        <w:rPr>
+          <w:rStyle w:val="NormalTok"/>
+        </w:rPr>
+        <w:t xml:space="preserve">statistic)</w:t>
+      </w:r>
+      <w:r>
+        <w:br/>
+      </w:r>
+      <w:r>
+        <w:br/>
+      </w:r>
+      <w:r>
+        <w:rPr>
+          <w:rStyle w:val="NormalTok"/>
+        </w:rPr>
+        <w:t xml:space="preserve">travel_cramers_v </w:t>
+      </w:r>
+      <w:r>
+        <w:rPr>
+          <w:rStyle w:val="OtherTok"/>
+        </w:rPr>
+        <w:t xml:space="preserve">&lt;-</w:t>
+      </w:r>
+      <w:r>
+        <w:rPr>
+          <w:rStyle w:val="NormalTok"/>
+        </w:rPr>
+        <w:t xml:space="preserve"> </w:t>
+      </w:r>
+      <w:r>
+        <w:rPr>
+          <w:rStyle w:val="FunctionTok"/>
+        </w:rPr>
+        <w:t xml:space="preserve">sqrt</w:t>
+      </w:r>
+      <w:r>
+        <w:rPr>
+          <w:rStyle w:val="NormalTok"/>
+        </w:rPr>
+        <w:t xml:space="preserve">(chi_square </w:t>
+      </w:r>
+      <w:r>
+        <w:rPr>
+          <w:rStyle w:val="SpecialCharTok"/>
+        </w:rPr>
+        <w:t xml:space="preserve">/</w:t>
+      </w:r>
+      <w:r>
+        <w:rPr>
+          <w:rStyle w:val="NormalTok"/>
+        </w:rPr>
+        <w:t xml:space="preserve"> n)</w:t>
+      </w:r>
+      <w:r>
+        <w:br/>
+      </w:r>
+      <w:r>
+        <w:br/>
+      </w:r>
+      <w:r>
+        <w:rPr>
+          <w:rStyle w:val="NormalTok"/>
+        </w:rPr>
+        <w:t xml:space="preserve">travel_cramers_v</w:t>
+      </w:r>
+    </w:p>
+    <w:p>
+      <w:pPr>
+        <w:pStyle w:val="SourceCode"/>
+      </w:pPr>
+      <w:r>
+        <w:rPr>
+          <w:rStyle w:val="VerbatimChar"/>
+        </w:rPr>
+        <w:t xml:space="preserve">## [1] 0.4498613</w:t>
+      </w:r>
+    </w:p>
+    <w:p>
+      <w:pPr>
+        <w:pStyle w:val="FirstParagraph"/>
+      </w:pPr>
+      <w:r>
+        <w:t xml:space="preserve">Rezultat Pearsonovog hi-kvadrat testa pokazuje da postoji statistički značajna povezanost između svrhe putovanja i zadovoljstva putnika, χ²(1) = 26284, p &lt; 0,001. Na osnovu ovog rezultata odbacujemo nultu hipotezu o nezavisnosti ove dve promenljive.</w:t>
+      </w:r>
+    </w:p>
+    <w:p>
+      <w:pPr>
+        <w:pStyle w:val="BodyText"/>
+      </w:pPr>
+      <w:r>
+        <w:t xml:space="preserve">Cramerov koeficijent V iznosi 0,450, što ukazuje na relativno jaku povezanost između svrhe putovanja i zadovoljstva putnika. Ova povezanost je izraženija nego kod prethodno analiziranih promenljivih</w:t>
+      </w:r>
+      <w:r>
+        <w:t xml:space="preserve"> </w:t>
+      </w:r>
+      <w:r>
+        <w:rPr>
+          <w:rStyle w:val="VerbatimChar"/>
+        </w:rPr>
+        <w:t xml:space="preserve">Gender</w:t>
+      </w:r>
+      <w:r>
+        <w:t xml:space="preserve"> </w:t>
+      </w:r>
+      <w:r>
+        <w:t xml:space="preserve">i</w:t>
+      </w:r>
+      <w:r>
+        <w:t xml:space="preserve"> </w:t>
+      </w:r>
+      <w:r>
+        <w:rPr>
+          <w:rStyle w:val="VerbatimChar"/>
+        </w:rPr>
+        <w:t xml:space="preserve">Customer_Type</w:t>
+      </w:r>
+      <w:r>
+        <w:t xml:space="preserve">, pa svrha putovanja u ovom skupu podataka ima veći potencijalni značaj za objašnjenje zadovoljstva putnika.</w:t>
+      </w:r>
+    </w:p>
+    <w:p>
+      <w:pPr>
+        <w:pStyle w:val="BodyText"/>
+      </w:pPr>
+      <w:r>
+        <w:t xml:space="preserve">Ipak, hi-kvadrat test i Cramerov V ne dokazuju uzročno-posledičnu vezu. Rezultati pokazuju da se zadovoljstvo putnika značajno razlikuje između poslovnih i ličnih putovanja u posmatranom skupu podataka, ali ne dokazuju da svrha putovanja direktno uzrokuje zadovoljstvo ili nezadovoljstvo.</w:t>
+      </w:r>
+    </w:p>
+    <w:p>
+      <w:pPr>
+        <w:pStyle w:val="BodyText"/>
+      </w:pPr>
+      <w:r>
+        <w:t xml:space="preserve">Konačna procena prediktorskog značaja promenljive</w:t>
+      </w:r>
+      <w:r>
+        <w:t xml:space="preserve"> </w:t>
+      </w:r>
+      <w:r>
+        <w:rPr>
+          <w:rStyle w:val="VerbatimChar"/>
+        </w:rPr>
+        <w:t xml:space="preserve">Type_of_Travel</w:t>
+      </w:r>
+      <w:r>
+        <w:t xml:space="preserve"> </w:t>
+      </w:r>
+      <w:r>
+        <w:t xml:space="preserve">biće izvršena u kasnijoj fazi, kroz izgradnju i evaluaciju modela mašinskog učenja i analizu važnosti promenljivih.</w:t>
+      </w:r>
+    </w:p>
+    <w:bookmarkEnd w:id="83"/>
+    <w:bookmarkEnd w:id="84"/>
+    <w:bookmarkEnd w:id="85"/>
     <w:sectPr>
       <w:pgSz w:h="15840" w:w="12240"/>
       <w:pgMar w:bottom="1440" w:footer="720" w:gutter="0" w:header="720" w:left="1440" w:right="1440" w:top="1440"/>

</xml_diff>

<commit_message>
zavrsena bivarijantana analiza kategorijskih promenljivih
</commit_message>
<xml_diff>
--- a/reports/airline_satisfaction.docx
+++ b/reports/airline_satisfaction.docx
@@ -4621,7 +4621,7 @@
     </w:p>
     <w:bookmarkEnd w:id="30"/>
     <w:bookmarkEnd w:id="31"/>
-    <w:bookmarkStart w:id="85" w:name="eksplorativna-analiza-podataka-eda"/>
+    <w:bookmarkStart w:id="89" w:name="eksplorativna-analiza-podataka-eda"/>
     <w:p>
       <w:pPr>
         <w:pStyle w:val="Heading1"/>
@@ -12899,7 +12899,7 @@
     </w:p>
     <w:bookmarkEnd w:id="69"/>
     <w:bookmarkEnd w:id="70"/>
-    <w:bookmarkStart w:id="84" w:name="bivarijantna-analiza"/>
+    <w:bookmarkStart w:id="88" w:name="bivarijantna-analiza"/>
     <w:p>
       <w:pPr>
         <w:pStyle w:val="Heading2"/>
@@ -17263,8 +17263,1552 @@
       </w:r>
     </w:p>
     <w:bookmarkEnd w:id="83"/>
-    <w:bookmarkEnd w:id="84"/>
-    <w:bookmarkEnd w:id="85"/>
+    <w:bookmarkStart w:id="87" w:name="X488e303a0d76b78a52a2f001d0bb69f55d331e5"/>
+    <w:p>
+      <w:pPr>
+        <w:pStyle w:val="Heading3"/>
+      </w:pPr>
+      <w:r>
+        <w:t xml:space="preserve">Odnos klase leta i zadovoljstva putnika (</w:t>
+      </w:r>
+      <w:r>
+        <w:rPr>
+          <w:rStyle w:val="VerbatimChar"/>
+        </w:rPr>
+        <w:t xml:space="preserve">Class</w:t>
+      </w:r>
+      <w:r>
+        <w:t xml:space="preserve">)</w:t>
+      </w:r>
+    </w:p>
+    <w:p>
+      <w:pPr>
+        <w:pStyle w:val="FirstParagraph"/>
+      </w:pPr>
+      <w:r>
+        <w:t xml:space="preserve">U nastavku ćemo ispitati da li se zadovoljstvo putnika razlikuje u zavisnosti od klase leta. Promenljiva</w:t>
+      </w:r>
+      <w:r>
+        <w:t xml:space="preserve"> </w:t>
+      </w:r>
+      <w:r>
+        <w:rPr>
+          <w:rStyle w:val="VerbatimChar"/>
+        </w:rPr>
+        <w:t xml:space="preserve">Class</w:t>
+      </w:r>
+      <w:r>
+        <w:t xml:space="preserve"> </w:t>
+      </w:r>
+      <w:r>
+        <w:t xml:space="preserve">sadrži tri kategorije:</w:t>
+      </w:r>
+      <w:r>
+        <w:t xml:space="preserve"> </w:t>
+      </w:r>
+      <w:r>
+        <w:rPr>
+          <w:rStyle w:val="VerbatimChar"/>
+        </w:rPr>
+        <w:t xml:space="preserve">Business</w:t>
+      </w:r>
+      <w:r>
+        <w:t xml:space="preserve">,</w:t>
+      </w:r>
+      <w:r>
+        <w:t xml:space="preserve"> </w:t>
+      </w:r>
+      <w:r>
+        <w:rPr>
+          <w:rStyle w:val="VerbatimChar"/>
+        </w:rPr>
+        <w:t xml:space="preserve">Eco</w:t>
+      </w:r>
+      <w:r>
+        <w:t xml:space="preserve"> </w:t>
+      </w:r>
+      <w:r>
+        <w:t xml:space="preserve">i</w:t>
+      </w:r>
+      <w:r>
+        <w:t xml:space="preserve"> </w:t>
+      </w:r>
+      <w:r>
+        <w:rPr>
+          <w:rStyle w:val="VerbatimChar"/>
+        </w:rPr>
+        <w:t xml:space="preserve">Eco Plus</w:t>
+      </w:r>
+      <w:r>
+        <w:t xml:space="preserve">.</w:t>
+      </w:r>
+    </w:p>
+    <w:p>
+      <w:pPr>
+        <w:pStyle w:val="BodyText"/>
+      </w:pPr>
+      <w:r>
+        <w:t xml:space="preserve">Za poređenje ovih grupa koristićemo relativne frekvencije, odnosno procenat zadovoljnih i nezadovoljnih putnika unutar svake klase leta. Na ovaj način možemo da uporedimo raspodelu zadovoljstva između klasa, nezavisno od njihovog ukupnog broja u skupu podataka.</w:t>
+      </w:r>
+    </w:p>
+    <w:p>
+      <w:pPr>
+        <w:pStyle w:val="SourceCode"/>
+      </w:pPr>
+      <w:r>
+        <w:rPr>
+          <w:rStyle w:val="NormalTok"/>
+        </w:rPr>
+        <w:t xml:space="preserve">class_satisfaction </w:t>
+      </w:r>
+      <w:r>
+        <w:rPr>
+          <w:rStyle w:val="OtherTok"/>
+        </w:rPr>
+        <w:t xml:space="preserve">&lt;-</w:t>
+      </w:r>
+      <w:r>
+        <w:rPr>
+          <w:rStyle w:val="NormalTok"/>
+        </w:rPr>
+        <w:t xml:space="preserve"> data </w:t>
+      </w:r>
+      <w:r>
+        <w:rPr>
+          <w:rStyle w:val="SpecialCharTok"/>
+        </w:rPr>
+        <w:t xml:space="preserve">%&gt;%</w:t>
+      </w:r>
+      <w:r>
+        <w:br/>
+      </w:r>
+      <w:r>
+        <w:rPr>
+          <w:rStyle w:val="NormalTok"/>
+        </w:rPr>
+        <w:t xml:space="preserve">  </w:t>
+      </w:r>
+      <w:r>
+        <w:rPr>
+          <w:rStyle w:val="FunctionTok"/>
+        </w:rPr>
+        <w:t xml:space="preserve">count</w:t>
+      </w:r>
+      <w:r>
+        <w:rPr>
+          <w:rStyle w:val="NormalTok"/>
+        </w:rPr>
+        <w:t xml:space="preserve">(Class, Satisfaction, </w:t>
+      </w:r>
+      <w:r>
+        <w:rPr>
+          <w:rStyle w:val="AttributeTok"/>
+        </w:rPr>
+        <w:t xml:space="preserve">name =</w:t>
+      </w:r>
+      <w:r>
+        <w:rPr>
+          <w:rStyle w:val="NormalTok"/>
+        </w:rPr>
+        <w:t xml:space="preserve"> </w:t>
+      </w:r>
+      <w:r>
+        <w:rPr>
+          <w:rStyle w:val="StringTok"/>
+        </w:rPr>
+        <w:t xml:space="preserve">"Broj"</w:t>
+      </w:r>
+      <w:r>
+        <w:rPr>
+          <w:rStyle w:val="NormalTok"/>
+        </w:rPr>
+        <w:t xml:space="preserve">) </w:t>
+      </w:r>
+      <w:r>
+        <w:rPr>
+          <w:rStyle w:val="SpecialCharTok"/>
+        </w:rPr>
+        <w:t xml:space="preserve">%&gt;%</w:t>
+      </w:r>
+      <w:r>
+        <w:br/>
+      </w:r>
+      <w:r>
+        <w:rPr>
+          <w:rStyle w:val="NormalTok"/>
+        </w:rPr>
+        <w:t xml:space="preserve">  </w:t>
+      </w:r>
+      <w:r>
+        <w:rPr>
+          <w:rStyle w:val="FunctionTok"/>
+        </w:rPr>
+        <w:t xml:space="preserve">group_by</w:t>
+      </w:r>
+      <w:r>
+        <w:rPr>
+          <w:rStyle w:val="NormalTok"/>
+        </w:rPr>
+        <w:t xml:space="preserve">(Class) </w:t>
+      </w:r>
+      <w:r>
+        <w:rPr>
+          <w:rStyle w:val="SpecialCharTok"/>
+        </w:rPr>
+        <w:t xml:space="preserve">%&gt;%</w:t>
+      </w:r>
+      <w:r>
+        <w:br/>
+      </w:r>
+      <w:r>
+        <w:rPr>
+          <w:rStyle w:val="NormalTok"/>
+        </w:rPr>
+        <w:t xml:space="preserve">  </w:t>
+      </w:r>
+      <w:r>
+        <w:rPr>
+          <w:rStyle w:val="FunctionTok"/>
+        </w:rPr>
+        <w:t xml:space="preserve">mutate</w:t>
+      </w:r>
+      <w:r>
+        <w:rPr>
+          <w:rStyle w:val="NormalTok"/>
+        </w:rPr>
+        <w:t xml:space="preserve">(</w:t>
+      </w:r>
+      <w:r>
+        <w:rPr>
+          <w:rStyle w:val="AttributeTok"/>
+        </w:rPr>
+        <w:t xml:space="preserve">Procenat =</w:t>
+      </w:r>
+      <w:r>
+        <w:rPr>
+          <w:rStyle w:val="NormalTok"/>
+        </w:rPr>
+        <w:t xml:space="preserve"> </w:t>
+      </w:r>
+      <w:r>
+        <w:rPr>
+          <w:rStyle w:val="FunctionTok"/>
+        </w:rPr>
+        <w:t xml:space="preserve">round</w:t>
+      </w:r>
+      <w:r>
+        <w:rPr>
+          <w:rStyle w:val="NormalTok"/>
+        </w:rPr>
+        <w:t xml:space="preserve">(Broj </w:t>
+      </w:r>
+      <w:r>
+        <w:rPr>
+          <w:rStyle w:val="SpecialCharTok"/>
+        </w:rPr>
+        <w:t xml:space="preserve">/</w:t>
+      </w:r>
+      <w:r>
+        <w:rPr>
+          <w:rStyle w:val="NormalTok"/>
+        </w:rPr>
+        <w:t xml:space="preserve"> </w:t>
+      </w:r>
+      <w:r>
+        <w:rPr>
+          <w:rStyle w:val="FunctionTok"/>
+        </w:rPr>
+        <w:t xml:space="preserve">sum</w:t>
+      </w:r>
+      <w:r>
+        <w:rPr>
+          <w:rStyle w:val="NormalTok"/>
+        </w:rPr>
+        <w:t xml:space="preserve">(Broj) </w:t>
+      </w:r>
+      <w:r>
+        <w:rPr>
+          <w:rStyle w:val="SpecialCharTok"/>
+        </w:rPr>
+        <w:t xml:space="preserve">*</w:t>
+      </w:r>
+      <w:r>
+        <w:rPr>
+          <w:rStyle w:val="NormalTok"/>
+        </w:rPr>
+        <w:t xml:space="preserve"> </w:t>
+      </w:r>
+      <w:r>
+        <w:rPr>
+          <w:rStyle w:val="DecValTok"/>
+        </w:rPr>
+        <w:t xml:space="preserve">100</w:t>
+      </w:r>
+      <w:r>
+        <w:rPr>
+          <w:rStyle w:val="NormalTok"/>
+        </w:rPr>
+        <w:t xml:space="preserve">, </w:t>
+      </w:r>
+      <w:r>
+        <w:rPr>
+          <w:rStyle w:val="DecValTok"/>
+        </w:rPr>
+        <w:t xml:space="preserve">2</w:t>
+      </w:r>
+      <w:r>
+        <w:rPr>
+          <w:rStyle w:val="NormalTok"/>
+        </w:rPr>
+        <w:t xml:space="preserve">)) </w:t>
+      </w:r>
+      <w:r>
+        <w:rPr>
+          <w:rStyle w:val="SpecialCharTok"/>
+        </w:rPr>
+        <w:t xml:space="preserve">%&gt;%</w:t>
+      </w:r>
+      <w:r>
+        <w:br/>
+      </w:r>
+      <w:r>
+        <w:rPr>
+          <w:rStyle w:val="NormalTok"/>
+        </w:rPr>
+        <w:t xml:space="preserve">  </w:t>
+      </w:r>
+      <w:r>
+        <w:rPr>
+          <w:rStyle w:val="FunctionTok"/>
+        </w:rPr>
+        <w:t xml:space="preserve">ungroup</w:t>
+      </w:r>
+      <w:r>
+        <w:rPr>
+          <w:rStyle w:val="NormalTok"/>
+        </w:rPr>
+        <w:t xml:space="preserve">()</w:t>
+      </w:r>
+      <w:r>
+        <w:br/>
+      </w:r>
+      <w:r>
+        <w:br/>
+      </w:r>
+      <w:r>
+        <w:rPr>
+          <w:rStyle w:val="NormalTok"/>
+        </w:rPr>
+        <w:t xml:space="preserve">class_satisfaction</w:t>
+      </w:r>
+    </w:p>
+    <w:p>
+      <w:pPr>
+        <w:pStyle w:val="SourceCode"/>
+      </w:pPr>
+      <w:r>
+        <w:rPr>
+          <w:rStyle w:val="VerbatimChar"/>
+        </w:rPr>
+        <w:t xml:space="preserve">## # A tibble: 6 × 4</w:t>
+      </w:r>
+      <w:r>
+        <w:br/>
+      </w:r>
+      <w:r>
+        <w:rPr>
+          <w:rStyle w:val="VerbatimChar"/>
+        </w:rPr>
+        <w:t xml:space="preserve">##   Class    Satisfaction   Broj Procenat</w:t>
+      </w:r>
+      <w:r>
+        <w:br/>
+      </w:r>
+      <w:r>
+        <w:rPr>
+          <w:rStyle w:val="VerbatimChar"/>
+        </w:rPr>
+        <w:t xml:space="preserve">##   &lt;fct&gt;    &lt;fct&gt;         &lt;int&gt;    &lt;dbl&gt;</w:t>
+      </w:r>
+      <w:r>
+        <w:br/>
+      </w:r>
+      <w:r>
+        <w:rPr>
+          <w:rStyle w:val="VerbatimChar"/>
+        </w:rPr>
+        <w:t xml:space="preserve">## 1 Business Satisfied     43166     69.4</w:t>
+      </w:r>
+      <w:r>
+        <w:br/>
+      </w:r>
+      <w:r>
+        <w:rPr>
+          <w:rStyle w:val="VerbatimChar"/>
+        </w:rPr>
+        <w:t xml:space="preserve">## 2 Business Not Satisfied 18994     30.6</w:t>
+      </w:r>
+      <w:r>
+        <w:br/>
+      </w:r>
+      <w:r>
+        <w:rPr>
+          <w:rStyle w:val="VerbatimChar"/>
+        </w:rPr>
+        <w:t xml:space="preserve">## 3 Eco      Satisfied     10943     18.8</w:t>
+      </w:r>
+      <w:r>
+        <w:br/>
+      </w:r>
+      <w:r>
+        <w:rPr>
+          <w:rStyle w:val="VerbatimChar"/>
+        </w:rPr>
+        <w:t xml:space="preserve">## 4 Eco      Not Satisfied 47366     81.2</w:t>
+      </w:r>
+      <w:r>
+        <w:br/>
+      </w:r>
+      <w:r>
+        <w:rPr>
+          <w:rStyle w:val="VerbatimChar"/>
+        </w:rPr>
+        <w:t xml:space="preserve">## 5 Eco Plus Satisfied      2319     24.6</w:t>
+      </w:r>
+      <w:r>
+        <w:br/>
+      </w:r>
+      <w:r>
+        <w:rPr>
+          <w:rStyle w:val="VerbatimChar"/>
+        </w:rPr>
+        <w:t xml:space="preserve">## 6 Eco Plus Not Satisfied  7092     75.4</w:t>
+      </w:r>
+    </w:p>
+    <w:p>
+      <w:pPr>
+        <w:pStyle w:val="FirstParagraph"/>
+      </w:pPr>
+      <w:r>
+        <w:t xml:space="preserve">Da bismo vizuelno uporedili raspodelu zadovoljstva između različitih klasa leta, prikazaćemo proporcionalni stubičasti dijagram. Svaki stub predstavlja 100% putnika unutar jedne klase, dok boje prikazuju procenat zadovoljnih i nezadovoljnih putnika.</w:t>
+      </w:r>
+    </w:p>
+    <w:p>
+      <w:pPr>
+        <w:pStyle w:val="SourceCode"/>
+      </w:pPr>
+      <w:r>
+        <w:rPr>
+          <w:rStyle w:val="FunctionTok"/>
+        </w:rPr>
+        <w:t xml:space="preserve">ggplot</w:t>
+      </w:r>
+      <w:r>
+        <w:rPr>
+          <w:rStyle w:val="NormalTok"/>
+        </w:rPr>
+        <w:t xml:space="preserve">(data, </w:t>
+      </w:r>
+      <w:r>
+        <w:rPr>
+          <w:rStyle w:val="FunctionTok"/>
+        </w:rPr>
+        <w:t xml:space="preserve">aes</w:t>
+      </w:r>
+      <w:r>
+        <w:rPr>
+          <w:rStyle w:val="NormalTok"/>
+        </w:rPr>
+        <w:t xml:space="preserve">(</w:t>
+      </w:r>
+      <w:r>
+        <w:rPr>
+          <w:rStyle w:val="AttributeTok"/>
+        </w:rPr>
+        <w:t xml:space="preserve">x =</w:t>
+      </w:r>
+      <w:r>
+        <w:rPr>
+          <w:rStyle w:val="NormalTok"/>
+        </w:rPr>
+        <w:t xml:space="preserve"> Class, </w:t>
+      </w:r>
+      <w:r>
+        <w:rPr>
+          <w:rStyle w:val="AttributeTok"/>
+        </w:rPr>
+        <w:t xml:space="preserve">fill =</w:t>
+      </w:r>
+      <w:r>
+        <w:rPr>
+          <w:rStyle w:val="NormalTok"/>
+        </w:rPr>
+        <w:t xml:space="preserve"> Satisfaction)) </w:t>
+      </w:r>
+      <w:r>
+        <w:rPr>
+          <w:rStyle w:val="SpecialCharTok"/>
+        </w:rPr>
+        <w:t xml:space="preserve">+</w:t>
+      </w:r>
+      <w:r>
+        <w:br/>
+      </w:r>
+      <w:r>
+        <w:rPr>
+          <w:rStyle w:val="NormalTok"/>
+        </w:rPr>
+        <w:t xml:space="preserve">  </w:t>
+      </w:r>
+      <w:r>
+        <w:rPr>
+          <w:rStyle w:val="FunctionTok"/>
+        </w:rPr>
+        <w:t xml:space="preserve">geom_bar</w:t>
+      </w:r>
+      <w:r>
+        <w:rPr>
+          <w:rStyle w:val="NormalTok"/>
+        </w:rPr>
+        <w:t xml:space="preserve">(</w:t>
+      </w:r>
+      <w:r>
+        <w:rPr>
+          <w:rStyle w:val="AttributeTok"/>
+        </w:rPr>
+        <w:t xml:space="preserve">position =</w:t>
+      </w:r>
+      <w:r>
+        <w:rPr>
+          <w:rStyle w:val="NormalTok"/>
+        </w:rPr>
+        <w:t xml:space="preserve"> </w:t>
+      </w:r>
+      <w:r>
+        <w:rPr>
+          <w:rStyle w:val="StringTok"/>
+        </w:rPr>
+        <w:t xml:space="preserve">"fill"</w:t>
+      </w:r>
+      <w:r>
+        <w:rPr>
+          <w:rStyle w:val="NormalTok"/>
+        </w:rPr>
+        <w:t xml:space="preserve">) </w:t>
+      </w:r>
+      <w:r>
+        <w:rPr>
+          <w:rStyle w:val="SpecialCharTok"/>
+        </w:rPr>
+        <w:t xml:space="preserve">+</w:t>
+      </w:r>
+      <w:r>
+        <w:br/>
+      </w:r>
+      <w:r>
+        <w:rPr>
+          <w:rStyle w:val="NormalTok"/>
+        </w:rPr>
+        <w:t xml:space="preserve">  </w:t>
+      </w:r>
+      <w:r>
+        <w:rPr>
+          <w:rStyle w:val="FunctionTok"/>
+        </w:rPr>
+        <w:t xml:space="preserve">scale_y_continuous</w:t>
+      </w:r>
+      <w:r>
+        <w:rPr>
+          <w:rStyle w:val="NormalTok"/>
+        </w:rPr>
+        <w:t xml:space="preserve">(</w:t>
+      </w:r>
+      <w:r>
+        <w:br/>
+      </w:r>
+      <w:r>
+        <w:rPr>
+          <w:rStyle w:val="NormalTok"/>
+        </w:rPr>
+        <w:t xml:space="preserve">    </w:t>
+      </w:r>
+      <w:r>
+        <w:rPr>
+          <w:rStyle w:val="AttributeTok"/>
+        </w:rPr>
+        <w:t xml:space="preserve">labels =</w:t>
+      </w:r>
+      <w:r>
+        <w:rPr>
+          <w:rStyle w:val="NormalTok"/>
+        </w:rPr>
+        <w:t xml:space="preserve"> scales</w:t>
+      </w:r>
+      <w:r>
+        <w:rPr>
+          <w:rStyle w:val="SpecialCharTok"/>
+        </w:rPr>
+        <w:t xml:space="preserve">::</w:t>
+      </w:r>
+      <w:r>
+        <w:rPr>
+          <w:rStyle w:val="FunctionTok"/>
+        </w:rPr>
+        <w:t xml:space="preserve">percent_format</w:t>
+      </w:r>
+      <w:r>
+        <w:rPr>
+          <w:rStyle w:val="NormalTok"/>
+        </w:rPr>
+        <w:t xml:space="preserve">()</w:t>
+      </w:r>
+      <w:r>
+        <w:br/>
+      </w:r>
+      <w:r>
+        <w:rPr>
+          <w:rStyle w:val="NormalTok"/>
+        </w:rPr>
+        <w:t xml:space="preserve">  ) </w:t>
+      </w:r>
+      <w:r>
+        <w:rPr>
+          <w:rStyle w:val="SpecialCharTok"/>
+        </w:rPr>
+        <w:t xml:space="preserve">+</w:t>
+      </w:r>
+      <w:r>
+        <w:br/>
+      </w:r>
+      <w:r>
+        <w:rPr>
+          <w:rStyle w:val="NormalTok"/>
+        </w:rPr>
+        <w:t xml:space="preserve">  </w:t>
+      </w:r>
+      <w:r>
+        <w:rPr>
+          <w:rStyle w:val="FunctionTok"/>
+        </w:rPr>
+        <w:t xml:space="preserve">scale_fill_manual</w:t>
+      </w:r>
+      <w:r>
+        <w:rPr>
+          <w:rStyle w:val="NormalTok"/>
+        </w:rPr>
+        <w:t xml:space="preserve">(</w:t>
+      </w:r>
+      <w:r>
+        <w:br/>
+      </w:r>
+      <w:r>
+        <w:rPr>
+          <w:rStyle w:val="NormalTok"/>
+        </w:rPr>
+        <w:t xml:space="preserve">    </w:t>
+      </w:r>
+      <w:r>
+        <w:rPr>
+          <w:rStyle w:val="AttributeTok"/>
+        </w:rPr>
+        <w:t xml:space="preserve">values =</w:t>
+      </w:r>
+      <w:r>
+        <w:rPr>
+          <w:rStyle w:val="NormalTok"/>
+        </w:rPr>
+        <w:t xml:space="preserve"> </w:t>
+      </w:r>
+      <w:r>
+        <w:rPr>
+          <w:rStyle w:val="FunctionTok"/>
+        </w:rPr>
+        <w:t xml:space="preserve">c</w:t>
+      </w:r>
+      <w:r>
+        <w:rPr>
+          <w:rStyle w:val="NormalTok"/>
+        </w:rPr>
+        <w:t xml:space="preserve">(</w:t>
+      </w:r>
+      <w:r>
+        <w:br/>
+      </w:r>
+      <w:r>
+        <w:rPr>
+          <w:rStyle w:val="NormalTok"/>
+        </w:rPr>
+        <w:t xml:space="preserve">      </w:t>
+      </w:r>
+      <w:r>
+        <w:rPr>
+          <w:rStyle w:val="StringTok"/>
+        </w:rPr>
+        <w:t xml:space="preserve">"Satisfied"</w:t>
+      </w:r>
+      <w:r>
+        <w:rPr>
+          <w:rStyle w:val="NormalTok"/>
+        </w:rPr>
+        <w:t xml:space="preserve"> </w:t>
+      </w:r>
+      <w:r>
+        <w:rPr>
+          <w:rStyle w:val="OtherTok"/>
+        </w:rPr>
+        <w:t xml:space="preserve">=</w:t>
+      </w:r>
+      <w:r>
+        <w:rPr>
+          <w:rStyle w:val="NormalTok"/>
+        </w:rPr>
+        <w:t xml:space="preserve"> </w:t>
+      </w:r>
+      <w:r>
+        <w:rPr>
+          <w:rStyle w:val="StringTok"/>
+        </w:rPr>
+        <w:t xml:space="preserve">"#2ecc71"</w:t>
+      </w:r>
+      <w:r>
+        <w:rPr>
+          <w:rStyle w:val="NormalTok"/>
+        </w:rPr>
+        <w:t xml:space="preserve">,</w:t>
+      </w:r>
+      <w:r>
+        <w:br/>
+      </w:r>
+      <w:r>
+        <w:rPr>
+          <w:rStyle w:val="NormalTok"/>
+        </w:rPr>
+        <w:t xml:space="preserve">      </w:t>
+      </w:r>
+      <w:r>
+        <w:rPr>
+          <w:rStyle w:val="StringTok"/>
+        </w:rPr>
+        <w:t xml:space="preserve">"Not Satisfied"</w:t>
+      </w:r>
+      <w:r>
+        <w:rPr>
+          <w:rStyle w:val="NormalTok"/>
+        </w:rPr>
+        <w:t xml:space="preserve"> </w:t>
+      </w:r>
+      <w:r>
+        <w:rPr>
+          <w:rStyle w:val="OtherTok"/>
+        </w:rPr>
+        <w:t xml:space="preserve">=</w:t>
+      </w:r>
+      <w:r>
+        <w:rPr>
+          <w:rStyle w:val="NormalTok"/>
+        </w:rPr>
+        <w:t xml:space="preserve"> </w:t>
+      </w:r>
+      <w:r>
+        <w:rPr>
+          <w:rStyle w:val="StringTok"/>
+        </w:rPr>
+        <w:t xml:space="preserve">"#e74c3c"</w:t>
+      </w:r>
+      <w:r>
+        <w:br/>
+      </w:r>
+      <w:r>
+        <w:rPr>
+          <w:rStyle w:val="NormalTok"/>
+        </w:rPr>
+        <w:t xml:space="preserve">    )</w:t>
+      </w:r>
+      <w:r>
+        <w:br/>
+      </w:r>
+      <w:r>
+        <w:rPr>
+          <w:rStyle w:val="NormalTok"/>
+        </w:rPr>
+        <w:t xml:space="preserve">  ) </w:t>
+      </w:r>
+      <w:r>
+        <w:rPr>
+          <w:rStyle w:val="SpecialCharTok"/>
+        </w:rPr>
+        <w:t xml:space="preserve">+</w:t>
+      </w:r>
+      <w:r>
+        <w:br/>
+      </w:r>
+      <w:r>
+        <w:rPr>
+          <w:rStyle w:val="NormalTok"/>
+        </w:rPr>
+        <w:t xml:space="preserve">  </w:t>
+      </w:r>
+      <w:r>
+        <w:rPr>
+          <w:rStyle w:val="FunctionTok"/>
+        </w:rPr>
+        <w:t xml:space="preserve">theme_minimal</w:t>
+      </w:r>
+      <w:r>
+        <w:rPr>
+          <w:rStyle w:val="NormalTok"/>
+        </w:rPr>
+        <w:t xml:space="preserve">() </w:t>
+      </w:r>
+      <w:r>
+        <w:rPr>
+          <w:rStyle w:val="SpecialCharTok"/>
+        </w:rPr>
+        <w:t xml:space="preserve">+</w:t>
+      </w:r>
+      <w:r>
+        <w:br/>
+      </w:r>
+      <w:r>
+        <w:rPr>
+          <w:rStyle w:val="NormalTok"/>
+        </w:rPr>
+        <w:t xml:space="preserve">  </w:t>
+      </w:r>
+      <w:r>
+        <w:rPr>
+          <w:rStyle w:val="FunctionTok"/>
+        </w:rPr>
+        <w:t xml:space="preserve">labs</w:t>
+      </w:r>
+      <w:r>
+        <w:rPr>
+          <w:rStyle w:val="NormalTok"/>
+        </w:rPr>
+        <w:t xml:space="preserve">(</w:t>
+      </w:r>
+      <w:r>
+        <w:br/>
+      </w:r>
+      <w:r>
+        <w:rPr>
+          <w:rStyle w:val="NormalTok"/>
+        </w:rPr>
+        <w:t xml:space="preserve">    </w:t>
+      </w:r>
+      <w:r>
+        <w:rPr>
+          <w:rStyle w:val="AttributeTok"/>
+        </w:rPr>
+        <w:t xml:space="preserve">title =</w:t>
+      </w:r>
+      <w:r>
+        <w:rPr>
+          <w:rStyle w:val="NormalTok"/>
+        </w:rPr>
+        <w:t xml:space="preserve"> </w:t>
+      </w:r>
+      <w:r>
+        <w:rPr>
+          <w:rStyle w:val="StringTok"/>
+        </w:rPr>
+        <w:t xml:space="preserve">"Zadovoljstvo putnika prema klasi leta"</w:t>
+      </w:r>
+      <w:r>
+        <w:rPr>
+          <w:rStyle w:val="NormalTok"/>
+        </w:rPr>
+        <w:t xml:space="preserve">,</w:t>
+      </w:r>
+      <w:r>
+        <w:br/>
+      </w:r>
+      <w:r>
+        <w:rPr>
+          <w:rStyle w:val="NormalTok"/>
+        </w:rPr>
+        <w:t xml:space="preserve">    </w:t>
+      </w:r>
+      <w:r>
+        <w:rPr>
+          <w:rStyle w:val="AttributeTok"/>
+        </w:rPr>
+        <w:t xml:space="preserve">x =</w:t>
+      </w:r>
+      <w:r>
+        <w:rPr>
+          <w:rStyle w:val="NormalTok"/>
+        </w:rPr>
+        <w:t xml:space="preserve"> </w:t>
+      </w:r>
+      <w:r>
+        <w:rPr>
+          <w:rStyle w:val="StringTok"/>
+        </w:rPr>
+        <w:t xml:space="preserve">"Klasa leta"</w:t>
+      </w:r>
+      <w:r>
+        <w:rPr>
+          <w:rStyle w:val="NormalTok"/>
+        </w:rPr>
+        <w:t xml:space="preserve">,</w:t>
+      </w:r>
+      <w:r>
+        <w:br/>
+      </w:r>
+      <w:r>
+        <w:rPr>
+          <w:rStyle w:val="NormalTok"/>
+        </w:rPr>
+        <w:t xml:space="preserve">    </w:t>
+      </w:r>
+      <w:r>
+        <w:rPr>
+          <w:rStyle w:val="AttributeTok"/>
+        </w:rPr>
+        <w:t xml:space="preserve">y =</w:t>
+      </w:r>
+      <w:r>
+        <w:rPr>
+          <w:rStyle w:val="NormalTok"/>
+        </w:rPr>
+        <w:t xml:space="preserve"> </w:t>
+      </w:r>
+      <w:r>
+        <w:rPr>
+          <w:rStyle w:val="StringTok"/>
+        </w:rPr>
+        <w:t xml:space="preserve">"Procenat putnika"</w:t>
+      </w:r>
+      <w:r>
+        <w:rPr>
+          <w:rStyle w:val="NormalTok"/>
+        </w:rPr>
+        <w:t xml:space="preserve">,</w:t>
+      </w:r>
+      <w:r>
+        <w:br/>
+      </w:r>
+      <w:r>
+        <w:rPr>
+          <w:rStyle w:val="NormalTok"/>
+        </w:rPr>
+        <w:t xml:space="preserve">    </w:t>
+      </w:r>
+      <w:r>
+        <w:rPr>
+          <w:rStyle w:val="AttributeTok"/>
+        </w:rPr>
+        <w:t xml:space="preserve">fill =</w:t>
+      </w:r>
+      <w:r>
+        <w:rPr>
+          <w:rStyle w:val="NormalTok"/>
+        </w:rPr>
+        <w:t xml:space="preserve"> </w:t>
+      </w:r>
+      <w:r>
+        <w:rPr>
+          <w:rStyle w:val="StringTok"/>
+        </w:rPr>
+        <w:t xml:space="preserve">"Status zadovoljstva"</w:t>
+      </w:r>
+      <w:r>
+        <w:br/>
+      </w:r>
+      <w:r>
+        <w:rPr>
+          <w:rStyle w:val="NormalTok"/>
+        </w:rPr>
+        <w:t xml:space="preserve">  )</w:t>
+      </w:r>
+    </w:p>
+    <w:p>
+      <w:pPr>
+        <w:pStyle w:val="FirstParagraph"/>
+      </w:pPr>
+      <w:r>
+        <w:drawing>
+          <wp:inline>
+            <wp:extent cx="5943600" cy="3714750"/>
+            <wp:effectExtent b="0" l="0" r="0" t="0"/>
+            <wp:docPr descr="" title="" id="85" name="Picture"/>
+            <a:graphic>
+              <a:graphicData uri="http://schemas.openxmlformats.org/drawingml/2006/picture">
+                <pic:pic>
+                  <pic:nvPicPr>
+                    <pic:cNvPr descr="airline_satisfaction_files/figure-docx/unnamed-chunk-42-1.png" id="86" name="Picture"/>
+                    <pic:cNvPicPr>
+                      <a:picLocks noChangeArrowheads="1" noChangeAspect="1"/>
+                    </pic:cNvPicPr>
+                  </pic:nvPicPr>
+                  <pic:blipFill>
+                    <a:blip r:embed="rId84"/>
+                    <a:stretch>
+                      <a:fillRect/>
+                    </a:stretch>
+                  </pic:blipFill>
+                  <pic:spPr bwMode="auto">
+                    <a:xfrm>
+                      <a:off x="0" y="0"/>
+                      <a:ext cx="5943600" cy="3714750"/>
+                    </a:xfrm>
+                    <a:prstGeom prst="rect">
+                      <a:avLst/>
+                    </a:prstGeom>
+                    <a:noFill/>
+                    <a:ln w="9525">
+                      <a:noFill/>
+                      <a:headEnd/>
+                      <a:tailEnd/>
+                    </a:ln>
+                  </pic:spPr>
+                </pic:pic>
+              </a:graphicData>
+            </a:graphic>
+          </wp:inline>
+        </w:drawing>
+      </w:r>
+    </w:p>
+    <w:p>
+      <w:pPr>
+        <w:pStyle w:val="BodyText"/>
+      </w:pPr>
+      <w:r>
+        <w:t xml:space="preserve">Na osnovu tabele i proporcionalnog stubičastog dijagrama uočava se izražena razlika u raspodeli zadovoljstva između klasa leta. U poslovnoj klasi zadovoljni putnici čine 69,4%, dok nezadovoljni čine 30,6%. U ekonomskoj klasi zadovoljni putnici čine 18,8%, a nezadovoljni 81,2%. Kod klase</w:t>
+      </w:r>
+      <w:r>
+        <w:t xml:space="preserve"> </w:t>
+      </w:r>
+      <w:r>
+        <w:rPr>
+          <w:rStyle w:val="VerbatimChar"/>
+        </w:rPr>
+        <w:t xml:space="preserve">Eco Plus</w:t>
+      </w:r>
+      <w:r>
+        <w:t xml:space="preserve"> </w:t>
+      </w:r>
+      <w:r>
+        <w:t xml:space="preserve">zadovoljni putnici čine 24,6%, dok nezadovoljni čine 75,4%.</w:t>
+      </w:r>
+    </w:p>
+    <w:p>
+      <w:pPr>
+        <w:pStyle w:val="BodyText"/>
+      </w:pPr>
+      <w:r>
+        <w:t xml:space="preserve">Najveći udeo zadovoljnih putnika zabeležen je u poslovnoj klasi. U odnosu na ekonomsku klasu, razlika iznosi približno 50,67 procentnih poena, dok u odnosu na klasu</w:t>
+      </w:r>
+      <w:r>
+        <w:t xml:space="preserve"> </w:t>
+      </w:r>
+      <w:r>
+        <w:rPr>
+          <w:rStyle w:val="VerbatimChar"/>
+        </w:rPr>
+        <w:t xml:space="preserve">Eco Plus</w:t>
+      </w:r>
+      <w:r>
+        <w:t xml:space="preserve"> </w:t>
+      </w:r>
+      <w:r>
+        <w:t xml:space="preserve">iznosi približno 44,80 procentnih poena. Ovi rezultati ukazuju na moguću povezanost između klase leta i zadovoljstva putnika, koju ćemo formalno proveriti hi-kvadrat testom nezavisnosti.</w:t>
+      </w:r>
+    </w:p>
+    <w:p>
+      <w:pPr>
+        <w:pStyle w:val="BodyText"/>
+      </w:pPr>
+      <w:r>
+        <w:t xml:space="preserve">Nulta hipoteza glasi da su klasa leta i zadovoljstvo putnika nezavisne promenljive. Alternativna hipoteza glasi da između klase leta i zadovoljstva putnika postoji povezanost.</w:t>
+      </w:r>
+    </w:p>
+    <w:p>
+      <w:pPr>
+        <w:pStyle w:val="SourceCode"/>
+      </w:pPr>
+      <w:r>
+        <w:rPr>
+          <w:rStyle w:val="NormalTok"/>
+        </w:rPr>
+        <w:t xml:space="preserve">class_satisfaction_table </w:t>
+      </w:r>
+      <w:r>
+        <w:rPr>
+          <w:rStyle w:val="OtherTok"/>
+        </w:rPr>
+        <w:t xml:space="preserve">&lt;-</w:t>
+      </w:r>
+      <w:r>
+        <w:rPr>
+          <w:rStyle w:val="NormalTok"/>
+        </w:rPr>
+        <w:t xml:space="preserve"> </w:t>
+      </w:r>
+      <w:r>
+        <w:rPr>
+          <w:rStyle w:val="FunctionTok"/>
+        </w:rPr>
+        <w:t xml:space="preserve">table</w:t>
+      </w:r>
+      <w:r>
+        <w:rPr>
+          <w:rStyle w:val="NormalTok"/>
+        </w:rPr>
+        <w:t xml:space="preserve">(</w:t>
+      </w:r>
+      <w:r>
+        <w:br/>
+      </w:r>
+      <w:r>
+        <w:rPr>
+          <w:rStyle w:val="NormalTok"/>
+        </w:rPr>
+        <w:t xml:space="preserve">  data</w:t>
+      </w:r>
+      <w:r>
+        <w:rPr>
+          <w:rStyle w:val="SpecialCharTok"/>
+        </w:rPr>
+        <w:t xml:space="preserve">$</w:t>
+      </w:r>
+      <w:r>
+        <w:rPr>
+          <w:rStyle w:val="NormalTok"/>
+        </w:rPr>
+        <w:t xml:space="preserve">Class,</w:t>
+      </w:r>
+      <w:r>
+        <w:br/>
+      </w:r>
+      <w:r>
+        <w:rPr>
+          <w:rStyle w:val="NormalTok"/>
+        </w:rPr>
+        <w:t xml:space="preserve">  data</w:t>
+      </w:r>
+      <w:r>
+        <w:rPr>
+          <w:rStyle w:val="SpecialCharTok"/>
+        </w:rPr>
+        <w:t xml:space="preserve">$</w:t>
+      </w:r>
+      <w:r>
+        <w:rPr>
+          <w:rStyle w:val="NormalTok"/>
+        </w:rPr>
+        <w:t xml:space="preserve">Satisfaction</w:t>
+      </w:r>
+      <w:r>
+        <w:br/>
+      </w:r>
+      <w:r>
+        <w:rPr>
+          <w:rStyle w:val="NormalTok"/>
+        </w:rPr>
+        <w:t xml:space="preserve">)</w:t>
+      </w:r>
+      <w:r>
+        <w:br/>
+      </w:r>
+      <w:r>
+        <w:br/>
+      </w:r>
+      <w:r>
+        <w:rPr>
+          <w:rStyle w:val="NormalTok"/>
+        </w:rPr>
+        <w:t xml:space="preserve">class_satisfaction_table</w:t>
+      </w:r>
+    </w:p>
+    <w:p>
+      <w:pPr>
+        <w:pStyle w:val="SourceCode"/>
+      </w:pPr>
+      <w:r>
+        <w:rPr>
+          <w:rStyle w:val="VerbatimChar"/>
+        </w:rPr>
+        <w:t xml:space="preserve">##           </w:t>
+      </w:r>
+      <w:r>
+        <w:br/>
+      </w:r>
+      <w:r>
+        <w:rPr>
+          <w:rStyle w:val="VerbatimChar"/>
+        </w:rPr>
+        <w:t xml:space="preserve">##            Satisfied Not Satisfied</w:t>
+      </w:r>
+      <w:r>
+        <w:br/>
+      </w:r>
+      <w:r>
+        <w:rPr>
+          <w:rStyle w:val="VerbatimChar"/>
+        </w:rPr>
+        <w:t xml:space="preserve">##   Business     43166         18994</w:t>
+      </w:r>
+      <w:r>
+        <w:br/>
+      </w:r>
+      <w:r>
+        <w:rPr>
+          <w:rStyle w:val="VerbatimChar"/>
+        </w:rPr>
+        <w:t xml:space="preserve">##   Eco          10943         47366</w:t>
+      </w:r>
+      <w:r>
+        <w:br/>
+      </w:r>
+      <w:r>
+        <w:rPr>
+          <w:rStyle w:val="VerbatimChar"/>
+        </w:rPr>
+        <w:t xml:space="preserve">##   Eco Plus      2319          7092</w:t>
+      </w:r>
+    </w:p>
+    <w:p>
+      <w:pPr>
+        <w:pStyle w:val="SourceCode"/>
+      </w:pPr>
+      <w:r>
+        <w:rPr>
+          <w:rStyle w:val="NormalTok"/>
+        </w:rPr>
+        <w:t xml:space="preserve">class_chisq </w:t>
+      </w:r>
+      <w:r>
+        <w:rPr>
+          <w:rStyle w:val="OtherTok"/>
+        </w:rPr>
+        <w:t xml:space="preserve">&lt;-</w:t>
+      </w:r>
+      <w:r>
+        <w:rPr>
+          <w:rStyle w:val="NormalTok"/>
+        </w:rPr>
+        <w:t xml:space="preserve"> </w:t>
+      </w:r>
+      <w:r>
+        <w:rPr>
+          <w:rStyle w:val="FunctionTok"/>
+        </w:rPr>
+        <w:t xml:space="preserve">chisq.test</w:t>
+      </w:r>
+      <w:r>
+        <w:rPr>
+          <w:rStyle w:val="NormalTok"/>
+        </w:rPr>
+        <w:t xml:space="preserve">(</w:t>
+      </w:r>
+      <w:r>
+        <w:br/>
+      </w:r>
+      <w:r>
+        <w:rPr>
+          <w:rStyle w:val="NormalTok"/>
+        </w:rPr>
+        <w:t xml:space="preserve">  class_satisfaction_table,</w:t>
+      </w:r>
+      <w:r>
+        <w:br/>
+      </w:r>
+      <w:r>
+        <w:rPr>
+          <w:rStyle w:val="NormalTok"/>
+        </w:rPr>
+        <w:t xml:space="preserve">  </w:t>
+      </w:r>
+      <w:r>
+        <w:rPr>
+          <w:rStyle w:val="AttributeTok"/>
+        </w:rPr>
+        <w:t xml:space="preserve">correct =</w:t>
+      </w:r>
+      <w:r>
+        <w:rPr>
+          <w:rStyle w:val="NormalTok"/>
+        </w:rPr>
+        <w:t xml:space="preserve"> </w:t>
+      </w:r>
+      <w:r>
+        <w:rPr>
+          <w:rStyle w:val="ConstantTok"/>
+        </w:rPr>
+        <w:t xml:space="preserve">FALSE</w:t>
+      </w:r>
+      <w:r>
+        <w:br/>
+      </w:r>
+      <w:r>
+        <w:rPr>
+          <w:rStyle w:val="NormalTok"/>
+        </w:rPr>
+        <w:t xml:space="preserve">)</w:t>
+      </w:r>
+      <w:r>
+        <w:br/>
+      </w:r>
+      <w:r>
+        <w:br/>
+      </w:r>
+      <w:r>
+        <w:rPr>
+          <w:rStyle w:val="NormalTok"/>
+        </w:rPr>
+        <w:t xml:space="preserve">class_chisq</w:t>
+      </w:r>
+    </w:p>
+    <w:p>
+      <w:pPr>
+        <w:pStyle w:val="SourceCode"/>
+      </w:pPr>
+      <w:r>
+        <w:rPr>
+          <w:rStyle w:val="VerbatimChar"/>
+        </w:rPr>
+        <w:t xml:space="preserve">## </w:t>
+      </w:r>
+      <w:r>
+        <w:br/>
+      </w:r>
+      <w:r>
+        <w:rPr>
+          <w:rStyle w:val="VerbatimChar"/>
+        </w:rPr>
+        <w:t xml:space="preserve">##  Pearson's Chi-squared test</w:t>
+      </w:r>
+      <w:r>
+        <w:br/>
+      </w:r>
+      <w:r>
+        <w:rPr>
+          <w:rStyle w:val="VerbatimChar"/>
+        </w:rPr>
+        <w:t xml:space="preserve">## </w:t>
+      </w:r>
+      <w:r>
+        <w:br/>
+      </w:r>
+      <w:r>
+        <w:rPr>
+          <w:rStyle w:val="VerbatimChar"/>
+        </w:rPr>
+        <w:t xml:space="preserve">## data:  class_satisfaction_table</w:t>
+      </w:r>
+      <w:r>
+        <w:br/>
+      </w:r>
+      <w:r>
+        <w:rPr>
+          <w:rStyle w:val="VerbatimChar"/>
+        </w:rPr>
+        <w:t xml:space="preserve">## X-squared = 32906, df = 2, p-value &lt; 2.2e-16</w:t>
+      </w:r>
+    </w:p>
+    <w:p>
+      <w:pPr>
+        <w:pStyle w:val="FirstParagraph"/>
+      </w:pPr>
+      <w:r>
+        <w:t xml:space="preserve">Za procenu jačine povezanosti između klase leta i zadovoljstva putnika izračunaćemo Cramerov koeficijent V.</w:t>
+      </w:r>
+    </w:p>
+    <w:p>
+      <w:pPr>
+        <w:pStyle w:val="SourceCode"/>
+      </w:pPr>
+      <w:r>
+        <w:rPr>
+          <w:rStyle w:val="NormalTok"/>
+        </w:rPr>
+        <w:t xml:space="preserve">n </w:t>
+      </w:r>
+      <w:r>
+        <w:rPr>
+          <w:rStyle w:val="OtherTok"/>
+        </w:rPr>
+        <w:t xml:space="preserve">&lt;-</w:t>
+      </w:r>
+      <w:r>
+        <w:rPr>
+          <w:rStyle w:val="NormalTok"/>
+        </w:rPr>
+        <w:t xml:space="preserve"> </w:t>
+      </w:r>
+      <w:r>
+        <w:rPr>
+          <w:rStyle w:val="FunctionTok"/>
+        </w:rPr>
+        <w:t xml:space="preserve">sum</w:t>
+      </w:r>
+      <w:r>
+        <w:rPr>
+          <w:rStyle w:val="NormalTok"/>
+        </w:rPr>
+        <w:t xml:space="preserve">(class_satisfaction_table)</w:t>
+      </w:r>
+      <w:r>
+        <w:br/>
+      </w:r>
+      <w:r>
+        <w:rPr>
+          <w:rStyle w:val="NormalTok"/>
+        </w:rPr>
+        <w:t xml:space="preserve">chi_square </w:t>
+      </w:r>
+      <w:r>
+        <w:rPr>
+          <w:rStyle w:val="OtherTok"/>
+        </w:rPr>
+        <w:t xml:space="preserve">&lt;-</w:t>
+      </w:r>
+      <w:r>
+        <w:rPr>
+          <w:rStyle w:val="NormalTok"/>
+        </w:rPr>
+        <w:t xml:space="preserve"> </w:t>
+      </w:r>
+      <w:r>
+        <w:rPr>
+          <w:rStyle w:val="FunctionTok"/>
+        </w:rPr>
+        <w:t xml:space="preserve">as.numeric</w:t>
+      </w:r>
+      <w:r>
+        <w:rPr>
+          <w:rStyle w:val="NormalTok"/>
+        </w:rPr>
+        <w:t xml:space="preserve">(class_chisq</w:t>
+      </w:r>
+      <w:r>
+        <w:rPr>
+          <w:rStyle w:val="SpecialCharTok"/>
+        </w:rPr>
+        <w:t xml:space="preserve">$</w:t>
+      </w:r>
+      <w:r>
+        <w:rPr>
+          <w:rStyle w:val="NormalTok"/>
+        </w:rPr>
+        <w:t xml:space="preserve">statistic)</w:t>
+      </w:r>
+      <w:r>
+        <w:br/>
+      </w:r>
+      <w:r>
+        <w:br/>
+      </w:r>
+      <w:r>
+        <w:rPr>
+          <w:rStyle w:val="NormalTok"/>
+        </w:rPr>
+        <w:t xml:space="preserve">class_cramers_v </w:t>
+      </w:r>
+      <w:r>
+        <w:rPr>
+          <w:rStyle w:val="OtherTok"/>
+        </w:rPr>
+        <w:t xml:space="preserve">&lt;-</w:t>
+      </w:r>
+      <w:r>
+        <w:rPr>
+          <w:rStyle w:val="NormalTok"/>
+        </w:rPr>
+        <w:t xml:space="preserve"> </w:t>
+      </w:r>
+      <w:r>
+        <w:rPr>
+          <w:rStyle w:val="FunctionTok"/>
+        </w:rPr>
+        <w:t xml:space="preserve">sqrt</w:t>
+      </w:r>
+      <w:r>
+        <w:rPr>
+          <w:rStyle w:val="NormalTok"/>
+        </w:rPr>
+        <w:t xml:space="preserve">(chi_square </w:t>
+      </w:r>
+      <w:r>
+        <w:rPr>
+          <w:rStyle w:val="SpecialCharTok"/>
+        </w:rPr>
+        <w:t xml:space="preserve">/</w:t>
+      </w:r>
+      <w:r>
+        <w:rPr>
+          <w:rStyle w:val="NormalTok"/>
+        </w:rPr>
+        <w:t xml:space="preserve"> n)</w:t>
+      </w:r>
+      <w:r>
+        <w:br/>
+      </w:r>
+      <w:r>
+        <w:br/>
+      </w:r>
+      <w:r>
+        <w:rPr>
+          <w:rStyle w:val="NormalTok"/>
+        </w:rPr>
+        <w:t xml:space="preserve">class_cramers_v</w:t>
+      </w:r>
+    </w:p>
+    <w:p>
+      <w:pPr>
+        <w:pStyle w:val="SourceCode"/>
+      </w:pPr>
+      <w:r>
+        <w:rPr>
+          <w:rStyle w:val="VerbatimChar"/>
+        </w:rPr>
+        <w:t xml:space="preserve">## [1] 0.5033471</w:t>
+      </w:r>
+    </w:p>
+    <w:p>
+      <w:pPr>
+        <w:pStyle w:val="FirstParagraph"/>
+      </w:pPr>
+      <w:r>
+        <w:t xml:space="preserve">Rezultat Pearsonovog hi-kvadrat testa pokazuje da postoji statistički značajna povezanost između klase leta i zadovoljstva putnika, χ²(2) = 32906, p &lt; 0,001. Na osnovu ovog rezultata odbacujemo nultu hipotezu o nezavisnosti ove dve promenljive.</w:t>
+      </w:r>
+    </w:p>
+    <w:p>
+      <w:pPr>
+        <w:pStyle w:val="BodyText"/>
+      </w:pPr>
+      <w:r>
+        <w:t xml:space="preserve">Cramerov koeficijent V iznosi 0,503, što ukazuje na jaku povezanost između klase leta i zadovoljstva putnika. Ovaj rezultat pokazuje da se raspodela zadovoljstva značajno razlikuje između različitih klasa leta i da klasa leta ima izraženiji potencijalni značaj za objašnjenje zadovoljstva nego prethodno analizirane kategorijske promenljive.</w:t>
+      </w:r>
+    </w:p>
+    <w:p>
+      <w:pPr>
+        <w:pStyle w:val="BodyText"/>
+      </w:pPr>
+      <w:r>
+        <w:t xml:space="preserve">Ipak, hi-kvadrat test i Cramerov V ne dokazuju uzročno-posledičnu vezu. Rezultat pokazuje da postoji povezanost između klase leta i zadovoljstva putnika u posmatranom skupu podataka, ali ne dokazuje da klasa leta direktno uzrokuje zadovoljstvo ili nezadovoljstvo. Konačna procena prediktorskog značaja promenljive</w:t>
+      </w:r>
+      <w:r>
+        <w:t xml:space="preserve"> </w:t>
+      </w:r>
+      <w:r>
+        <w:rPr>
+          <w:rStyle w:val="VerbatimChar"/>
+        </w:rPr>
+        <w:t xml:space="preserve">Class</w:t>
+      </w:r>
+      <w:r>
+        <w:t xml:space="preserve"> </w:t>
+      </w:r>
+      <w:r>
+        <w:t xml:space="preserve">biće izvršena u kasnijoj fazi kroz izgradnju i evaluaciju modela mašinskog učenja.</w:t>
+      </w:r>
+    </w:p>
+    <w:bookmarkEnd w:id="87"/>
+    <w:bookmarkEnd w:id="88"/>
+    <w:bookmarkEnd w:id="89"/>
     <w:sectPr>
       <w:pgSz w:h="15840" w:w="12240"/>
       <w:pgMar w:bottom="1440" w:footer="720" w:gutter="0" w:header="720" w:left="1440" w:right="1440" w:top="1440"/>

</xml_diff>